<commit_message>
Deliverables: 10-page journal PDF (0 undefined refs) + DOCX (12 figures)
</commit_message>
<xml_diff>
--- a/paper.docx
+++ b/paper.docx
@@ -7,7 +7,7 @@
         <w:pStyle w:val="Title"/>
       </w:pPr>
       <w:r>
-        <w:t xml:space="preserve">Quantization and Sampling Effects in a Digitally Controlled PID Buck-Boost Converter: A Simulation Study</w:t>
+        <w:t xml:space="preserve">Quantization-Aware Digital PID Control of an Inverting Buck–Boost Converter with ESP32-S3: Measured Latency, Effective-Resolution, and Adaptive Update Management</w:t>
       </w:r>
     </w:p>
     <w:p>
@@ -16,6 +16,30 @@
       </w:pPr>
       <w:r>
         <w:t xml:space="preserve">Syeda Salsabil Islam Ariya and Jasimul Islam Chowdhury and Hussain Touhid Siddiquee</w:t>
+      </w:r>
+    </w:p>
+    <w:p>
+      <w:pPr>
+        <w:pStyle w:val="AbstractTitle"/>
+      </w:pPr>
+      <w:r>
+        <w:t xml:space="preserve">Abstract</w:t>
+      </w:r>
+    </w:p>
+    <w:p>
+      <w:pPr>
+        <w:pStyle w:val="Abstract"/>
+      </w:pPr>
+      <w:r>
+        <w:t xml:space="preserve">Digital control of switching power converters is shaped by three implementation-quantized quantities: the ADC resolution of the sensed output, the DPWM resolution of the commanded duty, and the sampling period at which controller and power stage are synchronized. This paper asks how those three quantities interrelate and whether their predicted effects survive on real hardware. A 79-run switched-model study of an inverting buck-boost converter (Vref = -12 V, fsw = 100 kHz) first isolates each quantizer, locates the critical sampling boundary near 3.5-4x Tsw, and shows the three stages interact super-additively. The same controller is then ported to an ESP32-S3 closed-loop platform whose loop is bound by the on-chip ADC: the raw read takes 60 us, so the fastest achievable loop is about 6x Tsw and useful oversampled loops exceed 500x Tsw, placing the hardware inside the simulation’s predicted unstable regime. Measured latency decomposes into T_ADC = 60 us, T_PID = 0.86 us (int32), and T_PWM = 4.2 us; CPU utilization is 1.3%. An effective-resolution sweep shows the 1.6-1.9 V acquisition noise floor masks the quantization effects the simulation predicts at 27-205 mV. A lightweight quantization-aware adaptive controller switches between achievable schedules by a measured error/ripple indicator and activates duty dithering with hysteresis only near the setpoint, reducing controller-update frequency by roughly 84% while holding steady-state error below 60 mV. The three-level validation (continuous simulation, digital simulation, embedded measurement) establishes that sampling period and measured latency are not interchangeable, that quantization limits are masked by hardware noise at achievable schedules, and that resource-aware adaptation is a practical means of recovering performance inside the ADC-bound regime.</w:t>
+      </w:r>
+    </w:p>
+    <w:p>
+      <w:pPr>
+        <w:pStyle w:val="FirstParagraph"/>
+      </w:pPr>
+      <w:r>
+        <w:t xml:space="preserve">digital PID control, quantization, buck-boost converter, ESP32-S3, adaptive sampling, measurement latency</w:t>
       </w:r>
     </w:p>
     <w:bookmarkStart w:id="9" w:name="introduction"/>
@@ -163,27 +187,61 @@
         <w:pStyle w:val="BodyText"/>
       </w:pPr>
       <w:r>
-        <w:t xml:space="preserve">This paper reports a controlled simulation study of a digitally controlled inverting buck-boost converter under simultaneous quantization of sampling period, ADC resolution, and PWM resolution. Contributions: (1) a 79-run factorial study that separates the individual effect of each quantizer from their combined effect and locates the critical sampling boundary; (2) an objective worst-case selection made after the sweep, not a priori; (3) the identification of a half-scale ADC coincidence (</w:t>
-      </w:r>
-      <m:oMath>
+        <w:t xml:space="preserve">The central question of this work is therefore: how do sampling period, ADC quantization, PWM resolution, and real-time computational latency jointly affect the closed-loop performance of an ESP32-S3-controlled inverting buck-boost converter, and can a lightweight quantization-aware adaptive PID maintain acceptable regulation while reducing unnecessary controller-update effort? Answering it requires three levels of validation that earlier studies treat separately: a continuous (analog) baseline, a digital simulation that introduces sampling, ADC and PWM quantization and computational delay, and a closed-loop measurement on an embedded platform. The ESP32-S3 is not merely a device that runs the PID; it is the experimental vehicle for investigating the real-world consequences of digital implementation, exposing quantities a simulator cannot produce directly: the acquisition time of the on-chip ADC, the execution time of the control step, the update latency of the PWM peripheral, and the resulting control-loop latency and CPU utilization.</w:t>
+      </w:r>
+    </w:p>
+    <w:p>
+      <w:pPr>
+        <w:pStyle w:val="BodyText"/>
+      </w:pPr>
+      <w:r>
+        <w:t xml:space="preserve">This paper reports a simulation-to-hardware investigation of a digitally controlled inverting buck-boost converter under simultaneous quantization of sampling period, ADC resolution, and PWM resolution. Contributions: (1) a 79-run factorial study that separates the individual effect of each quantizer from their combined effect, locates the critical sampling boundary near 3.5-4</w:t>
+      </w:r>
+      <m:oMath>
+        <m:r>
+          <m:rPr>
+            <m:sty m:val="p"/>
+          </m:rPr>
+          <m:t>×</m:t>
+        </m:r>
         <m:sSub>
           <m:e>
             <m:r>
-              <m:t>V</m:t>
+              <m:t>T</m:t>
             </m:r>
           </m:e>
           <m:sub>
             <m:r>
-              <m:t>r</m:t>
-            </m:r>
-            <m:r>
-              <m:t>e</m:t>
-            </m:r>
-            <m:r>
-              <m:t>f</m:t>
+              <m:t>s</m:t>
+            </m:r>
+            <m:r>
+              <m:t>w</m:t>
             </m:r>
           </m:sub>
         </m:sSub>
+      </m:oMath>
+      <w:r>
+        <w:t xml:space="preserve">, and quantifies the super-additive interaction between the three stages; (2) an objective worst-case selection made after the sweep, not a priori; (3) the identification of a half-scale ADC coincidence (</w:t>
+      </w:r>
+      <m:oMath>
+        <m:sSub>
+          <m:e>
+            <m:r>
+              <m:t>V</m:t>
+            </m:r>
+          </m:e>
+          <m:sub>
+            <m:r>
+              <m:t>r</m:t>
+            </m:r>
+            <m:r>
+              <m:t>e</m:t>
+            </m:r>
+            <m:r>
+              <m:t>f</m:t>
+            </m:r>
+          </m:sub>
+        </m:sSub>
         <m:r>
           <m:rPr>
             <m:sty m:val="p"/>
@@ -213,7 +271,7 @@
         </m:r>
       </m:oMath>
       <w:r>
-        <w:t xml:space="preserve">) that masks steady-state error at low ADC resolutions; (4) formal evidence that interactions between the three stages amplify beyond additivity, quantified by an interaction index; (5) design guidance linking sampling period and resolution choices, summarized as a performance map; and (6) operating-point robustness checks confirming the conclusions away from the nominal point. Section II develops the converter and controller models; Section III defines the experimental protocol; Section IV presents results; Section V discusses design implications; Section VI concludes.</w:t>
+        <w:t xml:space="preserve">) that masks steady-state error at low ADC resolutions; (4) an ESP32-S3 closed-loop implementation whose control-loop latency is measured and decomposed into ADC acquisition, PID execution, and PWM update; (5) an effective-resolution experiment showing that the measured acquisition noise floor masks the quantization effects the simulation predicts; and (6) a lightweight quantization-aware adaptive PID that switches update effort by a measured period and ripple indicator and validates the predicted performance-versus-resource trade-off with an update-reduction ratio of roughly 84\%. The novelty lies not in variable-rate sampling or dithering individually, but in their integration into a resource-aware control framework that is characterized, implemented, and experimentally validated on one platform.</w:t>
       </w:r>
     </w:p>
     <w:bookmarkEnd w:id="9"/>
@@ -6314,13 +6372,13 @@
     </w:tbl>
     <w:bookmarkEnd w:id="48"/>
     <w:bookmarkEnd w:id="49"/>
-    <w:bookmarkStart w:id="54" w:name="embedded-implementation-feasibility"/>
+    <w:bookmarkStart w:id="50" w:name="conclusion"/>
     <w:p>
       <w:pPr>
         <w:pStyle w:val="Heading1"/>
       </w:pPr>
       <w:r>
-        <w:t xml:space="preserve">Embedded Implementation Feasibility</w:t>
+        <w:t xml:space="preserve">Conclusion</w:t>
       </w:r>
     </w:p>
     <w:p>
@@ -6328,185 +6386,249 @@
         <w:pStyle w:val="FirstParagraph"/>
       </w:pPr>
       <w:r>
-        <w:t xml:space="preserve">To test whether the quantized controller of Section~II is realizable in hardware, the velocity-form PID and the mid-tread ADC/DPWM quantizers were ported to an ESP32-S3 (240 MHz) under the Arduino core and executed on the bench. The plant is emulated in feedback with two pins: a 100 kHz LEDC PWM output on GPIO2 is wired directly to ADC1 input GPIO1, so the sensed pin voltage is the duty-scaled rail voltage, mapped into the paper’s</w:t>
-      </w:r>
-      <w:r>
-        <w:t xml:space="preserve"> </w:t>
-      </w:r>
-      <m:oMath>
+        <w:t xml:space="preserve">This paper established how sampling period, ADC quantization, PWM resolution, and real-time computational latency jointly shape the closed-loop performance of an ESP32-S3-controlled inverting buck-boost converter. The switched-model study isolates each effect and locates the critical sampling boundary near 3.5-4</w:t>
+      </w:r>
+      <m:oMath>
+        <m:r>
+          <m:rPr>
+            <m:sty m:val="p"/>
+          </m:rPr>
+          <m:t>×</m:t>
+        </m:r>
         <m:sSub>
           <m:e>
             <m:r>
-              <m:t>V</m:t>
+              <m:t>T</m:t>
             </m:r>
           </m:e>
           <m:sub>
             <m:r>
-              <m:t>r</m:t>
-            </m:r>
-            <m:r>
-              <m:t>e</m:t>
-            </m:r>
-            <m:r>
-              <m:t>f</m:t>
+              <m:t>s</m:t>
+            </m:r>
+            <m:r>
+              <m:t>w</m:t>
             </m:r>
           </m:sub>
         </m:sSub>
-        <m:r>
-          <m:rPr>
-            <m:sty m:val="p"/>
-          </m:rPr>
-          <m:t>=</m:t>
-        </m:r>
-        <m:r>
-          <m:rPr>
-            <m:sty m:val="p"/>
-          </m:rPr>
-          <m:t>−</m:t>
-        </m:r>
-        <m:r>
-          <m:t>12</m:t>
-        </m:r>
-      </m:oMath>
-      <w:r>
-        <w:t xml:space="preserve"> V,</w:t>
-      </w:r>
-      <w:r>
-        <w:t xml:space="preserve"> </w:t>
-      </w:r>
-      <m:oMath>
-        <m:r>
-          <m:rPr>
-            <m:sty m:val="p"/>
-          </m:rPr>
-          <m:t>F</m:t>
-        </m:r>
-        <m:r>
-          <m:rPr>
-            <m:sty m:val="p"/>
-          </m:rPr>
-          <m:t>S</m:t>
-        </m:r>
-        <m:r>
-          <m:rPr>
-            <m:sty m:val="p"/>
-          </m:rPr>
-          <m:t>=</m:t>
-        </m:r>
-        <m:r>
-          <m:t>24</m:t>
-        </m:r>
-      </m:oMath>
-      <w:r>
-        <w:t xml:space="preserve"> V frame by the inverting gain</w:t>
-      </w:r>
-      <w:r>
-        <w:t xml:space="preserve"> </w:t>
-      </w:r>
-      <m:oMath>
-        <m:sSub>
-          <m:e>
-            <m:r>
-              <m:t>V</m:t>
-            </m:r>
-          </m:e>
-          <m:sub>
-            <m:r>
-              <m:t>o</m:t>
-            </m:r>
-            <m:r>
-              <m:t>u</m:t>
-            </m:r>
-            <m:r>
-              <m:t>t</m:t>
-            </m:r>
-          </m:sub>
-        </m:sSub>
-        <m:r>
-          <m:rPr>
-            <m:sty m:val="p"/>
-          </m:rPr>
-          <m:t>=</m:t>
-        </m:r>
-        <m:r>
-          <m:rPr>
-            <m:sty m:val="p"/>
-          </m:rPr>
-          <m:t>−</m:t>
-        </m:r>
-        <m:sSub>
-          <m:e>
-            <m:r>
-              <m:t>V</m:t>
-            </m:r>
-          </m:e>
-          <m:sub>
-            <m:r>
-              <m:t>p</m:t>
-            </m:r>
-            <m:r>
-              <m:t>i</m:t>
-            </m:r>
-            <m:r>
-              <m:t>n</m:t>
-            </m:r>
-          </m:sub>
-        </m:sSub>
-        <m:r>
-          <m:rPr>
-            <m:sty m:val="p"/>
-          </m:rPr>
-          <m:t>⋅</m:t>
-        </m:r>
-        <m:r>
-          <m:t>24</m:t>
-        </m:r>
-        <m:r>
-          <m:rPr>
-            <m:sty m:val="p"/>
-          </m:rPr>
-          <m:t>/</m:t>
-        </m:r>
-        <m:r>
-          <m:t>3.3</m:t>
-        </m:r>
-      </m:oMath>
-      <w:r>
-        <w:t xml:space="preserve">. This reproduces the buck-boost sign inversion and places</w:t>
-      </w:r>
-      <w:r>
-        <w:t xml:space="preserve"> </w:t>
-      </w:r>
-      <m:oMath>
-        <m:sSub>
-          <m:e>
-            <m:r>
-              <m:t>V</m:t>
-            </m:r>
-          </m:e>
-          <m:sub>
-            <m:r>
-              <m:t>r</m:t>
-            </m:r>
-            <m:r>
-              <m:t>e</m:t>
-            </m:r>
-            <m:r>
-              <m:t>f</m:t>
-            </m:r>
-          </m:sub>
-        </m:sSub>
-      </m:oMath>
-      <w:r>
-        <w:t xml:space="preserve"> </w:t>
-      </w:r>
-      <w:r>
-        <w:t xml:space="preserve">exactly at the half-scale code. The loop runs identical arithmetic: 8-bit mid-tread ADC quantization, velocity-form PID with the paper’s gains, and 8-bit DPWM quantization written to the LEDC.</w:t>
+      </m:oMath>
+      <w:r>
+        <w:t xml:space="preserve">; the embedded implementation then measures what simulation cannot: a 65 </w:t>
+      </w:r>
+      <m:oMath>
+        <m:r>
+          <m:t>μ</m:t>
+        </m:r>
+      </m:oMath>
+      <w:r>
+        <w:t xml:space="preserve">s control-loop latency dominated by ADC acquisition, 1.3\% CPU utilization, and an acquisition noise floor that masks the quantization effects the simulation predicts. Slow sampling and fast sampling with added latency behave differently even on a plant with no dynamics of its own, confirming that the two implementation effects are not interchangeable. A lightweight quantization-aware adaptive PID switches between achievable schedules using a measured error/activity indicator with hysteresis, holds steady-state error below 40 mV, and cuts controller-update frequency by 84\%. The contributions are the integration, characterization, and experimental resource-aware validation of these effects on one platform, rather than any single technique in isolation. The on-chip ADC’s acquisition time is the binding constraint of this platform; future work with a faster external ADC or a real power stage would place the controller inside the simulated critical region and test directly whether the adaptive framework remains necessary at higher rates.</w:t>
+      </w:r>
+    </w:p>
+    <w:bookmarkEnd w:id="50"/>
+    <w:bookmarkStart w:id="51" w:name="acknowledgment"/>
+    <w:p>
+      <w:pPr>
+        <w:pStyle w:val="Heading1"/>
+      </w:pPr>
+      <w:r>
+        <w:t xml:space="preserve">Acknowledgment</w:t>
       </w:r>
     </w:p>
     <w:p>
       <w:pPr>
-        <w:pStyle w:val="BodyText"/>
+        <w:pStyle w:val="FirstParagraph"/>
+      </w:pPr>
+      <w:r>
+        <w:t xml:space="preserve">The authors thank Tareq Anwar Shikdar for guidance; no external funding was received.</w:t>
+      </w:r>
+    </w:p>
+    <w:bookmarkEnd w:id="51"/>
+    <w:bookmarkStart w:id="76" w:name="experimental-closed-loop-platform"/>
+    <w:p>
+      <w:pPr>
+        <w:pStyle w:val="Heading1"/>
+      </w:pPr>
+      <w:r>
+        <w:t xml:space="preserve">Experimental Closed-Loop Platform</w:t>
+      </w:r>
+    </w:p>
+    <w:p>
+      <w:pPr>
+        <w:pStyle w:val="FirstParagraph"/>
+      </w:pPr>
+      <w:r>
+        <w:t xml:space="preserve">The closed-loop platform is the ESP32-S3 (240 MHz, Arduino core) with a 100 kHz LEDC PWM on GPIO2 shorted to ADC1 input GPIO1, so the sensed pin voltage is the duty-scaled rail, mapped into the paper’s</w:t>
+      </w:r>
+      <w:r>
+        <w:t xml:space="preserve"> </w:t>
+      </w:r>
+      <m:oMath>
+        <m:sSub>
+          <m:e>
+            <m:r>
+              <m:t>V</m:t>
+            </m:r>
+          </m:e>
+          <m:sub>
+            <m:r>
+              <m:t>r</m:t>
+            </m:r>
+            <m:r>
+              <m:t>e</m:t>
+            </m:r>
+            <m:r>
+              <m:t>f</m:t>
+            </m:r>
+          </m:sub>
+        </m:sSub>
+        <m:r>
+          <m:rPr>
+            <m:sty m:val="p"/>
+          </m:rPr>
+          <m:t>=</m:t>
+        </m:r>
+        <m:r>
+          <m:rPr>
+            <m:sty m:val="p"/>
+          </m:rPr>
+          <m:t>−</m:t>
+        </m:r>
+        <m:r>
+          <m:t>12</m:t>
+        </m:r>
+      </m:oMath>
+      <w:r>
+        <w:t xml:space="preserve"> V, FS</w:t>
+      </w:r>
+      <m:oMath>
+        <m:r>
+          <m:rPr>
+            <m:sty m:val="p"/>
+          </m:rPr>
+          <m:t>=</m:t>
+        </m:r>
+        <m:r>
+          <m:t>24</m:t>
+        </m:r>
+      </m:oMath>
+      <w:r>
+        <w:t xml:space="preserve"> V frame by the inverting gain</w:t>
+      </w:r>
+      <w:r>
+        <w:t xml:space="preserve"> </w:t>
+      </w:r>
+      <m:oMath>
+        <m:sSub>
+          <m:e>
+            <m:r>
+              <m:t>V</m:t>
+            </m:r>
+          </m:e>
+          <m:sub>
+            <m:r>
+              <m:t>o</m:t>
+            </m:r>
+            <m:r>
+              <m:t>u</m:t>
+            </m:r>
+            <m:r>
+              <m:t>t</m:t>
+            </m:r>
+          </m:sub>
+        </m:sSub>
+        <m:r>
+          <m:rPr>
+            <m:sty m:val="p"/>
+          </m:rPr>
+          <m:t>=</m:t>
+        </m:r>
+        <m:r>
+          <m:rPr>
+            <m:sty m:val="p"/>
+          </m:rPr>
+          <m:t>−</m:t>
+        </m:r>
+        <m:sSub>
+          <m:e>
+            <m:r>
+              <m:t>V</m:t>
+            </m:r>
+          </m:e>
+          <m:sub>
+            <m:r>
+              <m:t>p</m:t>
+            </m:r>
+            <m:r>
+              <m:t>i</m:t>
+            </m:r>
+            <m:r>
+              <m:t>n</m:t>
+            </m:r>
+          </m:sub>
+        </m:sSub>
+        <m:r>
+          <m:rPr>
+            <m:sty m:val="p"/>
+          </m:rPr>
+          <m:t>⋅</m:t>
+        </m:r>
+        <m:r>
+          <m:t>24</m:t>
+        </m:r>
+        <m:r>
+          <m:rPr>
+            <m:sty m:val="p"/>
+          </m:rPr>
+          <m:t>/</m:t>
+        </m:r>
+        <m:r>
+          <m:t>3.3</m:t>
+        </m:r>
+      </m:oMath>
+      <w:r>
+        <w:t xml:space="preserve">. This reproduces the buck-boost sign inversion and places</w:t>
+      </w:r>
+      <w:r>
+        <w:t xml:space="preserve"> </w:t>
+      </w:r>
+      <m:oMath>
+        <m:sSub>
+          <m:e>
+            <m:r>
+              <m:t>V</m:t>
+            </m:r>
+          </m:e>
+          <m:sub>
+            <m:r>
+              <m:t>r</m:t>
+            </m:r>
+            <m:r>
+              <m:t>e</m:t>
+            </m:r>
+            <m:r>
+              <m:t>f</m:t>
+            </m:r>
+          </m:sub>
+        </m:sSub>
+      </m:oMath>
+      <w:r>
+        <w:t xml:space="preserve"> </w:t>
+      </w:r>
+      <w:r>
+        <w:t xml:space="preserve">exactly at the half-scale code, at which the paper’s ADC coincidence is active. The plant is intentionally not a real power stage: it is an emulated first-order plant whose dynamics are the pin-gain plus the EMA sensor filter, so the platform isolates the digital-implementation effects (sampling, quantization, latency, adaptation) that are the subject of this study. The controller executes velocity-form PID with the paper’s quantizers, and the loop is deterministic and periodic, driven by the achievable sample period rather than a free-running software loop.</w:t>
+      </w:r>
+    </w:p>
+    <w:bookmarkStart w:id="56" w:name="measured-control-loop-latency"/>
+    <w:p>
+      <w:pPr>
+        <w:pStyle w:val="Heading2"/>
+      </w:pPr>
+      <w:r>
+        <w:t xml:space="preserve">Measured Control-Loop Latency</w:t>
+      </w:r>
+    </w:p>
+    <w:p>
+      <w:pPr>
+        <w:pStyle w:val="FirstParagraph"/>
       </w:pPr>
       <w:r>
         <w:t xml:space="preserve">Table </w:t>
@@ -6523,42 +6645,9 @@
         <w:t xml:space="preserve"> </w:t>
       </w:r>
       <w:r>
-        <w:t xml:space="preserve">reports the measured quantities. The controller compute is not the constraint: the float32 pipeline averages 6.7 </w:t>
-      </w:r>
-      <m:oMath>
-        <m:r>
-          <m:t>μ</m:t>
-        </m:r>
-      </m:oMath>
-      <w:r>
-        <w:t xml:space="preserve">s and the int32 fixed-point pipeline 1.3 </w:t>
-      </w:r>
-      <m:oMath>
-        <m:r>
-          <m:t>μ</m:t>
-        </m:r>
-      </m:oMath>
-      <w:r>
-        <w:t xml:space="preserve">s for the 12-bit ADC / 12-bit DPWM configuration, both inside the</w:t>
-      </w:r>
-      <w:r>
-        <w:t xml:space="preserve"> </w:t>
-      </w:r>
-      <m:oMath>
-        <m:r>
-          <m:t>10</m:t>
-        </m:r>
-        <m:r>
-          <m:t> </m:t>
-        </m:r>
-        <m:r>
-          <m:t>μ</m:t>
-        </m:r>
-      </m:oMath>
-      <w:r>
-        <w:t xml:space="preserve">s budget of the fastest simulated period. Two hardware limits do bind. First, the on-chip LEDC peripheral, clocked at 80 MHz, rejects duty resolutions above 8~bit at a 100 kHz switching request (Fig. </w:t>
-      </w:r>
-      <w:hyperlink w:anchor="fig:emb">
+        <w:t xml:space="preserve">reports the measured split of the control loop, timed with the CPU cycle counter at 240 MHz and illustrated in Fig. </w:t>
+      </w:r>
+      <w:hyperlink w:anchor="fig:lat">
         <w:r>
           <w:rPr>
             <w:rStyle w:val="Hyperlink"/>
@@ -6567,23 +6656,109 @@
         </w:r>
       </w:hyperlink>
       <w:r>
-        <w:t xml:space="preserve">a), so the simulation’s 10/12-bit DPWM regimes are physically unrealizable at this switching frequency and the 8/6-bit regimes are the implementable subspace. Second, the SAR ADC acquisition dominates the loop: the calibrated millivolt read averages 86.6 </w:t>
-      </w:r>
-      <m:oMath>
+        <w:t xml:space="preserve">. The ADC dominates: the calibrated millivolt read averages</w:t>
+      </w:r>
+      <w:r>
+        <w:t xml:space="preserve"> </w:t>
+      </w:r>
+      <m:oMath>
+        <m:r>
+          <m:t>88.6</m:t>
+        </m:r>
+        <m:r>
+          <m:t> </m:t>
+        </m:r>
         <m:r>
           <m:t>μ</m:t>
         </m:r>
       </m:oMath>
       <w:r>
-        <w:t xml:space="preserve">s and even the raw 12-bit read 59.7 </w:t>
-      </w:r>
-      <m:oMath>
+        <w:t xml:space="preserve">s, the raw 12-bit read</w:t>
+      </w:r>
+      <w:r>
+        <w:t xml:space="preserve"> </w:t>
+      </w:r>
+      <m:oMath>
+        <m:r>
+          <m:t>60.0</m:t>
+        </m:r>
+        <m:r>
+          <m:t> </m:t>
+        </m:r>
         <m:r>
           <m:t>μ</m:t>
         </m:r>
       </m:oMath>
       <w:r>
-        <w:t xml:space="preserve">s, an order of magnitude above the nominal</w:t>
+        <w:t xml:space="preserve">s, and even the fastest single read never completes faster than</w:t>
+      </w:r>
+      <w:r>
+        <w:t xml:space="preserve"> </w:t>
+      </w:r>
+      <m:oMath>
+        <m:r>
+          <m:t>59.4</m:t>
+        </m:r>
+        <m:r>
+          <m:t> </m:t>
+        </m:r>
+        <m:r>
+          <m:t>μ</m:t>
+        </m:r>
+      </m:oMath>
+      <w:r>
+        <w:t xml:space="preserve">s. The PID step itself is negligible: the int32 fixed-point pipeline averages</w:t>
+      </w:r>
+      <w:r>
+        <w:t xml:space="preserve"> </w:t>
+      </w:r>
+      <m:oMath>
+        <m:r>
+          <m:t>0.86</m:t>
+        </m:r>
+        <m:r>
+          <m:t> </m:t>
+        </m:r>
+        <m:r>
+          <m:t>μ</m:t>
+        </m:r>
+      </m:oMath>
+      <w:r>
+        <w:t xml:space="preserve">s and the float32 pipeline</w:t>
+      </w:r>
+      <w:r>
+        <w:t xml:space="preserve"> </w:t>
+      </w:r>
+      <m:oMath>
+        <m:r>
+          <m:t>6.8</m:t>
+        </m:r>
+        <m:r>
+          <m:t> </m:t>
+        </m:r>
+        <m:r>
+          <m:t>μ</m:t>
+        </m:r>
+      </m:oMath>
+      <w:r>
+        <w:t xml:space="preserve">s, so the controller occupies at most 10.4\% (float) or 1.3\% (int32) of the loop budget. The LEDC PWM write costs</w:t>
+      </w:r>
+      <w:r>
+        <w:t xml:space="preserve"> </w:t>
+      </w:r>
+      <m:oMath>
+        <m:r>
+          <m:t>4.2</m:t>
+        </m:r>
+        <m:r>
+          <m:t> </m:t>
+        </m:r>
+        <m:r>
+          <m:t>μ</m:t>
+        </m:r>
+      </m:oMath>
+      <w:r>
+        <w:t xml:space="preserve">s. The total per-step control latency is</w:t>
       </w:r>
       <w:r>
         <w:t xml:space="preserve"> </w:t>
@@ -6597,21 +6772,88 @@
           </m:e>
           <m:sub>
             <m:r>
-              <m:t>s</m:t>
+              <m:t>l</m:t>
+            </m:r>
+            <m:r>
+              <m:t>a</m:t>
+            </m:r>
+            <m:r>
+              <m:t>t</m:t>
             </m:r>
           </m:sub>
         </m:sSub>
-      </m:oMath>
-      <w:r>
-        <w:t xml:space="preserve">. Recovering the mean of a 100 kHz-commutated pin therefore requires oversampling that reduces the noise floor as</w:t>
-      </w:r>
-      <w:r>
-        <w:t xml:space="preserve"> </w:t>
-      </w:r>
-      <m:oMath>
-        <m:r>
-          <m:t>σ</m:t>
-        </m:r>
+        <m:r>
+          <m:rPr>
+            <m:sty m:val="p"/>
+          </m:rPr>
+          <m:t>=</m:t>
+        </m:r>
+        <m:sSub>
+          <m:e>
+            <m:r>
+              <m:t>T</m:t>
+            </m:r>
+          </m:e>
+          <m:sub>
+            <m:r>
+              <m:t>A</m:t>
+            </m:r>
+            <m:r>
+              <m:t>D</m:t>
+            </m:r>
+            <m:r>
+              <m:t>C</m:t>
+            </m:r>
+          </m:sub>
+        </m:sSub>
+        <m:r>
+          <m:rPr>
+            <m:sty m:val="p"/>
+          </m:rPr>
+          <m:t>+</m:t>
+        </m:r>
+        <m:sSub>
+          <m:e>
+            <m:r>
+              <m:t>T</m:t>
+            </m:r>
+          </m:e>
+          <m:sub>
+            <m:r>
+              <m:t>P</m:t>
+            </m:r>
+            <m:r>
+              <m:t>I</m:t>
+            </m:r>
+            <m:r>
+              <m:t>D</m:t>
+            </m:r>
+          </m:sub>
+        </m:sSub>
+        <m:r>
+          <m:rPr>
+            <m:sty m:val="p"/>
+          </m:rPr>
+          <m:t>+</m:t>
+        </m:r>
+        <m:sSub>
+          <m:e>
+            <m:r>
+              <m:t>T</m:t>
+            </m:r>
+          </m:e>
+          <m:sub>
+            <m:r>
+              <m:t>P</m:t>
+            </m:r>
+            <m:r>
+              <m:t>W</m:t>
+            </m:r>
+            <m:r>
+              <m:t>M</m:t>
+            </m:r>
+          </m:sub>
+        </m:sSub>
         <m:r>
           <m:rPr>
             <m:sty m:val="p"/>
@@ -6619,392 +6861,109 @@
           <m:t>≈</m:t>
         </m:r>
         <m:r>
-          <m:t>1.65</m:t>
-        </m:r>
-        <m:r>
-          <m:rPr>
-            <m:sty m:val="p"/>
-          </m:rPr>
-          <m:t>/</m:t>
-        </m:r>
-        <m:rad>
-          <m:radPr>
-            <m:degHide m:val="on"/>
-          </m:radPr>
-          <m:deg/>
+          <m:t>65</m:t>
+        </m:r>
+        <m:r>
+          <m:t> </m:t>
+        </m:r>
+        <m:r>
+          <m:t>μ</m:t>
+        </m:r>
+      </m:oMath>
+      <w:r>
+        <w:t xml:space="preserve">s, meaning the fastest periodic loop this platform can sustain is about</w:t>
+      </w:r>
+      <w:r>
+        <w:t xml:space="preserve"> </w:t>
+      </w:r>
+      <m:oMath>
+        <m:r>
+          <m:t>6</m:t>
+        </m:r>
+        <m:r>
+          <m:rPr>
+            <m:sty m:val="p"/>
+          </m:rPr>
+          <m:t>×</m:t>
+        </m:r>
+        <m:sSub>
           <m:e>
             <m:r>
-              <m:t>N</m:t>
+              <m:t>T</m:t>
             </m:r>
           </m:e>
-        </m:rad>
-      </m:oMath>
-      <w:r>
-        <w:t xml:space="preserve"> V (Fig. </w:t>
-      </w:r>
-      <w:hyperlink w:anchor="fig:emb">
-        <w:r>
-          <w:rPr>
-            <w:rStyle w:val="Hyperlink"/>
-          </w:rPr>
-          <w:t xml:space="preserve">8</w:t>
-        </w:r>
-      </w:hyperlink>
-      <w:r>
-        <w:t xml:space="preserve">b), and the measured step period reaches</w:t>
-      </w:r>
-      <w:r>
-        <w:t xml:space="preserve"> </w:t>
-      </w:r>
-      <m:oMath>
-        <m:r>
-          <m:t>6.8</m:t>
-        </m:r>
-      </m:oMath>
-      <w:r>
-        <w:t xml:space="preserve"> ms at</w:t>
-      </w:r>
-      <w:r>
-        <w:t xml:space="preserve"> </w:t>
-      </w:r>
-      <m:oMath>
-        <m:r>
-          <m:t>N</m:t>
-        </m:r>
-        <m:r>
-          <m:rPr>
-            <m:sty m:val="p"/>
-          </m:rPr>
-          <m:t>=</m:t>
-        </m:r>
-        <m:r>
-          <m:t>64</m:t>
-        </m:r>
-      </m:oMath>
-      <w:r>
-        <w:t xml:space="preserve">, capping the closed-loop rate at 0.15 kHz.</w:t>
+          <m:sub>
+            <m:r>
+              <m:t>s</m:t>
+            </m:r>
+            <m:r>
+              <m:t>w</m:t>
+            </m:r>
+          </m:sub>
+        </m:sSub>
+      </m:oMath>
+      <w:r>
+        <w:t xml:space="preserve"> </w:t>
+      </w:r>
+      <w:r>
+        <w:t xml:space="preserve">(10 </w:t>
+      </w:r>
+      <m:oMath>
+        <m:r>
+          <m:t>μ</m:t>
+        </m:r>
+      </m:oMath>
+      <w:r>
+        <w:t xml:space="preserve">s switching period), and useful oversampled loops sit at</w:t>
+      </w:r>
+      <w:r>
+        <w:t xml:space="preserve"> </w:t>
+      </w:r>
+      <m:oMath>
+        <m:r>
+          <m:t>500</m:t>
+        </m:r>
+        <m:r>
+          <m:rPr>
+            <m:sty m:val="p"/>
+          </m:rPr>
+          <m:t>×</m:t>
+        </m:r>
+      </m:oMath>
+      <w:r>
+        <w:t xml:space="preserve">-</w:t>
+      </w:r>
+      <m:oMath>
+        <m:r>
+          <m:t>680</m:t>
+        </m:r>
+        <m:r>
+          <m:rPr>
+            <m:sty m:val="p"/>
+          </m:rPr>
+          <m:t>×</m:t>
+        </m:r>
+        <m:sSub>
+          <m:e>
+            <m:r>
+              <m:t>T</m:t>
+            </m:r>
+          </m:e>
+          <m:sub>
+            <m:r>
+              <m:t>s</m:t>
+            </m:r>
+            <m:r>
+              <m:t>w</m:t>
+            </m:r>
+          </m:sub>
+        </m:sSub>
+      </m:oMath>
+      <w:r>
+        <w:t xml:space="preserve">. The hardware therefore operates entirely in the sampling regime the simulation identifies as unstable or critically degraded; this is the central constraint that motivates the adaptive controller presented in the final subsection.</w:t>
       </w:r>
     </w:p>
-    <w:tbl>
-      <w:tblPr>
-        <w:tblStyle w:val="Table"/>
-        <w:tblW w:type="auto" w:w="0"/>
-        <w:tblLook w:firstRow="1" w:lastRow="0" w:firstColumn="0" w:lastColumn="0" w:noHBand="0" w:noVBand="0" w:val="0020"/>
-      </w:tblPr>
-      <w:tblGrid>
-        <w:gridCol w:w="2640"/>
-        <w:gridCol w:w="2640"/>
-        <w:gridCol w:w="2640"/>
-      </w:tblGrid>
-      <w:tr>
-        <w:trPr>
-          <w:tblHeader w:val="on"/>
-        </w:trPr>
-        <w:tc>
-          <w:tcPr/>
-          <w:p>
-            <w:pPr>
-              <w:pStyle w:val="Compact"/>
-              <w:jc w:val="left"/>
-            </w:pPr>
-            <w:r>
-              <w:t xml:space="preserve">Quantity</w:t>
-            </w:r>
-          </w:p>
-        </w:tc>
-        <w:tc>
-          <w:tcPr/>
-          <w:p>
-            <w:pPr>
-              <w:pStyle w:val="Compact"/>
-              <w:jc w:val="left"/>
-            </w:pPr>
-            <w:r>
-              <w:t xml:space="preserve">Measured</w:t>
-            </w:r>
-          </w:p>
-        </w:tc>
-        <w:tc>
-          <w:tcPr/>
-          <w:p>
-            <w:pPr>
-              <w:pStyle w:val="Compact"/>
-              <w:jc w:val="left"/>
-            </w:pPr>
-            <w:r>
-              <w:t xml:space="preserve">Simulation assumption</w:t>
-            </w:r>
-          </w:p>
-        </w:tc>
-      </w:tr>
-      <w:tr>
-        <w:tc>
-          <w:tcPr/>
-          <w:p>
-            <w:pPr>
-              <w:pStyle w:val="Compact"/>
-              <w:jc w:val="left"/>
-            </w:pPr>
-            <w:r>
-              <w:t xml:space="preserve">PID pipeline, float32 (12/12 bit)</w:t>
-            </w:r>
-          </w:p>
-        </w:tc>
-        <w:tc>
-          <w:tcPr/>
-          <w:p>
-            <w:pPr>
-              <w:pStyle w:val="Compact"/>
-              <w:jc w:val="left"/>
-            </w:pPr>
-            <w:r>
-              <w:t xml:space="preserve">6.7 µs avg</w:t>
-            </w:r>
-          </w:p>
-        </w:tc>
-        <w:tc>
-          <w:tcPr/>
-          <w:p>
-            <w:pPr>
-              <w:pStyle w:val="Compact"/>
-              <w:jc w:val="left"/>
-            </w:pPr>
-            <w:r>
-              <w:t xml:space="preserve">≤ 50 µs</w:t>
-            </w:r>
-          </w:p>
-        </w:tc>
-      </w:tr>
-      <w:tr>
-        <w:tc>
-          <w:tcPr/>
-          <w:p>
-            <w:pPr>
-              <w:pStyle w:val="Compact"/>
-              <w:jc w:val="left"/>
-            </w:pPr>
-            <w:r>
-              <w:t xml:space="preserve">PID pipeline, int32 (12/12 bit)</w:t>
-            </w:r>
-          </w:p>
-        </w:tc>
-        <w:tc>
-          <w:tcPr/>
-          <w:p>
-            <w:pPr>
-              <w:pStyle w:val="Compact"/>
-              <w:jc w:val="left"/>
-            </w:pPr>
-            <w:r>
-              <w:t xml:space="preserve">1.3 µs avg</w:t>
-            </w:r>
-          </w:p>
-        </w:tc>
-        <w:tc>
-          <w:tcPr/>
-          <w:p>
-            <w:pPr>
-              <w:pStyle w:val="Compact"/>
-              <w:jc w:val="left"/>
-            </w:pPr>
-            <w:r>
-              <w:t xml:space="preserve">≤ 50 µs</w:t>
-            </w:r>
-          </w:p>
-        </w:tc>
-      </w:tr>
-      <w:tr>
-        <w:tc>
-          <w:tcPr/>
-          <w:p>
-            <w:pPr>
-              <w:pStyle w:val="Compact"/>
-              <w:jc w:val="left"/>
-            </w:pPr>
-            <w:r>
-              <w:t xml:space="preserve">ADC raw read (12 bit)</w:t>
-            </w:r>
-          </w:p>
-        </w:tc>
-        <w:tc>
-          <w:tcPr/>
-          <w:p>
-            <w:pPr>
-              <w:pStyle w:val="Compact"/>
-              <w:jc w:val="left"/>
-            </w:pPr>
-            <w:r>
-              <w:t xml:space="preserve">59.7 µs avg</w:t>
-            </w:r>
-          </w:p>
-        </w:tc>
-        <w:tc>
-          <w:tcPr/>
-          <w:p>
-            <w:pPr>
-              <w:pStyle w:val="Compact"/>
-              <w:jc w:val="left"/>
-            </w:pPr>
-            <w:r>
-              <w:t xml:space="preserve">0</w:t>
-            </w:r>
-          </w:p>
-        </w:tc>
-      </w:tr>
-      <w:tr>
-        <w:tc>
-          <w:tcPr/>
-          <w:p>
-            <w:pPr>
-              <w:pStyle w:val="Compact"/>
-              <w:jc w:val="left"/>
-            </w:pPr>
-            <w:r>
-              <w:t xml:space="preserve">ADC mV read</w:t>
-            </w:r>
-          </w:p>
-        </w:tc>
-        <w:tc>
-          <w:tcPr/>
-          <w:p>
-            <w:pPr>
-              <w:pStyle w:val="Compact"/>
-              <w:jc w:val="left"/>
-            </w:pPr>
-            <w:r>
-              <w:t xml:space="preserve">86.6 µs avg</w:t>
-            </w:r>
-          </w:p>
-        </w:tc>
-        <w:tc>
-          <w:tcPr/>
-          <w:p>
-            <w:pPr>
-              <w:pStyle w:val="Compact"/>
-              <w:jc w:val="left"/>
-            </w:pPr>
-            <w:r>
-              <w:t xml:space="preserve">0</w:t>
-            </w:r>
-          </w:p>
-        </w:tc>
-      </w:tr>
-      <w:tr>
-        <w:tc>
-          <w:tcPr/>
-          <w:p>
-            <w:pPr>
-              <w:pStyle w:val="Compact"/>
-              <w:jc w:val="left"/>
-            </w:pPr>
-            <w:r>
-              <w:t xml:space="preserve">LEDC resolution @ 100 kHz</w:t>
-            </w:r>
-          </w:p>
-        </w:tc>
-        <w:tc>
-          <w:tcPr/>
-          <w:p>
-            <w:pPr>
-              <w:pStyle w:val="Compact"/>
-              <w:jc w:val="left"/>
-            </w:pPr>
-            <w:r>
-              <w:t xml:space="preserve">8 bit max</w:t>
-            </w:r>
-          </w:p>
-        </w:tc>
-        <w:tc>
-          <w:tcPr/>
-          <w:p>
-            <w:pPr>
-              <w:pStyle w:val="Compact"/>
-              <w:jc w:val="left"/>
-            </w:pPr>
-            <w:r>
-              <w:t xml:space="preserve">12 bit</w:t>
-            </w:r>
-          </w:p>
-        </w:tc>
-      </w:tr>
-      <w:tr>
-        <w:tc>
-          <w:tcPr/>
-          <w:p>
-            <w:pPr>
-              <w:pStyle w:val="Compact"/>
-              <w:jc w:val="left"/>
-            </w:pPr>
-            <w:r>
-              <w:t xml:space="preserve">Oversampled step, N=64</w:t>
-            </w:r>
-          </w:p>
-        </w:tc>
-        <w:tc>
-          <w:tcPr/>
-          <w:p>
-            <w:pPr>
-              <w:pStyle w:val="Compact"/>
-              <w:jc w:val="left"/>
-            </w:pPr>
-            <w:r>
-              <w:t xml:space="preserve">6.8 ms</w:t>
-            </w:r>
-          </w:p>
-        </w:tc>
-        <w:tc>
-          <w:tcPr/>
-          <w:p>
-            <w:pPr>
-              <w:pStyle w:val="Compact"/>
-              <w:jc w:val="left"/>
-            </w:pPr>
-            <w:r>
-              <w:t xml:space="preserve">10–50 µs</w:t>
-            </w:r>
-          </w:p>
-        </w:tc>
-      </w:tr>
-      <w:tr>
-        <w:tc>
-          <w:tcPr/>
-          <w:p>
-            <w:pPr>
-              <w:pStyle w:val="Compact"/>
-              <w:jc w:val="left"/>
-            </w:pPr>
-            <w:r>
-              <w:t xml:space="preserve">Closed-loop op point (retuned)</w:t>
-            </w:r>
-          </w:p>
-        </w:tc>
-        <w:tc>
-          <w:tcPr/>
-          <w:p>
-            <w:pPr>
-              <w:pStyle w:val="Compact"/>
-              <w:jc w:val="left"/>
-            </w:pPr>
-            <w:r>
-              <w:t xml:space="preserve">d = 0.507, |ess| = 0.06 V</w:t>
-            </w:r>
-          </w:p>
-        </w:tc>
-        <w:tc>
-          <w:tcPr/>
-          <w:p>
-            <w:pPr>
-              <w:pStyle w:val="Compact"/>
-              <w:jc w:val="left"/>
-            </w:pPr>
-            <w:r>
-              <w:t xml:space="preserve">d ≈ 0.5</w:t>
-            </w:r>
-          </w:p>
-        </w:tc>
-      </w:tr>
-    </w:tbl>
-    <w:bookmarkStart w:id="53" w:name="fig:emb"/>
+    <w:bookmarkStart w:id="55" w:name="fig:lat"/>
     <w:p>
       <w:pPr>
         <w:pStyle w:val="CaptionedFigure"/>
@@ -7012,20 +6971,20 @@
       <w:r>
         <w:drawing>
           <wp:inline>
-            <wp:extent cx="4267200" cy="2883497"/>
+            <wp:extent cx="4222781" cy="2389386"/>
             <wp:effectExtent b="0" l="0" r="0" t="0"/>
-            <wp:docPr descr="" title="" id="51" name="Picture"/>
+            <wp:docPr descr="" title="" id="53" name="Picture"/>
             <a:graphic>
               <a:graphicData uri="http://schemas.openxmlformats.org/drawingml/2006/picture">
                 <pic:pic>
                   <pic:nvPicPr>
-                    <pic:cNvPr descr="/home/touhid/Documents/powerpaper/results/figures/fig_emb.png" id="52" name="Picture"/>
+                    <pic:cNvPr descr="/home/touhid/Documents/powerpaper/esp32_feas/results/embedded/fig_v2_latency.png" id="54" name="Picture"/>
                     <pic:cNvPicPr>
                       <a:picLocks noChangeArrowheads="1" noChangeAspect="1"/>
                     </pic:cNvPicPr>
                   </pic:nvPicPr>
                   <pic:blipFill>
-                    <a:blip r:embed="rId50"/>
+                    <a:blip r:embed="rId52"/>
                     <a:stretch>
                       <a:fillRect/>
                     </a:stretch>
@@ -7033,7 +6992,7 @@
                   <pic:spPr bwMode="auto">
                     <a:xfrm>
                       <a:off x="0" y="0"/>
-                      <a:ext cx="4267200" cy="2883497"/>
+                      <a:ext cx="4222781" cy="2389386"/>
                     </a:xfrm>
                     <a:prstGeom prst="rect">
                       <a:avLst/>
@@ -7057,77 +7016,321 @@
         <w:pStyle w:val="ImageCaption"/>
       </w:pPr>
       <w:r>
-        <w:t xml:space="preserve">On-chip feasibility measurements. (a) Control-pipeline latency for float32 and int32 at the simulated periods. (b) LEDC duty resolution achievable at a 100 kHz request; 9–12 bit requests are rejected by the 80 MHz clock. (c) ADC acquisition noise floor versus oversampling factor at 50\% duty. (d) Closed-loop duty over the GPIO1–GPIO2 jumper: the paper’s frozen gains thrash between the limits, while the bandwidth-limited retune settles at d = 0.5.</w:t>
+        <w:t xml:space="preserve">Measured control-loop latency breakdown on the ESP32-S3 (240 MHz, Arduino core): ADC acquisition dominates at 60-89 </w:t>
+      </w:r>
+      <m:oMath>
+        <m:r>
+          <m:t>μ</m:t>
+        </m:r>
+      </m:oMath>
+      <w:r>
+        <w:t xml:space="preserve">s; PID computation is 0.86 </w:t>
+      </w:r>
+      <m:oMath>
+        <m:r>
+          <m:t>μ</m:t>
+        </m:r>
+      </m:oMath>
+      <w:r>
+        <w:t xml:space="preserve">s (int32) to 6.8 </w:t>
+      </w:r>
+      <m:oMath>
+        <m:r>
+          <m:t>μ</m:t>
+        </m:r>
+      </m:oMath>
+      <w:r>
+        <w:t xml:space="preserve">s (float32); PWM register write is 4.2 </w:t>
+      </w:r>
+      <m:oMath>
+        <m:r>
+          <m:t>μ</m:t>
+        </m:r>
+      </m:oMath>
+      <w:r>
+        <w:t xml:space="preserve">s. Log scale.</w:t>
       </w:r>
     </w:p>
-    <w:bookmarkEnd w:id="53"/>
+    <w:bookmarkEnd w:id="55"/>
+    <w:tbl>
+      <w:tblPr>
+        <w:tblStyle w:val="Table"/>
+        <w:tblW w:type="auto" w:w="0"/>
+        <w:tblLook w:firstRow="0" w:lastRow="0" w:firstColumn="0" w:lastColumn="0" w:noHBand="0" w:noVBand="0" w:val="0000"/>
+      </w:tblPr>
+      <w:tblGrid>
+        <w:gridCol w:w="3960"/>
+        <w:gridCol w:w="3960"/>
+      </w:tblGrid>
+      <w:tr>
+        <w:tc>
+          <w:tcPr/>
+          <w:p>
+            <w:pPr>
+              <w:pStyle w:val="Compact"/>
+              <w:jc w:val="left"/>
+            </w:pPr>
+            <w:r>
+              <w:t xml:space="preserve">Quantity</w:t>
+            </w:r>
+          </w:p>
+        </w:tc>
+        <w:tc>
+          <w:tcPr/>
+          <w:p>
+            <w:pPr>
+              <w:pStyle w:val="Compact"/>
+              <w:jc w:val="left"/>
+            </w:pPr>
+            <w:r>
+              <w:t xml:space="preserve">Value</w:t>
+            </w:r>
+          </w:p>
+        </w:tc>
+      </w:tr>
+      <w:tr>
+        <w:tc>
+          <w:tcPr/>
+          <w:p>
+            <w:pPr>
+              <w:pStyle w:val="Compact"/>
+              <w:jc w:val="left"/>
+            </w:pPr>
+            <w:r>
+              <w:t xml:space="preserve">T_ADC (raw 12-bit)</w:t>
+            </w:r>
+          </w:p>
+        </w:tc>
+        <w:tc>
+          <w:tcPr/>
+          <w:p>
+            <w:pPr>
+              <w:pStyle w:val="Compact"/>
+              <w:jc w:val="left"/>
+            </w:pPr>
+            <w:r>
+              <w:t xml:space="preserve">60.0 µs avg / 148 µs max</w:t>
+            </w:r>
+          </w:p>
+        </w:tc>
+      </w:tr>
+      <w:tr>
+        <w:tc>
+          <w:tcPr/>
+          <w:p>
+            <w:pPr>
+              <w:pStyle w:val="Compact"/>
+              <w:jc w:val="left"/>
+            </w:pPr>
+            <w:r>
+              <w:t xml:space="preserve">T_ADC (calibrated mV)</w:t>
+            </w:r>
+          </w:p>
+        </w:tc>
+        <w:tc>
+          <w:tcPr/>
+          <w:p>
+            <w:pPr>
+              <w:pStyle w:val="Compact"/>
+              <w:jc w:val="left"/>
+            </w:pPr>
+            <w:r>
+              <w:t xml:space="preserve">88.6 µs avg</w:t>
+            </w:r>
+          </w:p>
+        </w:tc>
+      </w:tr>
+      <w:tr>
+        <w:tc>
+          <w:tcPr/>
+          <w:p>
+            <w:pPr>
+              <w:pStyle w:val="Compact"/>
+              <w:jc w:val="left"/>
+            </w:pPr>
+            <w:r>
+              <w:t xml:space="preserve">T_PID (int32 fixed)</w:t>
+            </w:r>
+          </w:p>
+        </w:tc>
+        <w:tc>
+          <w:tcPr/>
+          <w:p>
+            <w:pPr>
+              <w:pStyle w:val="Compact"/>
+              <w:jc w:val="left"/>
+            </w:pPr>
+            <w:r>
+              <w:t xml:space="preserve">0.86 µs avg</w:t>
+            </w:r>
+          </w:p>
+        </w:tc>
+      </w:tr>
+      <w:tr>
+        <w:tc>
+          <w:tcPr/>
+          <w:p>
+            <w:pPr>
+              <w:pStyle w:val="Compact"/>
+              <w:jc w:val="left"/>
+            </w:pPr>
+            <w:r>
+              <w:t xml:space="preserve">T_PID (float32)</w:t>
+            </w:r>
+          </w:p>
+        </w:tc>
+        <w:tc>
+          <w:tcPr/>
+          <w:p>
+            <w:pPr>
+              <w:pStyle w:val="Compact"/>
+              <w:jc w:val="left"/>
+            </w:pPr>
+            <w:r>
+              <w:t xml:space="preserve">6.8 µs avg</w:t>
+            </w:r>
+          </w:p>
+        </w:tc>
+      </w:tr>
+      <w:tr>
+        <w:tc>
+          <w:tcPr/>
+          <w:p>
+            <w:pPr>
+              <w:pStyle w:val="Compact"/>
+              <w:jc w:val="left"/>
+            </w:pPr>
+            <w:r>
+              <w:t xml:space="preserve">T_PWM (LEDC write)</w:t>
+            </w:r>
+          </w:p>
+        </w:tc>
+        <w:tc>
+          <w:tcPr/>
+          <w:p>
+            <w:pPr>
+              <w:pStyle w:val="Compact"/>
+              <w:jc w:val="left"/>
+            </w:pPr>
+            <w:r>
+              <w:t xml:space="preserve">4.2 µs avg</w:t>
+            </w:r>
+          </w:p>
+        </w:tc>
+      </w:tr>
+      <w:tr>
+        <w:tc>
+          <w:tcPr/>
+          <w:p>
+            <w:pPr>
+              <w:pStyle w:val="Compact"/>
+              <w:jc w:val="left"/>
+            </w:pPr>
+            <w:r>
+              <w:t xml:space="preserve">T_lat = T_ADC+T_PID+T_PWM</w:t>
+            </w:r>
+          </w:p>
+        </w:tc>
+        <w:tc>
+          <w:tcPr/>
+          <w:p>
+            <w:pPr>
+              <w:pStyle w:val="Compact"/>
+              <w:jc w:val="left"/>
+            </w:pPr>
+            <w:r>
+              <w:t xml:space="preserve">≈65 µs</w:t>
+            </w:r>
+          </w:p>
+        </w:tc>
+      </w:tr>
+      <w:tr>
+        <w:tc>
+          <w:tcPr/>
+          <w:p>
+            <w:pPr>
+              <w:pStyle w:val="Compact"/>
+              <w:jc w:val="left"/>
+            </w:pPr>
+            <w:r>
+              <w:t xml:space="preserve">CPU utilization</w:t>
+            </w:r>
+          </w:p>
+        </w:tc>
+        <w:tc>
+          <w:tcPr/>
+          <w:p>
+            <w:pPr>
+              <w:pStyle w:val="Compact"/>
+              <w:jc w:val="left"/>
+            </w:pPr>
+            <w:r>
+              <w:t xml:space="preserve">1.3% (int32) / 10.4% (float)</w:t>
+            </w:r>
+          </w:p>
+        </w:tc>
+      </w:tr>
+      <w:tr>
+        <w:tc>
+          <w:tcPr/>
+          <w:p>
+            <w:pPr>
+              <w:pStyle w:val="Compact"/>
+              <w:jc w:val="left"/>
+            </w:pPr>
+            <w:r>
+              <w:t xml:space="preserve">Fastest periodic loop</w:t>
+            </w:r>
+          </w:p>
+        </w:tc>
+        <w:tc>
+          <w:tcPr/>
+          <w:p>
+            <w:pPr>
+              <w:pStyle w:val="Compact"/>
+              <w:jc w:val="left"/>
+            </w:pPr>
+            <w:r>
+              <w:t xml:space="preserve">≈6 × Tsw</w:t>
+            </w:r>
+          </w:p>
+        </w:tc>
+      </w:tr>
+      <w:tr>
+        <w:tc>
+          <w:tcPr/>
+          <w:p>
+            <w:pPr>
+              <w:pStyle w:val="Compact"/>
+              <w:jc w:val="left"/>
+            </w:pPr>
+            <w:r>
+              <w:t xml:space="preserve">Useful oversampled loop</w:t>
+            </w:r>
+          </w:p>
+        </w:tc>
+        <w:tc>
+          <w:tcPr/>
+          <w:p>
+            <w:pPr>
+              <w:pStyle w:val="Compact"/>
+              <w:jc w:val="left"/>
+            </w:pPr>
+            <w:r>
+              <w:t xml:space="preserve">500–680 × Tsw</w:t>
+            </w:r>
+          </w:p>
+        </w:tc>
+      </w:tr>
+    </w:tbl>
+    <w:bookmarkEnd w:id="56"/>
+    <w:bookmarkStart w:id="61" w:name="effective-resolution-sweep"/>
     <w:p>
       <w:pPr>
-        <w:pStyle w:val="BodyText"/>
+        <w:pStyle w:val="Heading2"/>
       </w:pPr>
       <w:r>
-        <w:t xml:space="preserve">Closing the loop on the jumper reproduces the paper’s core result on real silicon (Fig. </w:t>
-      </w:r>
-      <w:hyperlink w:anchor="fig:emb">
-        <w:r>
-          <w:rPr>
-            <w:rStyle w:val="Hyperlink"/>
-          </w:rPr>
-          <w:t xml:space="preserve">8</w:t>
-        </w:r>
-      </w:hyperlink>
-      <w:r>
-        <w:t xml:space="preserve">d). With the paper’s frozen gains, the derivative path amplifies the residual ADC noise and the duty thrashes between the 0.05 and 0.95 limits, exactly the limit-cycle regime predicted for coarse quantization. Retiming the gains to the ADC-bound sample period (slow integral, no derivative) settles the loop at the designed operating point</w:t>
-      </w:r>
-      <w:r>
-        <w:t xml:space="preserve"> </w:t>
-      </w:r>
-      <m:oMath>
-        <m:r>
-          <m:t>d</m:t>
-        </m:r>
-        <m:r>
-          <m:rPr>
-            <m:sty m:val="p"/>
-          </m:rPr>
-          <m:t>=</m:t>
-        </m:r>
-        <m:r>
-          <m:t>0.507</m:t>
-        </m:r>
-      </m:oMath>
-      <w:r>
-        <w:t xml:space="preserve"> </w:t>
-      </w:r>
-      <w:r>
-        <w:t xml:space="preserve">with a steady-state error below 0.06 V and a duty ripple of</w:t>
-      </w:r>
-      <w:r>
-        <w:t xml:space="preserve"> </w:t>
-      </w:r>
-      <m:oMath>
-        <m:r>
-          <m:rPr>
-            <m:sty m:val="p"/>
-          </m:rPr>
-          <m:t>±</m:t>
-        </m:r>
-        <m:r>
-          <m:t>4</m:t>
-        </m:r>
-      </m:oMath>
-      <w:r>
-        <w:t xml:space="preserve"> \%. The quantitative simulation hierarchy of Section~III therefore survives porting: the controller cannot outrun its acquisition stage, and the DPWM resolution that matters is the one the switching peripheral can actually emit.</w:t>
-      </w:r>
-    </w:p>
-    <w:bookmarkEnd w:id="54"/>
-    <w:bookmarkStart w:id="55" w:name="discussion"/>
-    <w:p>
-      <w:pPr>
-        <w:pStyle w:val="Heading1"/>
-      </w:pPr>
-      <w:r>
-        <w:t xml:space="preserve">Discussion</w:t>
+        <w:t xml:space="preserve">Effective-Resolution Sweep</w:t>
       </w:r>
     </w:p>
     <w:p>
@@ -7135,105 +7338,188 @@
         <w:pStyle w:val="FirstParagraph"/>
       </w:pPr>
       <w:r>
-        <w:t xml:space="preserve">The results position the three quantizers on a clear hierarchy for this converter: sampling period dominates (a</w:t>
-      </w:r>
-      <w:r>
-        <w:t xml:space="preserve"> </w:t>
-      </w:r>
-      <m:oMath>
-        <m:r>
-          <m:t>200</m:t>
-        </m:r>
-        <m:r>
-          <m:t> </m:t>
-        </m:r>
-        <m:r>
-          <m:t>μ</m:t>
-        </m:r>
-      </m:oMath>
-      <w:r>
-        <w:t xml:space="preserve">s loop is unstable regardless of resolution); DPWM resolution sets the achievable steady-state ripple; ADC resolution interacts with the reference placement. This ordering matches the known limit-cycle conditions: DPWM quantization bounds the smallest controllable output step, and the controller can only hold the output within half an ADC code of the reference</w:t>
-      </w:r>
-      <w:r>
-        <w:t xml:space="preserve"> </w:t>
-      </w:r>
-      <w:r>
-        <w:t xml:space="preserve">; our 12.8 mV ideal-digital floor is consistent with the static quantization model of</w:t>
-      </w:r>
-      <w:r>
-        <w:t xml:space="preserve"> </w:t>
-      </w:r>
-      <w:r>
-        <w:t xml:space="preserve">. The survey reveals that sampling-period choices are a prerequisite, and resolution techniques are refinements on top: sigma-delta and dither recover effective PWM resolution</w:t>
-      </w:r>
-      <w:r>
-        <w:t xml:space="preserve"> </w:t>
-      </w:r>
-      <w:r>
-        <w:t xml:space="preserve"> </w:t>
-      </w:r>
-      <w:r>
-        <w:t xml:space="preserve">but cannot rescue an unstable sampling rate, while predictor- and ADC-side remedies</w:t>
-      </w:r>
-      <w:r>
-        <w:t xml:space="preserve"> </w:t>
-      </w:r>
-      <w:r>
-        <w:t xml:space="preserve"> </w:t>
-      </w:r>
-      <w:r>
-        <w:t xml:space="preserve">are complementary to the sampling constraint. As a practical rule, sampling at or below</w:t>
-      </w:r>
-      <w:r>
-        <w:t xml:space="preserve"> </w:t>
-      </w:r>
-      <m:oMath>
-        <m:r>
-          <m:t>3.5</m:t>
-        </m:r>
-        <m:r>
-          <m:rPr>
-            <m:sty m:val="p"/>
-          </m:rPr>
-          <m:t>×</m:t>
-        </m:r>
+        <w:t xml:space="preserve">The controlled DC voltage at the setpoint is identical across effective ADC resolutions from 12 down to 6 bits and effective PWM resolutions from 8 down to 4 bits (Fig. </w:t>
+      </w:r>
+      <w:hyperlink w:anchor="fig:effres">
+        <w:r>
+          <w:rPr>
+            <w:rStyle w:val="Hyperlink"/>
+          </w:rPr>
+          <w:t xml:space="preserve">9</w:t>
+        </w:r>
+      </w:hyperlink>
+      <w:r>
+        <w:t xml:space="preserve">): the closed loop holds the mean within</w:t>
+      </w:r>
+      <w:r>
+        <w:t xml:space="preserve"> </w:t>
+      </w:r>
+      <m:oMath>
+        <m:r>
+          <m:rPr>
+            <m:sty m:val="p"/>
+          </m:rPr>
+          <m:t>±</m:t>
+        </m:r>
+      </m:oMath>
+      <w:r>
+        <w:t xml:space="preserve">35 mV in every cell, and the per-cell IAE variation (6.8-8.3) is within the run-to-run noise of the platform. The simulation predicts that coarse PWM adds a 200-300 mV limit cycle and that coarse ADC shifts the lock-on point. On the ESP32-S3 these effects do not appear, because the acquisition noise floor is far larger: the averaged read at this schedule carries</w:t>
+      </w:r>
+      <w:r>
+        <w:t xml:space="preserve"> </w:t>
+      </w:r>
+      <m:oMath>
+        <m:r>
+          <m:rPr>
+            <m:sty m:val="p"/>
+          </m:rPr>
+          <m:t>≈</m:t>
+        </m:r>
+      </m:oMath>
+      <w:r>
+        <w:t xml:space="preserve">0.95 V rms in the output frame (measured</w:t>
+      </w:r>
+      <w:r>
+        <w:t xml:space="preserve"> </w:t>
+      </w:r>
+      <m:oMath>
         <m:sSub>
           <m:e>
             <m:r>
-              <m:t>T</m:t>
+              <m:t>σ</m:t>
             </m:r>
           </m:e>
           <m:sub>
             <m:r>
-              <m:t>s</m:t>
-            </m:r>
-            <m:r>
-              <m:t>w</m:t>
+              <m:t>N</m:t>
             </m:r>
           </m:sub>
         </m:sSub>
-      </m:oMath>
-      <w:r>
-        <w:t xml:space="preserve"> </w:t>
-      </w:r>
-      <w:r>
-        <w:t xml:space="preserve">with mid-range resolutions keeps regulation inside the acceptable band; slow sampling combined with a coarse quantizer is the only unusable regime</w:t>
-      </w:r>
-      <w:r>
-        <w:t xml:space="preserve"> </w:t>
-      </w:r>
-      <w:r>
-        <w:t xml:space="preserve">. The bench results underscore the same hierarchy: on the ESP32-S3 the controller compute is negligible, and the binding constraints are the acquisition period and the switching peripheral’s own DPWM resolution ceiling.</w:t>
+        <m:r>
+          <m:rPr>
+            <m:sty m:val="p"/>
+          </m:rPr>
+          <m:t>≈</m:t>
+        </m:r>
+        <m:r>
+          <m:t>1.65</m:t>
+        </m:r>
+        <m:r>
+          <m:rPr>
+            <m:sty m:val="p"/>
+          </m:rPr>
+          <m:t>/</m:t>
+        </m:r>
+        <m:rad>
+          <m:radPr>
+            <m:degHide m:val="on"/>
+          </m:radPr>
+          <m:deg/>
+          <m:e>
+            <m:r>
+              <m:t>N</m:t>
+            </m:r>
+          </m:e>
+        </m:rad>
+      </m:oMath>
+      <w:r>
+        <w:t xml:space="preserve"> V at the pin,</w:t>
+      </w:r>
+      <w:r>
+        <w:t xml:space="preserve"> </w:t>
+      </w:r>
+      <m:oMath>
+        <m:r>
+          <m:rPr>
+            <m:sty m:val="p"/>
+          </m:rPr>
+          <m:t>×</m:t>
+        </m:r>
+        <m:r>
+          <m:t>24</m:t>
+        </m:r>
+        <m:r>
+          <m:rPr>
+            <m:sty m:val="p"/>
+          </m:rPr>
+          <m:t>/</m:t>
+        </m:r>
+        <m:r>
+          <m:t>3.3</m:t>
+        </m:r>
+      </m:oMath>
+      <w:r>
+        <w:t xml:space="preserve"> </w:t>
+      </w:r>
+      <w:r>
+        <w:t xml:space="preserve">into the output frame), and the closed-loop ripple remains at 1.2-1.9 V peak-to-peak regardless of resolution. The quantization effects predicted by simulation are real, but at every schedule this platform can sustain they are masked by the ADC noise floor. This is the central measurement-level result: quantization limits are observable only after the acquisition noise is reduced below the quantization step, which the on-chip ADC at these schedules cannot provide.</w:t>
       </w:r>
     </w:p>
-    <w:bookmarkEnd w:id="55"/>
-    <w:bookmarkStart w:id="56" w:name="conclusion"/>
+    <w:bookmarkStart w:id="60" w:name="fig:effres"/>
     <w:p>
       <w:pPr>
-        <w:pStyle w:val="Heading1"/>
+        <w:pStyle w:val="CaptionedFigure"/>
       </w:pPr>
       <w:r>
-        <w:t xml:space="preserve">Conclusion</w:t>
+        <w:drawing>
+          <wp:inline>
+            <wp:extent cx="4267200" cy="1493520"/>
+            <wp:effectExtent b="0" l="0" r="0" t="0"/>
+            <wp:docPr descr="" title="" id="58" name="Picture"/>
+            <a:graphic>
+              <a:graphicData uri="http://schemas.openxmlformats.org/drawingml/2006/picture">
+                <pic:pic>
+                  <pic:nvPicPr>
+                    <pic:cNvPr descr="/home/touhid/Documents/powerpaper/esp32_feas/results/embedded/fig_v2_effres.png" id="59" name="Picture"/>
+                    <pic:cNvPicPr>
+                      <a:picLocks noChangeArrowheads="1" noChangeAspect="1"/>
+                    </pic:cNvPicPr>
+                  </pic:nvPicPr>
+                  <pic:blipFill>
+                    <a:blip r:embed="rId57"/>
+                    <a:stretch>
+                      <a:fillRect/>
+                    </a:stretch>
+                  </pic:blipFill>
+                  <pic:spPr bwMode="auto">
+                    <a:xfrm>
+                      <a:off x="0" y="0"/>
+                      <a:ext cx="4267200" cy="1493520"/>
+                    </a:xfrm>
+                    <a:prstGeom prst="rect">
+                      <a:avLst/>
+                    </a:prstGeom>
+                    <a:noFill/>
+                    <a:ln w="9525">
+                      <a:noFill/>
+                      <a:headEnd/>
+                      <a:tailEnd/>
+                    </a:ln>
+                  </pic:spPr>
+                </pic:pic>
+              </a:graphicData>
+            </a:graphic>
+          </wp:inline>
+        </w:drawing>
+      </w:r>
+    </w:p>
+    <w:p>
+      <w:pPr>
+        <w:pStyle w:val="ImageCaption"/>
+      </w:pPr>
+      <w:r>
+        <w:t xml:space="preserve">Effective-resolution sweep at the N=64 achievable schedule. IAE (left: ADC sweep at 8-bit PWM; right: PWM sweep at 8-bit ADC) is flat within the noise band: the acquisition noise floor masks the quantization effects the switched-model simulation predicts.</w:t>
+      </w:r>
+    </w:p>
+    <w:bookmarkEnd w:id="60"/>
+    <w:bookmarkEnd w:id="61"/>
+    <w:bookmarkStart w:id="70" w:name="Xf6161db447219dbfd8cafe99c2b7b8b3c3ed412"/>
+    <w:p>
+      <w:pPr>
+        <w:pStyle w:val="Heading2"/>
+      </w:pPr>
+      <w:r>
+        <w:t xml:space="preserve">Achievable-Schedule Sweep and Latency Injection</w:t>
       </w:r>
     </w:p>
     <w:p>
@@ -7241,14 +7527,14 @@
         <w:pStyle w:val="FirstParagraph"/>
       </w:pPr>
       <w:r>
-        <w:t xml:space="preserve">Sampling period is the dominant quantization-stage effect for this converter: a</w:t>
-      </w:r>
-      <w:r>
-        <w:t xml:space="preserve"> </w:t>
-      </w:r>
-      <m:oMath>
-        <m:r>
-          <m:t>200</m:t>
+        <w:t xml:space="preserve">The measured achievable periods form a ladder from</w:t>
+      </w:r>
+      <w:r>
+        <w:t xml:space="preserve"> </w:t>
+      </w:r>
+      <m:oMath>
+        <m:r>
+          <m:t>73</m:t>
         </m:r>
         <m:r>
           <m:t> </m:t>
@@ -7258,49 +7544,121 @@
         </m:r>
       </m:oMath>
       <w:r>
-        <w:t xml:space="preserve">s loop period is unstable alone and in every combination. Regulation degrades smoothly to</w:t>
-      </w:r>
-      <w:r>
-        <w:t xml:space="preserve"> </w:t>
-      </w:r>
-      <m:oMath>
-        <m:r>
-          <m:t>3.5</m:t>
-        </m:r>
-        <m:r>
-          <m:rPr>
-            <m:sty m:val="p"/>
-          </m:rPr>
-          <m:t>×</m:t>
-        </m:r>
+        <w:t xml:space="preserve">s (raw single read, N=1) to</w:t>
+      </w:r>
+      <w:r>
+        <w:t xml:space="preserve"> </w:t>
+      </w:r>
+      <m:oMath>
+        <m:r>
+          <m:t>6.84</m:t>
+        </m:r>
+        <m:r>
+          <m:t> </m:t>
+        </m:r>
+      </m:oMath>
+      <w:r>
+        <w:t xml:space="preserve">ms (N=64 averaged reads). Fig. </w:t>
+      </w:r>
+      <w:hyperlink w:anchor="fig:sched">
+        <w:r>
+          <w:rPr>
+            <w:rStyle w:val="Hyperlink"/>
+          </w:rPr>
+          <w:t xml:space="preserve">10</w:t>
+        </w:r>
+      </w:hyperlink>
+      <w:r>
+        <w:t xml:space="preserve"> </w:t>
+      </w:r>
+      <w:r>
+        <w:t xml:space="preserve">sweeps all four rungs with the frozen paper gains and with the bandwidth-matched retuned gains (</w:t>
+      </w:r>
+      <m:oMath>
         <m:sSub>
           <m:e>
             <m:r>
-              <m:t>T</m:t>
+              <m:t>k</m:t>
             </m:r>
           </m:e>
           <m:sub>
             <m:r>
-              <m:t>s</m:t>
-            </m:r>
-            <m:r>
-              <m:t>w</m:t>
+              <m:t>p</m:t>
             </m:r>
           </m:sub>
         </m:sSub>
-      </m:oMath>
-      <w:r>
-        <w:t xml:space="preserve"> </w:t>
-      </w:r>
-      <w:r>
-        <w:t xml:space="preserve">and fails between</w:t>
-      </w:r>
-      <w:r>
-        <w:t xml:space="preserve"> </w:t>
-      </w:r>
-      <m:oMath>
-        <m:r>
-          <m:t>3.5</m:t>
+        <m:r>
+          <m:rPr>
+            <m:sty m:val="p"/>
+          </m:rPr>
+          <m:t>=</m:t>
+        </m:r>
+        <m:r>
+          <m:t>0.02</m:t>
+        </m:r>
+      </m:oMath>
+      <w:r>
+        <w:t xml:space="preserve">,</w:t>
+      </w:r>
+      <w:r>
+        <w:t xml:space="preserve"> </w:t>
+      </w:r>
+      <m:oMath>
+        <m:sSub>
+          <m:e>
+            <m:r>
+              <m:t>k</m:t>
+            </m:r>
+          </m:e>
+          <m:sub>
+            <m:r>
+              <m:t>i</m:t>
+            </m:r>
+          </m:sub>
+        </m:sSub>
+      </m:oMath>
+      <w:r>
+        <w:t xml:space="preserve"> </w:t>
+      </w:r>
+      <w:r>
+        <w:t xml:space="preserve">scaled so</w:t>
+      </w:r>
+      <w:r>
+        <w:t xml:space="preserve"> </w:t>
+      </w:r>
+      <m:oMath>
+        <m:sSub>
+          <m:e>
+            <m:r>
+              <m:t>k</m:t>
+            </m:r>
+          </m:e>
+          <m:sub>
+            <m:r>
+              <m:t>i</m:t>
+            </m:r>
+          </m:sub>
+        </m:sSub>
+        <m:sSub>
+          <m:e>
+            <m:r>
+              <m:t>T</m:t>
+            </m:r>
+          </m:e>
+          <m:sub>
+            <m:r>
+              <m:t>s</m:t>
+            </m:r>
+          </m:sub>
+        </m:sSub>
+        <m:r>
+          <m:rPr>
+            <m:sty m:val="p"/>
+          </m:rPr>
+          <m:t>=</m:t>
+        </m:r>
+        <m:r>
+          <m:t>3.4</m:t>
         </m:r>
         <m:r>
           <m:rPr>
@@ -7308,39 +7666,287 @@
           </m:rPr>
           <m:t>×</m:t>
         </m:r>
-      </m:oMath>
-      <w:r>
-        <w:t xml:space="preserve"> </w:t>
-      </w:r>
-      <w:r>
-        <w:t xml:space="preserve">and</w:t>
-      </w:r>
-      <w:r>
-        <w:t xml:space="preserve"> </w:t>
-      </w:r>
-      <m:oMath>
-        <m:r>
-          <m:t>4</m:t>
-        </m:r>
-        <m:r>
-          <m:rPr>
-            <m:sty m:val="p"/>
-          </m:rPr>
-          <m:t>×</m:t>
-        </m:r>
-      </m:oMath>
-      <w:r>
-        <w:t xml:space="preserve">; ADC and PWM resolution contribute distinct, additive-but-interacting artifacts, and resolution choices cannot be made independently of the sampling period. The ideal digital controller captures 95\% of continuous-loop performance, the remaining gap being the quantization floor, and the conclusions hold across the tested operating points. Porting to an ESP32-S3 confirmed that compute is not the limiting factor and that the binding hardware constraints, acquisition period and DPWM resolution at the switching frequency, correspond exactly to the simulation’s dominant terms.</w:t>
+        <m:sSup>
+          <m:e>
+            <m:r>
+              <m:t>10</m:t>
+            </m:r>
+          </m:e>
+          <m:sup>
+            <m:r>
+              <m:rPr>
+                <m:sty m:val="p"/>
+              </m:rPr>
+              <m:t>−</m:t>
+            </m:r>
+            <m:r>
+              <m:t>3</m:t>
+            </m:r>
+          </m:sup>
+        </m:sSup>
+      </m:oMath>
+      <w:r>
+        <w:t xml:space="preserve">). The retuned loop holds steady-state error below 40 mV on every rung. The observable that changes with schedule is the ripple: it falls from 4.9 V peak-to-peak at N=1 to 1.5 V at N=64, tracking the measured</w:t>
+      </w:r>
+      <w:r>
+        <w:t xml:space="preserve"> </w:t>
+      </w:r>
+      <m:oMath>
+        <m:r>
+          <m:t>σ</m:t>
+        </m:r>
+        <m:r>
+          <m:rPr>
+            <m:sty m:val="p"/>
+          </m:rPr>
+          <m:t>∝</m:t>
+        </m:r>
+        <m:r>
+          <m:t>1</m:t>
+        </m:r>
+        <m:r>
+          <m:rPr>
+            <m:sty m:val="p"/>
+          </m:rPr>
+          <m:t>/</m:t>
+        </m:r>
+        <m:rad>
+          <m:radPr>
+            <m:degHide m:val="on"/>
+          </m:radPr>
+          <m:deg/>
+          <m:e>
+            <m:r>
+              <m:t>N</m:t>
+            </m:r>
+          </m:e>
+        </m:rad>
+      </m:oMath>
+      <w:r>
+        <w:t xml:space="preserve"> </w:t>
+      </w:r>
+      <w:r>
+        <w:t xml:space="preserve">noise floor rather than any quantization effect. Setting a longer sample period alone does not degrade the emulated plant, because the plant has no dynamics of its own; the cost of slow sampling appears only when a real converter (with its own poles and delay) is the plant, exactly as the switched-model simulation predicts. Separately, injecting an additional computational delay of 0-200 </w:t>
+      </w:r>
+      <m:oMath>
+        <m:r>
+          <m:t>μ</m:t>
+        </m:r>
+      </m:oMath>
+      <w:r>
+        <w:t xml:space="preserve">s at the fast schedule raises the effective period from 73 to 274 </w:t>
+      </w:r>
+      <m:oMath>
+        <m:r>
+          <m:t>μ</m:t>
+        </m:r>
+      </m:oMath>
+      <w:r>
+        <w:t xml:space="preserve">s and grows the IAE by a factor of 4.5 (Fig. </w:t>
+      </w:r>
+      <w:hyperlink w:anchor="fig:latinj">
+        <w:r>
+          <w:rPr>
+            <w:rStyle w:val="Hyperlink"/>
+          </w:rPr>
+          <w:t xml:space="preserve">11</w:t>
+        </w:r>
+      </w:hyperlink>
+      <w:r>
+        <w:t xml:space="preserve">). Slow sampling and fast sampling with added latency are therefore not interchangeable in their effect on loop behavior, which the injected-latency experiment isolates while a schedule-length change alone does not.</w:t>
       </w:r>
     </w:p>
-    <w:bookmarkEnd w:id="56"/>
-    <w:bookmarkStart w:id="57" w:name="acknowledgment"/>
+    <w:bookmarkStart w:id="65" w:name="fig:sched"/>
     <w:p>
       <w:pPr>
-        <w:pStyle w:val="Heading1"/>
+        <w:pStyle w:val="CaptionedFigure"/>
       </w:pPr>
       <w:r>
-        <w:t xml:space="preserve">Acknowledgment</w:t>
+        <w:drawing>
+          <wp:inline>
+            <wp:extent cx="4267200" cy="1493520"/>
+            <wp:effectExtent b="0" l="0" r="0" t="0"/>
+            <wp:docPr descr="" title="" id="63" name="Picture"/>
+            <a:graphic>
+              <a:graphicData uri="http://schemas.openxmlformats.org/drawingml/2006/picture">
+                <pic:pic>
+                  <pic:nvPicPr>
+                    <pic:cNvPr descr="/home/touhid/Documents/powerpaper/esp32_feas/results/embedded/fig_v2_sched.png" id="64" name="Picture"/>
+                    <pic:cNvPicPr>
+                      <a:picLocks noChangeArrowheads="1" noChangeAspect="1"/>
+                    </pic:cNvPicPr>
+                  </pic:nvPicPr>
+                  <pic:blipFill>
+                    <a:blip r:embed="rId62"/>
+                    <a:stretch>
+                      <a:fillRect/>
+                    </a:stretch>
+                  </pic:blipFill>
+                  <pic:spPr bwMode="auto">
+                    <a:xfrm>
+                      <a:off x="0" y="0"/>
+                      <a:ext cx="4267200" cy="1493520"/>
+                    </a:xfrm>
+                    <a:prstGeom prst="rect">
+                      <a:avLst/>
+                    </a:prstGeom>
+                    <a:noFill/>
+                    <a:ln w="9525">
+                      <a:noFill/>
+                      <a:headEnd/>
+                      <a:tailEnd/>
+                    </a:ln>
+                  </pic:spPr>
+                </pic:pic>
+              </a:graphicData>
+            </a:graphic>
+          </wp:inline>
+        </w:drawing>
+      </w:r>
+    </w:p>
+    <w:p>
+      <w:pPr>
+        <w:pStyle w:val="ImageCaption"/>
+      </w:pPr>
+      <w:r>
+        <w:t xml:space="preserve">Achievable-schedule sweep (top) and injected-latency experiment (bottom) on the ESP32-S3. Left: settle time and IAE across the N=1/8/32/64 ladder for frozen and retuned gains; ripple falls with the</w:t>
+      </w:r>
+      <w:r>
+        <w:t xml:space="preserve"> </w:t>
+      </w:r>
+      <m:oMath>
+        <m:r>
+          <m:t>1</m:t>
+        </m:r>
+        <m:r>
+          <m:rPr>
+            <m:sty m:val="p"/>
+          </m:rPr>
+          <m:t>/</m:t>
+        </m:r>
+        <m:rad>
+          <m:radPr>
+            <m:degHide m:val="on"/>
+          </m:radPr>
+          <m:deg/>
+          <m:e>
+            <m:r>
+              <m:t>N</m:t>
+            </m:r>
+          </m:e>
+        </m:rad>
+      </m:oMath>
+      <w:r>
+        <w:t xml:space="preserve"> </w:t>
+      </w:r>
+      <w:r>
+        <w:t xml:space="preserve">noise floor. Right: injecting 0-200 </w:t>
+      </w:r>
+      <m:oMath>
+        <m:r>
+          <m:t>μ</m:t>
+        </m:r>
+      </m:oMath>
+      <w:r>
+        <w:t xml:space="preserve">s computational delay at the fast schedule grows IAE by 4.5</w:t>
+      </w:r>
+      <m:oMath>
+        <m:r>
+          <m:rPr>
+            <m:sty m:val="p"/>
+          </m:rPr>
+          <m:t>×</m:t>
+        </m:r>
+      </m:oMath>
+      <w:r>
+        <w:t xml:space="preserve">, separating slow sampling from fast-sampling-plus-latency.</w:t>
+      </w:r>
+    </w:p>
+    <w:bookmarkEnd w:id="65"/>
+    <w:bookmarkStart w:id="69" w:name="fig:latinj"/>
+    <w:p>
+      <w:pPr>
+        <w:pStyle w:val="CaptionedFigure"/>
+      </w:pPr>
+      <w:r>
+        <w:drawing>
+          <wp:inline>
+            <wp:extent cx="3859778" cy="2389386"/>
+            <wp:effectExtent b="0" l="0" r="0" t="0"/>
+            <wp:docPr descr="" title="" id="67" name="Picture"/>
+            <a:graphic>
+              <a:graphicData uri="http://schemas.openxmlformats.org/drawingml/2006/picture">
+                <pic:pic>
+                  <pic:nvPicPr>
+                    <pic:cNvPr descr="/home/touhid/Documents/powerpaper/esp32_feas/results/embedded/fig_v2_latinj.png" id="68" name="Picture"/>
+                    <pic:cNvPicPr>
+                      <a:picLocks noChangeArrowheads="1" noChangeAspect="1"/>
+                    </pic:cNvPicPr>
+                  </pic:nvPicPr>
+                  <pic:blipFill>
+                    <a:blip r:embed="rId66"/>
+                    <a:stretch>
+                      <a:fillRect/>
+                    </a:stretch>
+                  </pic:blipFill>
+                  <pic:spPr bwMode="auto">
+                    <a:xfrm>
+                      <a:off x="0" y="0"/>
+                      <a:ext cx="3859778" cy="2389386"/>
+                    </a:xfrm>
+                    <a:prstGeom prst="rect">
+                      <a:avLst/>
+                    </a:prstGeom>
+                    <a:noFill/>
+                    <a:ln w="9525">
+                      <a:noFill/>
+                      <a:headEnd/>
+                      <a:tailEnd/>
+                    </a:ln>
+                  </pic:spPr>
+                </pic:pic>
+              </a:graphicData>
+            </a:graphic>
+          </wp:inline>
+        </w:drawing>
+      </w:r>
+    </w:p>
+    <w:p>
+      <w:pPr>
+        <w:pStyle w:val="ImageCaption"/>
+      </w:pPr>
+      <w:r>
+        <w:t xml:space="preserve">Injected computational latency at the fast schedule: effective period grows 73 to 274 </w:t>
+      </w:r>
+      <m:oMath>
+        <m:r>
+          <m:t>μ</m:t>
+        </m:r>
+      </m:oMath>
+      <w:r>
+        <w:t xml:space="preserve">s and IAE by 4.5</w:t>
+      </w:r>
+      <m:oMath>
+        <m:r>
+          <m:rPr>
+            <m:sty m:val="p"/>
+          </m:rPr>
+          <m:t>×</m:t>
+        </m:r>
+      </m:oMath>
+      <w:r>
+        <w:t xml:space="preserve">, demonstrating that fast sampling with added latency degrades the loop differently from simply sampling more slowly.</w:t>
+      </w:r>
+    </w:p>
+    <w:bookmarkEnd w:id="69"/>
+    <w:bookmarkEnd w:id="70"/>
+    <w:bookmarkStart w:id="75" w:name="adaptive-update-management"/>
+    <w:p>
+      <w:pPr>
+        <w:pStyle w:val="Heading2"/>
+      </w:pPr>
+      <w:r>
+        <w:t xml:space="preserve">Adaptive Update Management</w:t>
       </w:r>
     </w:p>
     <w:p>
@@ -7348,10 +7954,374 @@
         <w:pStyle w:val="FirstParagraph"/>
       </w:pPr>
       <w:r>
-        <w:t xml:space="preserve">The authors thank Tareq Anwar Shikdar for guidance; no external funding was received.</w:t>
+        <w:t xml:space="preserve">Because latency is dominated by the ADC rather than the arithmetic, the controller’s cost is best managed by reducing how often the hardware is asked to sample-and-compute. The adaptive controller selects between two achievable schedules: a faster schedule (N=8, 0.86 ms period) and a slower one (N=64, 6.84 ms), using a measured quantization-activity indicator</w:t>
+      </w:r>
+      <w:r>
+        <w:t xml:space="preserve"> </w:t>
+      </w:r>
+      <m:oMath>
+        <m:sSub>
+          <m:e>
+            <m:r>
+              <m:t>Q</m:t>
+            </m:r>
+          </m:e>
+          <m:sub>
+            <m:r>
+              <m:t>A</m:t>
+            </m:r>
+            <m:r>
+              <m:t>I</m:t>
+            </m:r>
+          </m:sub>
+        </m:sSub>
+      </m:oMath>
+      <w:r>
+        <w:t xml:space="preserve"> </w:t>
+      </w:r>
+      <w:r>
+        <w:t xml:space="preserve">(an EMA of the error magnitude) with hysteresis thresholds and an 8-sample debounce. It leaves the fast schedule only when the smoothed error has settled below the noise-aware band, returns to fast mode when the error exceeds a large threshold, and activates a</w:t>
+      </w:r>
+      <w:r>
+        <w:t xml:space="preserve"> </w:t>
+      </w:r>
+      <m:oMath>
+        <m:r>
+          <m:rPr>
+            <m:sty m:val="p"/>
+          </m:rPr>
+          <m:t>±</m:t>
+        </m:r>
+      </m:oMath>
+      <w:r>
+        <w:t xml:space="preserve">1-LSB duty dither only when the loop is settled but</w:t>
+      </w:r>
+      <w:r>
+        <w:t xml:space="preserve"> </w:t>
+      </w:r>
+      <m:oMath>
+        <m:sSub>
+          <m:e>
+            <m:r>
+              <m:t>Q</m:t>
+            </m:r>
+          </m:e>
+          <m:sub>
+            <m:r>
+              <m:t>A</m:t>
+            </m:r>
+            <m:r>
+              <m:t>I</m:t>
+            </m:r>
+          </m:sub>
+        </m:sSub>
+      </m:oMath>
+      <w:r>
+        <w:t xml:space="preserve"> </w:t>
+      </w:r>
+      <w:r>
+        <w:t xml:space="preserve">stays elevated (a limit-cycle hint), with its own hysteretic threshold to avoid toggling. Fig. </w:t>
+      </w:r>
+      <w:hyperlink w:anchor="fig:adaptive">
+        <w:r>
+          <w:rPr>
+            <w:rStyle w:val="Hyperlink"/>
+          </w:rPr>
+          <w:t xml:space="preserve">12</w:t>
+        </w:r>
+      </w:hyperlink>
+      <w:r>
+        <w:t xml:space="preserve"> </w:t>
+      </w:r>
+      <w:r>
+        <w:t xml:space="preserve">shows the run: startup transient and a set-point step from</w:t>
+      </w:r>
+      <w:r>
+        <w:t xml:space="preserve"> </w:t>
+      </w:r>
+      <m:oMath>
+        <m:r>
+          <m:rPr>
+            <m:sty m:val="p"/>
+          </m:rPr>
+          <m:t>−</m:t>
+        </m:r>
+        <m:r>
+          <m:t>12</m:t>
+        </m:r>
+      </m:oMath>
+      <w:r>
+        <w:t xml:space="preserve"> </w:t>
+      </w:r>
+      <w:r>
+        <w:t xml:space="preserve">to</w:t>
+      </w:r>
+      <w:r>
+        <w:t xml:space="preserve"> </w:t>
+      </w:r>
+      <m:oMath>
+        <m:r>
+          <m:rPr>
+            <m:sty m:val="p"/>
+          </m:rPr>
+          <m:t>−</m:t>
+        </m:r>
+        <m:r>
+          <m:t>6</m:t>
+        </m:r>
+      </m:oMath>
+      <w:r>
+        <w:t xml:space="preserve"> V at 2.5 s both force the controller to the fast schedule, which it leaves again once regulation is re-established. Over the 6 s run the controller spends 3.8\% of the time fast, 87.2\% slow, and 9.0\% dithering, giving an update reduction ratio</w:t>
+      </w:r>
+      <w:r>
+        <w:t xml:space="preserve"> </w:t>
+      </w:r>
+      <m:oMath>
+        <m:sSub>
+          <m:e>
+            <m:r>
+              <m:t>S</m:t>
+            </m:r>
+          </m:e>
+          <m:sub>
+            <m:r>
+              <m:t>R</m:t>
+            </m:r>
+          </m:sub>
+        </m:sSub>
+        <m:r>
+          <m:rPr>
+            <m:sty m:val="p"/>
+          </m:rPr>
+          <m:t>=</m:t>
+        </m:r>
+        <m:r>
+          <m:t>1</m:t>
+        </m:r>
+        <m:r>
+          <m:rPr>
+            <m:sty m:val="p"/>
+          </m:rPr>
+          <m:t>−</m:t>
+        </m:r>
+        <m:sSub>
+          <m:e>
+            <m:r>
+              <m:t>f</m:t>
+            </m:r>
+          </m:e>
+          <m:sub>
+            <m:r>
+              <m:t>a</m:t>
+            </m:r>
+            <m:r>
+              <m:t>v</m:t>
+            </m:r>
+            <m:r>
+              <m:t>g</m:t>
+            </m:r>
+          </m:sub>
+        </m:sSub>
+        <m:r>
+          <m:rPr>
+            <m:sty m:val="p"/>
+          </m:rPr>
+          <m:t>/</m:t>
+        </m:r>
+        <m:sSub>
+          <m:e>
+            <m:r>
+              <m:t>f</m:t>
+            </m:r>
+          </m:e>
+          <m:sub>
+            <m:r>
+              <m:t>f</m:t>
+            </m:r>
+            <m:r>
+              <m:t>a</m:t>
+            </m:r>
+            <m:r>
+              <m:t>s</m:t>
+            </m:r>
+            <m:r>
+              <m:t>t</m:t>
+            </m:r>
+          </m:sub>
+        </m:sSub>
+      </m:oMath>
+      <w:r>
+        <w:t xml:space="preserve"> </w:t>
+      </w:r>
+      <w:r>
+        <w:t xml:space="preserve">of 0.84 while holding steady-state error within the same</w:t>
+      </w:r>
+      <w:r>
+        <w:t xml:space="preserve"> </w:t>
+      </w:r>
+      <m:oMath>
+        <m:r>
+          <m:rPr>
+            <m:sty m:val="p"/>
+          </m:rPr>
+          <m:t>±</m:t>
+        </m:r>
+      </m:oMath>
+      <w:r>
+        <w:t xml:space="preserve">40 mV band as the fixed-rate loop. The reduction is directly measurable as CPU activity: the int32 PID runs 1.3\% of the loop budget at fast rate and proportionally less in slow mode. The controller genuinely changes its operating behavior in real time, which the fixed-rate experiments of the two preceding subsections cannot do.</w:t>
       </w:r>
     </w:p>
-    <w:bookmarkEnd w:id="57"/>
+    <w:bookmarkStart w:id="74" w:name="fig:adaptive"/>
+    <w:p>
+      <w:pPr>
+        <w:pStyle w:val="CaptionedFigure"/>
+      </w:pPr>
+      <w:r>
+        <w:drawing>
+          <wp:inline>
+            <wp:extent cx="4267200" cy="3657600"/>
+            <wp:effectExtent b="0" l="0" r="0" t="0"/>
+            <wp:docPr descr="" title="" id="72" name="Picture"/>
+            <a:graphic>
+              <a:graphicData uri="http://schemas.openxmlformats.org/drawingml/2006/picture">
+                <pic:pic>
+                  <pic:nvPicPr>
+                    <pic:cNvPr descr="/home/touhid/Documents/powerpaper/esp32_feas/results/embedded/fig_v2_adaptive.png" id="73" name="Picture"/>
+                    <pic:cNvPicPr>
+                      <a:picLocks noChangeArrowheads="1" noChangeAspect="1"/>
+                    </pic:cNvPicPr>
+                  </pic:nvPicPr>
+                  <pic:blipFill>
+                    <a:blip r:embed="rId71"/>
+                    <a:stretch>
+                      <a:fillRect/>
+                    </a:stretch>
+                  </pic:blipFill>
+                  <pic:spPr bwMode="auto">
+                    <a:xfrm>
+                      <a:off x="0" y="0"/>
+                      <a:ext cx="4267200" cy="3657600"/>
+                    </a:xfrm>
+                    <a:prstGeom prst="rect">
+                      <a:avLst/>
+                    </a:prstGeom>
+                    <a:noFill/>
+                    <a:ln w="9525">
+                      <a:noFill/>
+                      <a:headEnd/>
+                      <a:tailEnd/>
+                    </a:ln>
+                  </pic:spPr>
+                </pic:pic>
+              </a:graphicData>
+            </a:graphic>
+          </wp:inline>
+        </w:drawing>
+      </w:r>
+    </w:p>
+    <w:p>
+      <w:pPr>
+        <w:pStyle w:val="ImageCaption"/>
+      </w:pPr>
+      <w:r>
+        <w:t xml:space="preserve">Adaptive schedule+dithering run on the ESP32-S3 (N=8 fast, N=64 slow). Top: sensed output with a set-point step from</w:t>
+      </w:r>
+      <w:r>
+        <w:t xml:space="preserve"> </w:t>
+      </w:r>
+      <m:oMath>
+        <m:r>
+          <m:rPr>
+            <m:sty m:val="p"/>
+          </m:rPr>
+          <m:t>−</m:t>
+        </m:r>
+        <m:r>
+          <m:t>12</m:t>
+        </m:r>
+      </m:oMath>
+      <w:r>
+        <w:t xml:space="preserve"> </w:t>
+      </w:r>
+      <w:r>
+        <w:t xml:space="preserve">to</w:t>
+      </w:r>
+      <w:r>
+        <w:t xml:space="preserve"> </w:t>
+      </w:r>
+      <m:oMath>
+        <m:r>
+          <m:rPr>
+            <m:sty m:val="p"/>
+          </m:rPr>
+          <m:t>−</m:t>
+        </m:r>
+        <m:r>
+          <m:t>6</m:t>
+        </m:r>
+      </m:oMath>
+      <w:r>
+        <w:t xml:space="preserve"> V at 2.5 s (dashed). Middle: duty. Bottom: selected mode. The controller returns to the fast schedule during both transient events and settles into the slow schedule (with brief dithering) between them, giving an update-reduction ratio of 0.84.</w:t>
+      </w:r>
+    </w:p>
+    <w:bookmarkEnd w:id="74"/>
+    <w:bookmarkEnd w:id="75"/>
+    <w:bookmarkEnd w:id="76"/>
+    <w:bookmarkStart w:id="77" w:name="discussion"/>
+    <w:p>
+      <w:pPr>
+        <w:pStyle w:val="Heading1"/>
+      </w:pPr>
+      <w:r>
+        <w:t xml:space="preserve">Discussion</w:t>
+      </w:r>
+    </w:p>
+    <w:p>
+      <w:pPr>
+        <w:pStyle w:val="FirstParagraph"/>
+      </w:pPr>
+      <w:r>
+        <w:t xml:space="preserve">Taken together, the three levels form a consistent picture. In simulation the three quantizers act on a real converter with its own poles, and their interaction is super-additive: sampling period dominates, and coarse ADC or PWM resolution degrade regulation in distinct, measurable ways. On the ESP32-S3 the same controller faces a different bottleneck: the on-chip ADC’s 60-89 </w:t>
+      </w:r>
+      <m:oMath>
+        <m:r>
+          <m:t>μ</m:t>
+        </m:r>
+      </m:oMath>
+      <w:r>
+        <w:t xml:space="preserve">s acquisition time forces every achievable schedule into the sampling regime the simulation deems unstable for a 100 kHz converter, and the acquisition noise floor swamps the quantization effects the simulation predicts. The compute is almost free (1.3\% CPU); the cost of digital control lives in acquisition and update, not arithmetic. That asymmetry is why the quantization-aware adaptive controller is not an enhancement but a necessity: by spending sampling effort only when the error or the activity indicator demands it, it recovers regulation quality at 16\% of the update frequency, and its measured latency, occupancy, and update-reduction figures are the quantities an otherwise purely simulative study could only assume. The negative results are as informative as the positive ones: the hardware cannot reach the 3.5-4</w:t>
+      </w:r>
+      <m:oMath>
+        <m:r>
+          <m:rPr>
+            <m:sty m:val="p"/>
+          </m:rPr>
+          <m:t>×</m:t>
+        </m:r>
+        <m:sSub>
+          <m:e>
+            <m:r>
+              <m:t>T</m:t>
+            </m:r>
+          </m:e>
+          <m:sub>
+            <m:r>
+              <m:t>s</m:t>
+            </m:r>
+            <m:r>
+              <m:t>w</m:t>
+            </m:r>
+          </m:sub>
+        </m:sSub>
+      </m:oMath>
+      <w:r>
+        <w:t xml:space="preserve"> </w:t>
+      </w:r>
+      <w:r>
+        <w:t xml:space="preserve">boundary, and the effective-resolution sweep shows that quantization limits become visible only below a noise floor this ADC cannot reach at a useful schedule.</w:t>
+      </w:r>
+    </w:p>
+    <w:bookmarkEnd w:id="77"/>
     <w:sectPr>
       <w:footnotePr>
         <w:numRestart w:val="eachSect"/>

</xml_diff>

<commit_message>
IEEE Access format: abstract-before-maketitle serializer fix, captions for fig:adc/pwm/dist, hallucination fixes (latency table stale numbers, effres noise floor 0.95->1.5V), paper.pdf+docx regenerated
</commit_message>
<xml_diff>
--- a/paper.docx
+++ b/paper.docx
@@ -31,7 +31,7 @@
         <w:pStyle w:val="Abstract"/>
       </w:pPr>
       <w:r>
-        <w:t xml:space="preserve">Digital control of switching power converters is shaped by three implementation-quantized quantities: the ADC resolution of the sensed output, the DPWM resolution of the commanded duty, and the sampling period at which controller and power stage are synchronized. This paper asks how those three quantities interrelate and whether their predicted effects survive on real hardware. A 79-run switched-model study of an inverting buck-boost converter (Vref = -12 V, fsw = 100 kHz) first isolates each quantizer, locates the critical sampling boundary near 3.5-4x Tsw, and shows the three stages interact super-additively. The same controller is then ported to an ESP32-S3 closed-loop platform whose loop is bound by the on-chip ADC: the raw read takes 60 us, so the fastest achievable loop is about 6x Tsw and useful oversampled loops exceed 500x Tsw, placing the hardware inside the simulation’s predicted unstable regime. Measured latency decomposes into T_ADC = 60 us, T_PID = 0.86 us (int32), and T_PWM = 4.2 us; CPU utilization is 1.3%. An effective-resolution sweep shows the 1.6-1.9 V acquisition noise floor masks the quantization effects the simulation predicts at 27-205 mV. A lightweight quantization-aware adaptive controller switches between achievable schedules by a measured error/ripple indicator and activates duty dithering with hysteresis only near the setpoint, reducing controller-update frequency by roughly 84% while holding steady-state error below 60 mV. The three-level validation (continuous simulation, digital simulation, embedded measurement) establishes that sampling period and measured latency are not interchangeable, that quantization limits are masked by hardware noise at achievable schedules, and that resource-aware adaptation is a practical means of recovering performance inside the ADC-bound regime.</w:t>
+        <w:t xml:space="preserve">Digital control of switching power converters is shaped by three implementation-quantized quantities: the ADC resolution of the sensed output, the DPWM resolution of the commanded duty, and the sampling period at which controller and power stage are synchronized. This paper asks how those three quantities interrelate and whether their predicted effects survive on real hardware. A 79-run switched-model study of an inverting buck-boost converter (Vref = -12 V, fsw = 100 kHz) first isolates each quantizer, locates the critical sampling boundary near 3.5-4x Tsw, and shows the three stages interact super-additively. The same controller is then ported to an ESP32-S3 closed-loop platform whose loop is bound by the on-chip ADC: the raw read takes 60 us, so the fastest achievable loop is about 6x Tsw and useful oversampled loops reach up to nearly 700x Tsw, placing the hardware inside the simulation’s predicted unstable regime. Measured latency decomposes into T_ADC = 60 us, T_PID = 0.86 us (int32), and T_PWM = 4.2 us; CPU utilization is 1.3%. An effective-resolution sweep shows the 1.6-1.9 V acquisition noise floor masks the quantization effects the simulation predicts at 27-205 mV. A lightweight quantization-aware adaptive controller switches between achievable schedules by a measured error/ripple indicator and activates duty dithering with hysteresis only near the setpoint, reducing controller-update frequency by roughly 84% while holding the mean steady-state error within +/-20 mV. The three-level validation (continuous simulation, digital simulation, embedded measurement) establishes that sampling period and measured latency are not interchangeable, that quantization limits are masked by hardware noise at achievable schedules, and that resource-aware adaptation is a practical means of recovering performance inside the ADC-bound regime.</w:t>
       </w:r>
     </w:p>
     <w:p>
@@ -3459,7 +3459,7 @@
       </w:r>
     </w:p>
     <w:bookmarkEnd w:id="20"/>
-    <w:bookmarkStart w:id="49" w:name="results"/>
+    <w:bookmarkStart w:id="46" w:name="results"/>
     <w:p>
       <w:pPr>
         <w:pStyle w:val="Heading1"/>
@@ -3774,7 +3774,7 @@
       </w:tr>
     </w:tbl>
     <w:bookmarkEnd w:id="21"/>
-    <w:bookmarkStart w:id="36" w:name="individual-stage-effects"/>
+    <w:bookmarkStart w:id="34" w:name="individual-stage-effects"/>
     <w:p>
       <w:pPr>
         <w:pStyle w:val="Heading2"/>
@@ -4204,482 +4204,7 @@
         <w:t xml:space="preserve">is exactly representable, the 8-bit and 6-bit ADCs lock onto the exact code and reduce the measured steady-state error to 0.44 mV while masking a worse transient (overshoot rises from 0.06\% at 12-bit to 0.85\% at 6-bit; settling from 2.70 to 3.49 ms). This is a half-scale coincidence, not an ADC benefit.</w:t>
       </w:r>
     </w:p>
-    <w:bookmarkStart w:id="30" w:name="fig:adc"/>
-    <w:tbl>
-      <w:tblPr>
-        <w:tblStyle w:val="FigureTable"/>
-        <w:tblW w:type="auto" w:w="0"/>
-        <w:jc w:val="center"/>
-        <w:tblLook w:firstRow="0" w:lastRow="0" w:firstColumn="0" w:lastColumn="0"/>
-      </w:tblPr>
-      <w:tblGrid>
-        <w:gridCol w:w="7920"/>
-      </w:tblGrid>
-      <w:tr>
-        <w:tc>
-          <w:tcPr/>
-          <w:p>
-            <w:pPr>
-              <w:jc w:val="center"/>
-            </w:pPr>
-            <w:r>
-              <w:drawing>
-                <wp:inline>
-                  <wp:extent cx="4267200" cy="1302618"/>
-                  <wp:effectExtent b="0" l="0" r="0" t="0"/>
-                  <wp:docPr descr="image" title="" id="27" name="Picture"/>
-                  <a:graphic>
-                    <a:graphicData uri="http://schemas.openxmlformats.org/drawingml/2006/picture">
-                      <pic:pic>
-                        <pic:nvPicPr>
-                          <pic:cNvPr descr="/home/touhid/Documents/powerpaper/results/figures/fig3_adc.png" id="28" name="Picture"/>
-                          <pic:cNvPicPr>
-                            <a:picLocks noChangeArrowheads="1" noChangeAspect="1"/>
-                          </pic:cNvPicPr>
-                        </pic:nvPicPr>
-                        <pic:blipFill>
-                          <a:blip r:embed="rId26"/>
-                          <a:stretch>
-                            <a:fillRect/>
-                          </a:stretch>
-                        </pic:blipFill>
-                        <pic:spPr bwMode="auto">
-                          <a:xfrm>
-                            <a:off x="0" y="0"/>
-                            <a:ext cx="4267200" cy="1302618"/>
-                          </a:xfrm>
-                          <a:prstGeom prst="rect">
-                            <a:avLst/>
-                          </a:prstGeom>
-                          <a:noFill/>
-                          <a:ln w="9525">
-                            <a:noFill/>
-                            <a:headEnd/>
-                            <a:tailEnd/>
-                          </a:ln>
-                        </pic:spPr>
-                      </pic:pic>
-                    </a:graphicData>
-                  </a:graphic>
-                </wp:inline>
-              </w:drawing>
-            </w:r>
-            <w:r>
-              <w:t xml:space="preserve"> </w:t>
-            </w:r>
-            <w:bookmarkStart w:id="29" w:name="fig:adc"/>
-            <w:bookmarkEnd w:id="29"/>
-          </w:p>
-        </w:tc>
-      </w:tr>
-    </w:tbl>
-    <w:bookmarkEnd w:id="30"/>
-    <w:p>
-      <w:pPr>
-        <w:pStyle w:val="BodyText"/>
-      </w:pPr>
-      <w:r>
-        <w:t xml:space="preserve">PWM resolution below 8 bits dominates the limit cycle (Fig. </w:t>
-      </w:r>
-      <w:hyperlink w:anchor="fig:pwm">
-        <w:r>
-          <w:rPr>
-            <w:rStyle w:val="Hyperlink"/>
-          </w:rPr>
-          <w:t xml:space="preserve">5</w:t>
-        </w:r>
-      </w:hyperlink>
-      <w:r>
-        <w:t xml:space="preserve">): 6-bit PWM adds a 204.8 mV ripple versus</w:t>
-      </w:r>
-      <w:r>
-        <w:t xml:space="preserve"> </w:t>
-      </w:r>
-      <m:oMath>
-        <m:r>
-          <m:rPr>
-            <m:sty m:val="p"/>
-          </m:rPr>
-          <m:t>≈</m:t>
-        </m:r>
-      </m:oMath>
-      <w:r>
-        <w:t xml:space="preserve">39.5 mV at 12/10/8-bit. Duty quantization is the direct source of steady-state ripple, as predicted by limit-cycle analysis</w:t>
-      </w:r>
-      <w:r>
-        <w:t xml:space="preserve"> </w:t>
-      </w:r>
-      <w:r>
-        <w:t xml:space="preserve">; at 6-bit the DPWM step is</w:t>
-      </w:r>
-      <w:r>
-        <w:t xml:space="preserve"> </w:t>
-      </w:r>
-      <m:oMath>
-        <m:r>
-          <m:t>2</m:t>
-        </m:r>
-        <m:r>
-          <m:rPr>
-            <m:sty m:val="p"/>
-          </m:rPr>
-          <m:t>/</m:t>
-        </m:r>
-        <m:r>
-          <m:t>64</m:t>
-        </m:r>
-        <m:r>
-          <m:rPr>
-            <m:sty m:val="p"/>
-          </m:rPr>
-          <m:t>=</m:t>
-        </m:r>
-        <m:r>
-          <m:t>31.25</m:t>
-        </m:r>
-      </m:oMath>
-      <w:r>
-        <w:t xml:space="preserve"> mV of duty, which maps through the control-to-output gain into the observed 204.8 mV ripple. This is precisely the regime addressed by finer DPWM controller implementations</w:t>
-      </w:r>
-      <w:r>
-        <w:t xml:space="preserve"> </w:t>
-      </w:r>
-      <w:r>
-        <w:t xml:space="preserve"> </w:t>
-      </w:r>
-      <w:r>
-        <w:t xml:space="preserve">and by noise-shaping modulators</w:t>
-      </w:r>
-      <w:r>
-        <w:t xml:space="preserve"> </w:t>
-      </w:r>
-      <w:r>
-        <w:t xml:space="preserve">.</w:t>
-      </w:r>
-    </w:p>
-    <w:bookmarkStart w:id="35" w:name="fig:pwm"/>
-    <w:tbl>
-      <w:tblPr>
-        <w:tblStyle w:val="FigureTable"/>
-        <w:tblW w:type="auto" w:w="0"/>
-        <w:jc w:val="center"/>
-        <w:tblLook w:firstRow="0" w:lastRow="0" w:firstColumn="0" w:lastColumn="0"/>
-      </w:tblPr>
-      <w:tblGrid>
-        <w:gridCol w:w="7920"/>
-      </w:tblGrid>
-      <w:tr>
-        <w:tc>
-          <w:tcPr/>
-          <w:p>
-            <w:pPr>
-              <w:jc w:val="center"/>
-            </w:pPr>
-            <w:r>
-              <w:drawing>
-                <wp:inline>
-                  <wp:extent cx="4267200" cy="1302618"/>
-                  <wp:effectExtent b="0" l="0" r="0" t="0"/>
-                  <wp:docPr descr="image" title="" id="32" name="Picture"/>
-                  <a:graphic>
-                    <a:graphicData uri="http://schemas.openxmlformats.org/drawingml/2006/picture">
-                      <pic:pic>
-                        <pic:nvPicPr>
-                          <pic:cNvPr descr="/home/touhid/Documents/powerpaper/results/figures/fig4_pwm.png" id="33" name="Picture"/>
-                          <pic:cNvPicPr>
-                            <a:picLocks noChangeArrowheads="1" noChangeAspect="1"/>
-                          </pic:cNvPicPr>
-                        </pic:nvPicPr>
-                        <pic:blipFill>
-                          <a:blip r:embed="rId31"/>
-                          <a:stretch>
-                            <a:fillRect/>
-                          </a:stretch>
-                        </pic:blipFill>
-                        <pic:spPr bwMode="auto">
-                          <a:xfrm>
-                            <a:off x="0" y="0"/>
-                            <a:ext cx="4267200" cy="1302618"/>
-                          </a:xfrm>
-                          <a:prstGeom prst="rect">
-                            <a:avLst/>
-                          </a:prstGeom>
-                          <a:noFill/>
-                          <a:ln w="9525">
-                            <a:noFill/>
-                            <a:headEnd/>
-                            <a:tailEnd/>
-                          </a:ln>
-                        </pic:spPr>
-                      </pic:pic>
-                    </a:graphicData>
-                  </a:graphic>
-                </wp:inline>
-              </w:drawing>
-            </w:r>
-            <w:r>
-              <w:t xml:space="preserve"> </w:t>
-            </w:r>
-            <w:bookmarkStart w:id="34" w:name="fig:pwm"/>
-            <w:bookmarkEnd w:id="34"/>
-          </w:p>
-        </w:tc>
-      </w:tr>
-    </w:tbl>
-    <w:bookmarkEnd w:id="35"/>
-    <w:bookmarkEnd w:id="36"/>
-    <w:bookmarkStart w:id="41" w:name="combined-sweep-and-interactions"/>
-    <w:p>
-      <w:pPr>
-        <w:pStyle w:val="Heading2"/>
-      </w:pPr>
-      <w:r>
-        <w:t xml:space="preserve">Combined Sweep and Interactions</w:t>
-      </w:r>
-    </w:p>
-    <w:p>
-      <w:pPr>
-        <w:pStyle w:val="FirstParagraph"/>
-      </w:pPr>
-      <w:r>
-        <w:t xml:space="preserve">In the 48-run factorial sweep the worst configuration is</w:t>
-      </w:r>
-      <w:r>
-        <w:t xml:space="preserve"> </w:t>
-      </w:r>
-      <m:oMath>
-        <m:sSub>
-          <m:e>
-            <m:r>
-              <m:t>T</m:t>
-            </m:r>
-          </m:e>
-          <m:sub>
-            <m:r>
-              <m:t>s</m:t>
-            </m:r>
-          </m:sub>
-        </m:sSub>
-        <m:r>
-          <m:rPr>
-            <m:sty m:val="p"/>
-          </m:rPr>
-          <m:t>=</m:t>
-        </m:r>
-        <m:r>
-          <m:t>5</m:t>
-        </m:r>
-        <m:sSub>
-          <m:e>
-            <m:r>
-              <m:t>T</m:t>
-            </m:r>
-          </m:e>
-          <m:sub>
-            <m:r>
-              <m:t>s</m:t>
-            </m:r>
-            <m:r>
-              <m:t>w</m:t>
-            </m:r>
-          </m:sub>
-        </m:sSub>
-      </m:oMath>
-      <w:r>
-        <w:t xml:space="preserve">, ADC=8-bit, PWM=12-bit (normalized degradation score 1309.2): settling never completes within 60 ms, steady-state error</w:t>
-      </w:r>
-      <w:r>
-        <w:t xml:space="preserve"> </w:t>
-      </w:r>
-      <m:oMath>
-        <m:r>
-          <m:rPr>
-            <m:sty m:val="p"/>
-          </m:rPr>
-          <m:t>−</m:t>
-        </m:r>
-        <m:r>
-          <m:t>13.43</m:t>
-        </m:r>
-      </m:oMath>
-      <w:r>
-        <w:t xml:space="preserve"> V, limit-cycle amplitude 7.33 V, IAE 0.789, 127 075 DCM cycles. Fig. </w:t>
-      </w:r>
-      <w:hyperlink w:anchor="fig:perf">
-        <w:r>
-          <w:rPr>
-            <w:rStyle w:val="Hyperlink"/>
-          </w:rPr>
-          <w:t xml:space="preserve">6</w:t>
-        </w:r>
-      </w:hyperlink>
-      <w:r>
-        <w:t xml:space="preserve"> </w:t>
-      </w:r>
-      <w:r>
-        <w:t xml:space="preserve">classifies every combination against explicit thresholds (settling</w:t>
-      </w:r>
-      <w:r>
-        <w:t xml:space="preserve"> </w:t>
-      </w:r>
-      <m:oMath>
-        <m:r>
-          <m:rPr>
-            <m:sty m:val="p"/>
-          </m:rPr>
-          <m:t>≤</m:t>
-        </m:r>
-        <m:r>
-          <m:t>6</m:t>
-        </m:r>
-      </m:oMath>
-      <w:r>
-        <w:t xml:space="preserve"> ms,</w:t>
-      </w:r>
-      <w:r>
-        <w:t xml:space="preserve"> </w:t>
-      </w:r>
-      <m:oMath>
-        <m:r>
-          <m:rPr>
-            <m:sty m:val="p"/>
-          </m:rPr>
-          <m:t>|</m:t>
-        </m:r>
-        <m:sSub>
-          <m:e>
-            <m:r>
-              <m:t>e</m:t>
-            </m:r>
-          </m:e>
-          <m:sub>
-            <m:r>
-              <m:t>s</m:t>
-            </m:r>
-            <m:r>
-              <m:t>s</m:t>
-            </m:r>
-          </m:sub>
-        </m:sSub>
-        <m:r>
-          <m:rPr>
-            <m:sty m:val="p"/>
-          </m:rPr>
-          <m:t>|</m:t>
-        </m:r>
-        <m:r>
-          <m:rPr>
-            <m:sty m:val="p"/>
-          </m:rPr>
-          <m:t>≤</m:t>
-        </m:r>
-        <m:r>
-          <m:t>120</m:t>
-        </m:r>
-      </m:oMath>
-      <w:r>
-        <w:t xml:space="preserve"> mV, limit cycle</w:t>
-      </w:r>
-      <w:r>
-        <w:t xml:space="preserve"> </w:t>
-      </w:r>
-      <m:oMath>
-        <m:r>
-          <m:rPr>
-            <m:sty m:val="p"/>
-          </m:rPr>
-          <m:t>≤</m:t>
-        </m:r>
-        <m:r>
-          <m:t>120</m:t>
-        </m:r>
-      </m:oMath>
-      <w:r>
-        <w:t xml:space="preserve"> mV, overshoot, DCM) into excellent / acceptable / marginal / unusable. Sampled at</w:t>
-      </w:r>
-      <w:r>
-        <w:t xml:space="preserve"> </w:t>
-      </w:r>
-      <m:oMath>
-        <m:sSub>
-          <m:e>
-            <m:r>
-              <m:t>T</m:t>
-            </m:r>
-          </m:e>
-          <m:sub>
-            <m:r>
-              <m:t>s</m:t>
-            </m:r>
-          </m:sub>
-        </m:sSub>
-        <m:r>
-          <m:rPr>
-            <m:sty m:val="p"/>
-          </m:rPr>
-          <m:t>=</m:t>
-        </m:r>
-        <m:sSub>
-          <m:e>
-            <m:r>
-              <m:t>T</m:t>
-            </m:r>
-          </m:e>
-          <m:sub>
-            <m:r>
-              <m:t>s</m:t>
-            </m:r>
-            <m:r>
-              <m:t>w</m:t>
-            </m:r>
-          </m:sub>
-        </m:sSub>
-      </m:oMath>
-      <w:r>
-        <w:t xml:space="preserve">, 13 of 16 combinations are excellent and the rest acceptable; at</w:t>
-      </w:r>
-      <w:r>
-        <w:t xml:space="preserve"> </w:t>
-      </w:r>
-      <m:oMath>
-        <m:r>
-          <m:t>2</m:t>
-        </m:r>
-        <m:r>
-          <m:rPr>
-            <m:sty m:val="p"/>
-          </m:rPr>
-          <m:t>×</m:t>
-        </m:r>
-      </m:oMath>
-      <w:r>
-        <w:t xml:space="preserve"> </w:t>
-      </w:r>
-      <w:r>
-        <w:t xml:space="preserve">all are acceptable or marginal; at</w:t>
-      </w:r>
-      <w:r>
-        <w:t xml:space="preserve"> </w:t>
-      </w:r>
-      <m:oMath>
-        <m:r>
-          <m:t>5</m:t>
-        </m:r>
-        <m:r>
-          <m:rPr>
-            <m:sty m:val="p"/>
-          </m:rPr>
-          <m:t>×</m:t>
-        </m:r>
-      </m:oMath>
-      <w:r>
-        <w:t xml:space="preserve"> </w:t>
-      </w:r>
-      <w:r>
-        <w:t xml:space="preserve">all 16 are unusable.</w:t>
-      </w:r>
-    </w:p>
-    <w:bookmarkStart w:id="40" w:name="fig:perf"/>
+    <w:bookmarkStart w:id="29" w:name="fig:adc"/>
     <w:p>
       <w:pPr>
         <w:pStyle w:val="CaptionedFigure"/>
@@ -4689,18 +4214,18 @@
           <wp:inline>
             <wp:extent cx="4267200" cy="1302618"/>
             <wp:effectExtent b="0" l="0" r="0" t="0"/>
-            <wp:docPr descr="" title="" id="38" name="Picture"/>
+            <wp:docPr descr="" title="" id="27" name="Picture"/>
             <a:graphic>
               <a:graphicData uri="http://schemas.openxmlformats.org/drawingml/2006/picture">
                 <pic:pic>
                   <pic:nvPicPr>
-                    <pic:cNvPr descr="/home/touhid/Documents/powerpaper/results/figures/fig8_perf_map.png" id="39" name="Picture"/>
+                    <pic:cNvPr descr="/home/touhid/Documents/powerpaper/results/figures/fig3_adc.png" id="28" name="Picture"/>
                     <pic:cNvPicPr>
                       <a:picLocks noChangeArrowheads="1" noChangeAspect="1"/>
                     </pic:cNvPicPr>
                   </pic:nvPicPr>
                   <pic:blipFill>
-                    <a:blip r:embed="rId37"/>
+                    <a:blip r:embed="rId26"/>
                     <a:stretch>
                       <a:fillRect/>
                     </a:stretch>
@@ -4732,66 +4257,34 @@
         <w:pStyle w:val="ImageCaption"/>
       </w:pPr>
       <w:r>
-        <w:t xml:space="preserve">Performance map of the 48-run sweep. Thresholds: excellent (</w:t>
+        <w:t xml:space="preserve">ADC-resolution effect at</w:t>
+      </w:r>
+      <w:r>
+        <w:t xml:space="preserve"> </w:t>
       </w:r>
       <m:oMath>
         <m:sSub>
           <m:e>
             <m:r>
-              <m:t>t</m:t>
+              <m:t>T</m:t>
             </m:r>
           </m:e>
           <m:sub>
             <m:r>
               <m:t>s</m:t>
             </m:r>
-            <m:r>
-              <m:t>e</m:t>
-            </m:r>
-            <m:r>
-              <m:t>t</m:t>
-            </m:r>
-            <m:r>
-              <m:t>t</m:t>
-            </m:r>
-            <m:r>
-              <m:t>l</m:t>
-            </m:r>
-            <m:r>
-              <m:t>e</m:t>
-            </m:r>
           </m:sub>
         </m:sSub>
         <m:r>
           <m:rPr>
             <m:sty m:val="p"/>
           </m:rPr>
-          <m:t>≤</m:t>
-        </m:r>
-        <m:r>
-          <m:t>4</m:t>
-        </m:r>
-      </m:oMath>
-      <w:r>
-        <w:t xml:space="preserve"> </w:t>
-      </w:r>
-      <w:r>
-        <w:t xml:space="preserve">ms,</w:t>
-      </w:r>
-      <w:r>
-        <w:t xml:space="preserve"> </w:t>
-      </w:r>
-      <m:oMath>
-        <m:r>
-          <m:rPr>
-            <m:sty m:val="p"/>
-          </m:rPr>
-          <m:t>|</m:t>
+          <m:t>=</m:t>
         </m:r>
         <m:sSub>
           <m:e>
             <m:r>
-              <m:t>e</m:t>
+              <m:t>T</m:t>
             </m:r>
           </m:e>
           <m:sub>
@@ -4799,100 +4292,36 @@
               <m:t>s</m:t>
             </m:r>
             <m:r>
-              <m:t>s</m:t>
+              <m:t>w</m:t>
             </m:r>
           </m:sub>
         </m:sSub>
-        <m:r>
-          <m:rPr>
-            <m:sty m:val="p"/>
-          </m:rPr>
-          <m:t>|</m:t>
-        </m:r>
-        <m:r>
-          <m:rPr>
-            <m:sty m:val="p"/>
-          </m:rPr>
-          <m:t>≤</m:t>
-        </m:r>
-        <m:r>
-          <m:t>60</m:t>
-        </m:r>
-      </m:oMath>
-      <w:r>
-        <w:t xml:space="preserve"> </w:t>
-      </w:r>
-      <w:r>
-        <w:t xml:space="preserve">mV, LC</w:t>
-      </w:r>
-      <w:r>
-        <w:t xml:space="preserve"> </w:t>
-      </w:r>
-      <m:oMath>
-        <m:r>
-          <m:rPr>
-            <m:sty m:val="p"/>
-          </m:rPr>
-          <m:t>≤</m:t>
-        </m:r>
-        <m:r>
-          <m:t>60</m:t>
-        </m:r>
-      </m:oMath>
-      <w:r>
-        <w:t xml:space="preserve"> </w:t>
-      </w:r>
-      <w:r>
-        <w:t xml:space="preserve">mV, ov</w:t>
-      </w:r>
-      <w:r>
-        <w:t xml:space="preserve"> </w:t>
-      </w:r>
-      <m:oMath>
-        <m:r>
-          <m:rPr>
-            <m:sty m:val="p"/>
-          </m:rPr>
-          <m:t>≤</m:t>
-        </m:r>
-        <m:r>
-          <m:t>5</m:t>
-        </m:r>
-        <m:r>
-          <m:rPr>
-            <m:sty m:val="p"/>
-          </m:rPr>
-          <m:t>%</m:t>
-        </m:r>
-      </m:oMath>
-      <w:r>
-        <w:t xml:space="preserve">), acceptable (</w:t>
+      </m:oMath>
+      <w:r>
+        <w:t xml:space="preserve"> </w:t>
+      </w:r>
+      <w:r>
+        <w:t xml:space="preserve">(16-bit PWM): because</w:t>
+      </w:r>
+      <w:r>
+        <w:t xml:space="preserve"> </w:t>
       </w:r>
       <m:oMath>
         <m:sSub>
           <m:e>
             <m:r>
-              <m:t>t</m:t>
+              <m:t>V</m:t>
             </m:r>
           </m:e>
           <m:sub>
             <m:r>
-              <m:t>s</m:t>
+              <m:t>r</m:t>
             </m:r>
             <m:r>
               <m:t>e</m:t>
             </m:r>
             <m:r>
-              <m:t>t</m:t>
-            </m:r>
-            <m:r>
-              <m:t>t</m:t>
-            </m:r>
-            <m:r>
-              <m:t>l</m:t>
-            </m:r>
-            <m:r>
-              <m:t>e</m:t>
+              <m:t>f</m:t>
             </m:r>
           </m:sub>
         </m:sSub>
@@ -4900,178 +4329,175 @@
           <m:rPr>
             <m:sty m:val="p"/>
           </m:rPr>
-          <m:t>≤</m:t>
-        </m:r>
-        <m:r>
-          <m:t>6</m:t>
-        </m:r>
-      </m:oMath>
-      <w:r>
-        <w:t xml:space="preserve"> </w:t>
-      </w:r>
-      <w:r>
-        <w:t xml:space="preserve">ms,</w:t>
-      </w:r>
-      <w:r>
-        <w:t xml:space="preserve"> </w:t>
-      </w:r>
-      <m:oMath>
-        <m:r>
-          <m:rPr>
-            <m:sty m:val="p"/>
-          </m:rPr>
-          <m:t>|</m:t>
-        </m:r>
-        <m:sSub>
-          <m:e>
-            <m:r>
-              <m:t>e</m:t>
-            </m:r>
-          </m:e>
-          <m:sub>
-            <m:r>
-              <m:t>s</m:t>
-            </m:r>
-            <m:r>
-              <m:t>s</m:t>
-            </m:r>
-          </m:sub>
-        </m:sSub>
-        <m:r>
-          <m:rPr>
-            <m:sty m:val="p"/>
-          </m:rPr>
-          <m:t>|</m:t>
-        </m:r>
-        <m:r>
-          <m:rPr>
-            <m:sty m:val="p"/>
-          </m:rPr>
-          <m:t>,</m:t>
-        </m:r>
-        <m:r>
-          <m:rPr>
-            <m:nor/>
-            <m:sty m:val="p"/>
-          </m:rPr>
-          <m:t>LC</m:t>
-        </m:r>
-        <m:r>
-          <m:rPr>
-            <m:sty m:val="p"/>
-          </m:rPr>
-          <m:t>≤</m:t>
-        </m:r>
-        <m:r>
-          <m:t>120</m:t>
-        </m:r>
-      </m:oMath>
-      <w:r>
-        <w:t xml:space="preserve"> </w:t>
-      </w:r>
-      <w:r>
-        <w:t xml:space="preserve">mV), marginal, unusable (</w:t>
-      </w:r>
-      <m:oMath>
-        <m:sSub>
-          <m:e>
-            <m:r>
-              <m:t>t</m:t>
-            </m:r>
-          </m:e>
-          <m:sub>
-            <m:r>
-              <m:t>s</m:t>
-            </m:r>
-            <m:r>
-              <m:t>e</m:t>
-            </m:r>
-            <m:r>
-              <m:t>t</m:t>
-            </m:r>
-            <m:r>
-              <m:t>t</m:t>
-            </m:r>
-            <m:r>
-              <m:t>l</m:t>
-            </m:r>
-            <m:r>
-              <m:t>e</m:t>
-            </m:r>
-          </m:sub>
-        </m:sSub>
-        <m:r>
-          <m:rPr>
-            <m:sty m:val="p"/>
-          </m:rPr>
-          <m:t>≥</m:t>
-        </m:r>
-        <m:r>
-          <m:t>50</m:t>
-        </m:r>
-      </m:oMath>
-      <w:r>
-        <w:t xml:space="preserve"> </w:t>
-      </w:r>
-      <w:r>
-        <w:t xml:space="preserve">ms).</w:t>
+          <m:t>=</m:t>
+        </m:r>
+        <m:r>
+          <m:rPr>
+            <m:sty m:val="p"/>
+          </m:rPr>
+          <m:t>−</m:t>
+        </m:r>
+        <m:r>
+          <m:t>F</m:t>
+        </m:r>
+        <m:r>
+          <m:t>S</m:t>
+        </m:r>
+        <m:r>
+          <m:rPr>
+            <m:sty m:val="p"/>
+          </m:rPr>
+          <m:t>/</m:t>
+        </m:r>
+        <m:r>
+          <m:t>2</m:t>
+        </m:r>
+      </m:oMath>
+      <w:r>
+        <w:t xml:space="preserve"> </w:t>
+      </w:r>
+      <w:r>
+        <w:t xml:space="preserve">is an exact code, the 8-bit and 6-bit ADCs lock onto it, hiding steady-state error while worsening the transient (overshoot and settling).</w:t>
       </w:r>
     </w:p>
-    <w:bookmarkEnd w:id="40"/>
+    <w:bookmarkEnd w:id="29"/>
     <w:p>
       <w:pPr>
         <w:pStyle w:val="BodyText"/>
       </w:pPr>
       <w:r>
-        <w:t xml:space="preserve">The worst configuration is far worse than any individual degradation:</w:t>
-      </w:r>
-      <w:r>
-        <w:t xml:space="preserve"> </w:t>
-      </w:r>
-      <m:oMath>
-        <m:r>
-          <m:rPr>
-            <m:sty m:val="p"/>
-          </m:rPr>
-          <m:t>−</m:t>
-        </m:r>
-        <m:r>
-          <m:t>13.43</m:t>
-        </m:r>
-      </m:oMath>
-      <w:r>
-        <w:t xml:space="preserve"> V versus the</w:t>
-      </w:r>
-      <w:r>
-        <w:t xml:space="preserve"> </w:t>
-      </w:r>
-      <m:oMath>
-        <m:r>
-          <m:rPr>
-            <m:sty m:val="p"/>
-          </m:rPr>
-          <m:t>−</m:t>
-        </m:r>
-        <m:r>
-          <m:t>13.07</m:t>
-        </m:r>
-      </m:oMath>
-      <w:r>
-        <w:t xml:space="preserve"> V of sampling alone, but with 127 075 DCM cycles and a 7.33 V limit cycle that the sampling-only run does not exhibit. The super-additivity is quantitative: with</w:t>
-      </w:r>
-      <w:r>
-        <w:t xml:space="preserve"> </w:t>
-      </w:r>
-      <m:oMath>
-        <m:r>
-          <m:t>D</m:t>
-        </m:r>
-      </m:oMath>
-      <w:r>
-        <w:t xml:space="preserve"> </w:t>
-      </w:r>
-      <w:r>
-        <w:t xml:space="preserve">the normalized partial degradation (steady-state error, IAE, and limit cycle relative to the ideal digital controller), the individual terms are</w:t>
+        <w:t xml:space="preserve">PWM resolution below 8 bits dominates the limit cycle (Fig. </w:t>
+      </w:r>
+      <w:hyperlink w:anchor="fig:pwm">
+        <w:r>
+          <w:rPr>
+            <w:rStyle w:val="Hyperlink"/>
+          </w:rPr>
+          <w:t xml:space="preserve">5</w:t>
+        </w:r>
+      </w:hyperlink>
+      <w:r>
+        <w:t xml:space="preserve">): 6-bit PWM adds a 204.8 mV ripple versus</w:t>
+      </w:r>
+      <w:r>
+        <w:t xml:space="preserve"> </w:t>
+      </w:r>
+      <m:oMath>
+        <m:r>
+          <m:rPr>
+            <m:sty m:val="p"/>
+          </m:rPr>
+          <m:t>≈</m:t>
+        </m:r>
+      </m:oMath>
+      <w:r>
+        <w:t xml:space="preserve">39.5 mV at 12/10/8-bit. Duty quantization is the direct source of steady-state ripple, as predicted by limit-cycle analysis</w:t>
+      </w:r>
+      <w:r>
+        <w:t xml:space="preserve"> </w:t>
+      </w:r>
+      <w:r>
+        <w:t xml:space="preserve">; at 6-bit the DPWM step is</w:t>
+      </w:r>
+      <w:r>
+        <w:t xml:space="preserve"> </w:t>
+      </w:r>
+      <m:oMath>
+        <m:r>
+          <m:t>2</m:t>
+        </m:r>
+        <m:r>
+          <m:rPr>
+            <m:sty m:val="p"/>
+          </m:rPr>
+          <m:t>/</m:t>
+        </m:r>
+        <m:r>
+          <m:t>64</m:t>
+        </m:r>
+        <m:r>
+          <m:rPr>
+            <m:sty m:val="p"/>
+          </m:rPr>
+          <m:t>=</m:t>
+        </m:r>
+        <m:r>
+          <m:t>31.25</m:t>
+        </m:r>
+      </m:oMath>
+      <w:r>
+        <w:t xml:space="preserve"> mV of duty, which maps through the control-to-output gain into the observed 204.8 mV ripple. This is precisely the regime addressed by finer DPWM controller implementations</w:t>
+      </w:r>
+      <w:r>
+        <w:t xml:space="preserve"> </w:t>
+      </w:r>
+      <w:r>
+        <w:t xml:space="preserve"> </w:t>
+      </w:r>
+      <w:r>
+        <w:t xml:space="preserve">and by noise-shaping modulators</w:t>
+      </w:r>
+      <w:r>
+        <w:t xml:space="preserve"> </w:t>
+      </w:r>
+      <w:r>
+        <w:t xml:space="preserve">.</w:t>
+      </w:r>
+    </w:p>
+    <w:bookmarkStart w:id="33" w:name="fig:pwm"/>
+    <w:p>
+      <w:pPr>
+        <w:pStyle w:val="CaptionedFigure"/>
+      </w:pPr>
+      <w:r>
+        <w:drawing>
+          <wp:inline>
+            <wp:extent cx="4267200" cy="1302618"/>
+            <wp:effectExtent b="0" l="0" r="0" t="0"/>
+            <wp:docPr descr="" title="" id="31" name="Picture"/>
+            <a:graphic>
+              <a:graphicData uri="http://schemas.openxmlformats.org/drawingml/2006/picture">
+                <pic:pic>
+                  <pic:nvPicPr>
+                    <pic:cNvPr descr="/home/touhid/Documents/powerpaper/results/figures/fig4_pwm.png" id="32" name="Picture"/>
+                    <pic:cNvPicPr>
+                      <a:picLocks noChangeArrowheads="1" noChangeAspect="1"/>
+                    </pic:cNvPicPr>
+                  </pic:nvPicPr>
+                  <pic:blipFill>
+                    <a:blip r:embed="rId30"/>
+                    <a:stretch>
+                      <a:fillRect/>
+                    </a:stretch>
+                  </pic:blipFill>
+                  <pic:spPr bwMode="auto">
+                    <a:xfrm>
+                      <a:off x="0" y="0"/>
+                      <a:ext cx="4267200" cy="1302618"/>
+                    </a:xfrm>
+                    <a:prstGeom prst="rect">
+                      <a:avLst/>
+                    </a:prstGeom>
+                    <a:noFill/>
+                    <a:ln w="9525">
+                      <a:noFill/>
+                      <a:headEnd/>
+                      <a:tailEnd/>
+                    </a:ln>
+                  </pic:spPr>
+                </pic:pic>
+              </a:graphicData>
+            </a:graphic>
+          </wp:inline>
+        </w:drawing>
+      </w:r>
+    </w:p>
+    <w:p>
+      <w:pPr>
+        <w:pStyle w:val="ImageCaption"/>
+      </w:pPr>
+      <w:r>
+        <w:t xml:space="preserve">PWM-resolution effect at</w:t>
       </w:r>
       <w:r>
         <w:t xml:space="preserve"> </w:t>
@@ -5080,126 +4506,75 @@
         <m:sSub>
           <m:e>
             <m:r>
-              <m:t>D</m:t>
+              <m:t>T</m:t>
             </m:r>
           </m:e>
           <m:sub>
             <m:r>
               <m:t>s</m:t>
             </m:r>
-            <m:r>
-              <m:t>a</m:t>
-            </m:r>
-            <m:r>
-              <m:t>m</m:t>
-            </m:r>
-            <m:r>
-              <m:t>p</m:t>
-            </m:r>
-            <m:r>
-              <m:t>l</m:t>
-            </m:r>
-            <m:r>
-              <m:t>i</m:t>
-            </m:r>
-            <m:r>
-              <m:t>n</m:t>
-            </m:r>
-            <m:r>
-              <m:t>g</m:t>
-            </m:r>
           </m:sub>
         </m:sSub>
         <m:r>
           <m:rPr>
             <m:sty m:val="p"/>
           </m:rPr>
-          <m:t>(</m:t>
-        </m:r>
-        <m:r>
-          <m:t>5</m:t>
-        </m:r>
-        <m:r>
-          <m:rPr>
-            <m:sty m:val="p"/>
-          </m:rPr>
-          <m:t>×</m:t>
-        </m:r>
-        <m:r>
-          <m:rPr>
-            <m:sty m:val="p"/>
-          </m:rPr>
-          <m:t>)</m:t>
-        </m:r>
-        <m:r>
-          <m:rPr>
-            <m:sty m:val="p"/>
-          </m:rPr>
           <m:t>=</m:t>
         </m:r>
-        <m:r>
-          <m:t>1141.6</m:t>
-        </m:r>
-      </m:oMath>
-      <w:r>
-        <w:t xml:space="preserve">,</w:t>
-      </w:r>
-      <w:r>
-        <w:t xml:space="preserve"> </w:t>
-      </w:r>
-      <m:oMath>
         <m:sSub>
           <m:e>
             <m:r>
-              <m:t>D</m:t>
+              <m:t>T</m:t>
             </m:r>
           </m:e>
           <m:sub>
             <m:r>
-              <m:t>A</m:t>
-            </m:r>
-            <m:r>
-              <m:t>D</m:t>
-            </m:r>
-            <m:r>
-              <m:t>C</m:t>
+              <m:t>s</m:t>
+            </m:r>
+            <m:r>
+              <m:t>w</m:t>
             </m:r>
           </m:sub>
         </m:sSub>
-        <m:r>
-          <m:rPr>
-            <m:sty m:val="p"/>
-          </m:rPr>
-          <m:t>(</m:t>
-        </m:r>
-        <m:r>
-          <m:t>8</m:t>
-        </m:r>
-        <m:r>
-          <m:rPr>
-            <m:nor/>
-            <m:sty m:val="p"/>
-          </m:rPr>
-          <m:t>-bit</m:t>
-        </m:r>
-        <m:r>
-          <m:rPr>
-            <m:sty m:val="p"/>
-          </m:rPr>
-          <m:t>)</m:t>
-        </m:r>
-        <m:r>
-          <m:rPr>
-            <m:sty m:val="p"/>
-          </m:rPr>
-          <m:t>=</m:t>
-        </m:r>
-        <m:r>
-          <m:t>0.6</m:t>
-        </m:r>
-      </m:oMath>
-      <w:r>
-        <w:t xml:space="preserve">, and</w:t>
+      </m:oMath>
+      <w:r>
+        <w:t xml:space="preserve"> </w:t>
+      </w:r>
+      <w:r>
+        <w:t xml:space="preserve">(16-bit ADC): duty quantization below 8 bits is the dominant limit-cycle source, adding a 204.8 mV ripple at 6-bit PWM versus</w:t>
+      </w:r>
+      <w:r>
+        <w:t xml:space="preserve"> </w:t>
+      </w:r>
+      <m:oMath>
+        <m:r>
+          <m:rPr>
+            <m:sty m:val="p"/>
+          </m:rPr>
+          <m:t>≈</m:t>
+        </m:r>
+      </m:oMath>
+      <w:r>
+        <w:t xml:space="preserve">39.5 mV at 12/10/8-bit.</w:t>
+      </w:r>
+    </w:p>
+    <w:bookmarkEnd w:id="33"/>
+    <w:bookmarkEnd w:id="34"/>
+    <w:bookmarkStart w:id="39" w:name="combined-sweep-and-interactions"/>
+    <w:p>
+      <w:pPr>
+        <w:pStyle w:val="Heading2"/>
+      </w:pPr>
+      <w:r>
+        <w:t xml:space="preserve">Combined Sweep and Interactions</w:t>
+      </w:r>
+    </w:p>
+    <w:p>
+      <w:pPr>
+        <w:pStyle w:val="FirstParagraph"/>
+      </w:pPr>
+      <w:r>
+        <w:t xml:space="preserve">In the 48-run factorial sweep the worst configuration is</w:t>
       </w:r>
       <w:r>
         <w:t xml:space="preserve"> </w:t>
@@ -5208,18 +4583,12 @@
         <m:sSub>
           <m:e>
             <m:r>
-              <m:t>D</m:t>
+              <m:t>T</m:t>
             </m:r>
           </m:e>
           <m:sub>
             <m:r>
-              <m:t>P</m:t>
-            </m:r>
-            <m:r>
-              <m:t>W</m:t>
-            </m:r>
-            <m:r>
-              <m:t>M</m:t>
+              <m:t>s</m:t>
             </m:r>
           </m:sub>
         </m:sSub>
@@ -5227,71 +4596,834 @@
           <m:rPr>
             <m:sty m:val="p"/>
           </m:rPr>
-          <m:t>(</m:t>
-        </m:r>
-        <m:r>
-          <m:t>12</m:t>
-        </m:r>
-        <m:r>
-          <m:rPr>
-            <m:nor/>
-            <m:sty m:val="p"/>
-          </m:rPr>
-          <m:t>-bit</m:t>
-        </m:r>
-        <m:r>
-          <m:rPr>
-            <m:sty m:val="p"/>
-          </m:rPr>
-          <m:t>)</m:t>
-        </m:r>
-        <m:r>
-          <m:rPr>
-            <m:sty m:val="p"/>
-          </m:rPr>
           <m:t>=</m:t>
         </m:r>
         <m:r>
-          <m:t>0.0</m:t>
-        </m:r>
-      </m:oMath>
-      <w:r>
-        <w:t xml:space="preserve">; the additive prediction is 1142.2, whereas the measured combined degradation is</w:t>
-      </w:r>
-      <w:r>
-        <w:t xml:space="preserve"> </w:t>
-      </w:r>
-      <m:oMath>
+          <m:t>5</m:t>
+        </m:r>
         <m:sSub>
           <m:e>
             <m:r>
-              <m:t>D</m:t>
+              <m:t>T</m:t>
             </m:r>
           </m:e>
           <m:sub>
             <m:r>
-              <m:t>t</m:t>
-            </m:r>
-            <m:r>
-              <m:t>o</m:t>
-            </m:r>
-            <m:r>
-              <m:t>t</m:t>
-            </m:r>
-            <m:r>
-              <m:t>a</m:t>
-            </m:r>
-            <m:r>
-              <m:t>l</m:t>
+              <m:t>s</m:t>
+            </m:r>
+            <m:r>
+              <m:t>w</m:t>
             </m:r>
           </m:sub>
         </m:sSub>
+      </m:oMath>
+      <w:r>
+        <w:t xml:space="preserve">, ADC=8-bit, PWM=12-bit (normalized degradation score 1309.2): settling never completes within 60 ms, steady-state error</w:t>
+      </w:r>
+      <w:r>
+        <w:t xml:space="preserve"> </w:t>
+      </w:r>
+      <m:oMath>
+        <m:r>
+          <m:rPr>
+            <m:sty m:val="p"/>
+          </m:rPr>
+          <m:t>−</m:t>
+        </m:r>
+        <m:r>
+          <m:t>13.43</m:t>
+        </m:r>
+      </m:oMath>
+      <w:r>
+        <w:t xml:space="preserve"> V, limit-cycle amplitude 7.33 V, IAE 0.789, 127 075 DCM cycles. Fig. </w:t>
+      </w:r>
+      <w:hyperlink w:anchor="fig:perf">
+        <w:r>
+          <w:rPr>
+            <w:rStyle w:val="Hyperlink"/>
+          </w:rPr>
+          <w:t xml:space="preserve">6</w:t>
+        </w:r>
+      </w:hyperlink>
+      <w:r>
+        <w:t xml:space="preserve"> </w:t>
+      </w:r>
+      <w:r>
+        <w:t xml:space="preserve">classifies every combination against explicit thresholds (settling</w:t>
+      </w:r>
+      <w:r>
+        <w:t xml:space="preserve"> </w:t>
+      </w:r>
+      <m:oMath>
+        <m:r>
+          <m:rPr>
+            <m:sty m:val="p"/>
+          </m:rPr>
+          <m:t>≤</m:t>
+        </m:r>
+        <m:r>
+          <m:t>6</m:t>
+        </m:r>
+      </m:oMath>
+      <w:r>
+        <w:t xml:space="preserve"> ms,</w:t>
+      </w:r>
+      <w:r>
+        <w:t xml:space="preserve"> </w:t>
+      </w:r>
+      <m:oMath>
+        <m:r>
+          <m:rPr>
+            <m:sty m:val="p"/>
+          </m:rPr>
+          <m:t>|</m:t>
+        </m:r>
+        <m:sSub>
+          <m:e>
+            <m:r>
+              <m:t>e</m:t>
+            </m:r>
+          </m:e>
+          <m:sub>
+            <m:r>
+              <m:t>s</m:t>
+            </m:r>
+            <m:r>
+              <m:t>s</m:t>
+            </m:r>
+          </m:sub>
+        </m:sSub>
+        <m:r>
+          <m:rPr>
+            <m:sty m:val="p"/>
+          </m:rPr>
+          <m:t>|</m:t>
+        </m:r>
+        <m:r>
+          <m:rPr>
+            <m:sty m:val="p"/>
+          </m:rPr>
+          <m:t>≤</m:t>
+        </m:r>
+        <m:r>
+          <m:t>120</m:t>
+        </m:r>
+      </m:oMath>
+      <w:r>
+        <w:t xml:space="preserve"> mV, limit cycle</w:t>
+      </w:r>
+      <w:r>
+        <w:t xml:space="preserve"> </w:t>
+      </w:r>
+      <m:oMath>
+        <m:r>
+          <m:rPr>
+            <m:sty m:val="p"/>
+          </m:rPr>
+          <m:t>≤</m:t>
+        </m:r>
+        <m:r>
+          <m:t>120</m:t>
+        </m:r>
+      </m:oMath>
+      <w:r>
+        <w:t xml:space="preserve"> mV, overshoot, DCM) into excellent / acceptable / marginal / unusable. Sampled at</w:t>
+      </w:r>
+      <w:r>
+        <w:t xml:space="preserve"> </w:t>
+      </w:r>
+      <m:oMath>
+        <m:sSub>
+          <m:e>
+            <m:r>
+              <m:t>T</m:t>
+            </m:r>
+          </m:e>
+          <m:sub>
+            <m:r>
+              <m:t>s</m:t>
+            </m:r>
+          </m:sub>
+        </m:sSub>
         <m:r>
           <m:rPr>
             <m:sty m:val="p"/>
           </m:rPr>
           <m:t>=</m:t>
         </m:r>
+        <m:sSub>
+          <m:e>
+            <m:r>
+              <m:t>T</m:t>
+            </m:r>
+          </m:e>
+          <m:sub>
+            <m:r>
+              <m:t>s</m:t>
+            </m:r>
+            <m:r>
+              <m:t>w</m:t>
+            </m:r>
+          </m:sub>
+        </m:sSub>
+      </m:oMath>
+      <w:r>
+        <w:t xml:space="preserve">, 13 of 16 combinations are excellent and the rest acceptable; at</w:t>
+      </w:r>
+      <w:r>
+        <w:t xml:space="preserve"> </w:t>
+      </w:r>
+      <m:oMath>
+        <m:r>
+          <m:t>2</m:t>
+        </m:r>
+        <m:r>
+          <m:rPr>
+            <m:sty m:val="p"/>
+          </m:rPr>
+          <m:t>×</m:t>
+        </m:r>
+      </m:oMath>
+      <w:r>
+        <w:t xml:space="preserve"> </w:t>
+      </w:r>
+      <w:r>
+        <w:t xml:space="preserve">all are acceptable or marginal; at</w:t>
+      </w:r>
+      <w:r>
+        <w:t xml:space="preserve"> </w:t>
+      </w:r>
+      <m:oMath>
+        <m:r>
+          <m:t>5</m:t>
+        </m:r>
+        <m:r>
+          <m:rPr>
+            <m:sty m:val="p"/>
+          </m:rPr>
+          <m:t>×</m:t>
+        </m:r>
+      </m:oMath>
+      <w:r>
+        <w:t xml:space="preserve"> </w:t>
+      </w:r>
+      <w:r>
+        <w:t xml:space="preserve">all 16 are unusable.</w:t>
+      </w:r>
+    </w:p>
+    <w:bookmarkStart w:id="38" w:name="fig:perf"/>
+    <w:p>
+      <w:pPr>
+        <w:pStyle w:val="CaptionedFigure"/>
+      </w:pPr>
+      <w:r>
+        <w:drawing>
+          <wp:inline>
+            <wp:extent cx="4267200" cy="1302618"/>
+            <wp:effectExtent b="0" l="0" r="0" t="0"/>
+            <wp:docPr descr="" title="" id="36" name="Picture"/>
+            <a:graphic>
+              <a:graphicData uri="http://schemas.openxmlformats.org/drawingml/2006/picture">
+                <pic:pic>
+                  <pic:nvPicPr>
+                    <pic:cNvPr descr="/home/touhid/Documents/powerpaper/results/figures/fig8_perf_map.png" id="37" name="Picture"/>
+                    <pic:cNvPicPr>
+                      <a:picLocks noChangeArrowheads="1" noChangeAspect="1"/>
+                    </pic:cNvPicPr>
+                  </pic:nvPicPr>
+                  <pic:blipFill>
+                    <a:blip r:embed="rId35"/>
+                    <a:stretch>
+                      <a:fillRect/>
+                    </a:stretch>
+                  </pic:blipFill>
+                  <pic:spPr bwMode="auto">
+                    <a:xfrm>
+                      <a:off x="0" y="0"/>
+                      <a:ext cx="4267200" cy="1302618"/>
+                    </a:xfrm>
+                    <a:prstGeom prst="rect">
+                      <a:avLst/>
+                    </a:prstGeom>
+                    <a:noFill/>
+                    <a:ln w="9525">
+                      <a:noFill/>
+                      <a:headEnd/>
+                      <a:tailEnd/>
+                    </a:ln>
+                  </pic:spPr>
+                </pic:pic>
+              </a:graphicData>
+            </a:graphic>
+          </wp:inline>
+        </w:drawing>
+      </w:r>
+    </w:p>
+    <w:p>
+      <w:pPr>
+        <w:pStyle w:val="ImageCaption"/>
+      </w:pPr>
+      <w:r>
+        <w:t xml:space="preserve">Performance map of the 48-run sweep. Thresholds: excellent (</w:t>
+      </w:r>
+      <m:oMath>
+        <m:sSub>
+          <m:e>
+            <m:r>
+              <m:t>t</m:t>
+            </m:r>
+          </m:e>
+          <m:sub>
+            <m:r>
+              <m:t>s</m:t>
+            </m:r>
+            <m:r>
+              <m:t>e</m:t>
+            </m:r>
+            <m:r>
+              <m:t>t</m:t>
+            </m:r>
+            <m:r>
+              <m:t>t</m:t>
+            </m:r>
+            <m:r>
+              <m:t>l</m:t>
+            </m:r>
+            <m:r>
+              <m:t>e</m:t>
+            </m:r>
+          </m:sub>
+        </m:sSub>
+        <m:r>
+          <m:rPr>
+            <m:sty m:val="p"/>
+          </m:rPr>
+          <m:t>≤</m:t>
+        </m:r>
+        <m:r>
+          <m:t>4</m:t>
+        </m:r>
+      </m:oMath>
+      <w:r>
+        <w:t xml:space="preserve"> </w:t>
+      </w:r>
+      <w:r>
+        <w:t xml:space="preserve">ms,</w:t>
+      </w:r>
+      <w:r>
+        <w:t xml:space="preserve"> </w:t>
+      </w:r>
+      <m:oMath>
+        <m:r>
+          <m:rPr>
+            <m:sty m:val="p"/>
+          </m:rPr>
+          <m:t>|</m:t>
+        </m:r>
+        <m:sSub>
+          <m:e>
+            <m:r>
+              <m:t>e</m:t>
+            </m:r>
+          </m:e>
+          <m:sub>
+            <m:r>
+              <m:t>s</m:t>
+            </m:r>
+            <m:r>
+              <m:t>s</m:t>
+            </m:r>
+          </m:sub>
+        </m:sSub>
+        <m:r>
+          <m:rPr>
+            <m:sty m:val="p"/>
+          </m:rPr>
+          <m:t>|</m:t>
+        </m:r>
+        <m:r>
+          <m:rPr>
+            <m:sty m:val="p"/>
+          </m:rPr>
+          <m:t>≤</m:t>
+        </m:r>
+        <m:r>
+          <m:t>60</m:t>
+        </m:r>
+      </m:oMath>
+      <w:r>
+        <w:t xml:space="preserve"> </w:t>
+      </w:r>
+      <w:r>
+        <w:t xml:space="preserve">mV, LC</w:t>
+      </w:r>
+      <w:r>
+        <w:t xml:space="preserve"> </w:t>
+      </w:r>
+      <m:oMath>
+        <m:r>
+          <m:rPr>
+            <m:sty m:val="p"/>
+          </m:rPr>
+          <m:t>≤</m:t>
+        </m:r>
+        <m:r>
+          <m:t>60</m:t>
+        </m:r>
+      </m:oMath>
+      <w:r>
+        <w:t xml:space="preserve"> </w:t>
+      </w:r>
+      <w:r>
+        <w:t xml:space="preserve">mV, ov</w:t>
+      </w:r>
+      <w:r>
+        <w:t xml:space="preserve"> </w:t>
+      </w:r>
+      <m:oMath>
+        <m:r>
+          <m:rPr>
+            <m:sty m:val="p"/>
+          </m:rPr>
+          <m:t>≤</m:t>
+        </m:r>
+        <m:r>
+          <m:t>5</m:t>
+        </m:r>
+        <m:r>
+          <m:rPr>
+            <m:sty m:val="p"/>
+          </m:rPr>
+          <m:t>%</m:t>
+        </m:r>
+      </m:oMath>
+      <w:r>
+        <w:t xml:space="preserve">), acceptable (</w:t>
+      </w:r>
+      <m:oMath>
+        <m:sSub>
+          <m:e>
+            <m:r>
+              <m:t>t</m:t>
+            </m:r>
+          </m:e>
+          <m:sub>
+            <m:r>
+              <m:t>s</m:t>
+            </m:r>
+            <m:r>
+              <m:t>e</m:t>
+            </m:r>
+            <m:r>
+              <m:t>t</m:t>
+            </m:r>
+            <m:r>
+              <m:t>t</m:t>
+            </m:r>
+            <m:r>
+              <m:t>l</m:t>
+            </m:r>
+            <m:r>
+              <m:t>e</m:t>
+            </m:r>
+          </m:sub>
+        </m:sSub>
+        <m:r>
+          <m:rPr>
+            <m:sty m:val="p"/>
+          </m:rPr>
+          <m:t>≤</m:t>
+        </m:r>
+        <m:r>
+          <m:t>6</m:t>
+        </m:r>
+      </m:oMath>
+      <w:r>
+        <w:t xml:space="preserve"> </w:t>
+      </w:r>
+      <w:r>
+        <w:t xml:space="preserve">ms,</w:t>
+      </w:r>
+      <w:r>
+        <w:t xml:space="preserve"> </w:t>
+      </w:r>
+      <m:oMath>
+        <m:r>
+          <m:rPr>
+            <m:sty m:val="p"/>
+          </m:rPr>
+          <m:t>|</m:t>
+        </m:r>
+        <m:sSub>
+          <m:e>
+            <m:r>
+              <m:t>e</m:t>
+            </m:r>
+          </m:e>
+          <m:sub>
+            <m:r>
+              <m:t>s</m:t>
+            </m:r>
+            <m:r>
+              <m:t>s</m:t>
+            </m:r>
+          </m:sub>
+        </m:sSub>
+        <m:r>
+          <m:rPr>
+            <m:sty m:val="p"/>
+          </m:rPr>
+          <m:t>|</m:t>
+        </m:r>
+        <m:r>
+          <m:rPr>
+            <m:sty m:val="p"/>
+          </m:rPr>
+          <m:t>,</m:t>
+        </m:r>
+        <m:r>
+          <m:rPr>
+            <m:nor/>
+            <m:sty m:val="p"/>
+          </m:rPr>
+          <m:t>LC</m:t>
+        </m:r>
+        <m:r>
+          <m:rPr>
+            <m:sty m:val="p"/>
+          </m:rPr>
+          <m:t>≤</m:t>
+        </m:r>
+        <m:r>
+          <m:t>120</m:t>
+        </m:r>
+      </m:oMath>
+      <w:r>
+        <w:t xml:space="preserve"> </w:t>
+      </w:r>
+      <w:r>
+        <w:t xml:space="preserve">mV), marginal, unusable (</w:t>
+      </w:r>
+      <m:oMath>
+        <m:sSub>
+          <m:e>
+            <m:r>
+              <m:t>t</m:t>
+            </m:r>
+          </m:e>
+          <m:sub>
+            <m:r>
+              <m:t>s</m:t>
+            </m:r>
+            <m:r>
+              <m:t>e</m:t>
+            </m:r>
+            <m:r>
+              <m:t>t</m:t>
+            </m:r>
+            <m:r>
+              <m:t>t</m:t>
+            </m:r>
+            <m:r>
+              <m:t>l</m:t>
+            </m:r>
+            <m:r>
+              <m:t>e</m:t>
+            </m:r>
+          </m:sub>
+        </m:sSub>
+        <m:r>
+          <m:rPr>
+            <m:sty m:val="p"/>
+          </m:rPr>
+          <m:t>≥</m:t>
+        </m:r>
+        <m:r>
+          <m:t>50</m:t>
+        </m:r>
+      </m:oMath>
+      <w:r>
+        <w:t xml:space="preserve"> </w:t>
+      </w:r>
+      <w:r>
+        <w:t xml:space="preserve">ms).</w:t>
+      </w:r>
+    </w:p>
+    <w:bookmarkEnd w:id="38"/>
+    <w:p>
+      <w:pPr>
+        <w:pStyle w:val="BodyText"/>
+      </w:pPr>
+      <w:r>
+        <w:t xml:space="preserve">The worst configuration is far worse than any individual degradation:</w:t>
+      </w:r>
+      <w:r>
+        <w:t xml:space="preserve"> </w:t>
+      </w:r>
+      <m:oMath>
+        <m:r>
+          <m:rPr>
+            <m:sty m:val="p"/>
+          </m:rPr>
+          <m:t>−</m:t>
+        </m:r>
+        <m:r>
+          <m:t>13.43</m:t>
+        </m:r>
+      </m:oMath>
+      <w:r>
+        <w:t xml:space="preserve"> V versus the</w:t>
+      </w:r>
+      <w:r>
+        <w:t xml:space="preserve"> </w:t>
+      </w:r>
+      <m:oMath>
+        <m:r>
+          <m:rPr>
+            <m:sty m:val="p"/>
+          </m:rPr>
+          <m:t>−</m:t>
+        </m:r>
+        <m:r>
+          <m:t>13.07</m:t>
+        </m:r>
+      </m:oMath>
+      <w:r>
+        <w:t xml:space="preserve"> V of sampling alone, but with 127 075 DCM cycles and a 7.33 V limit cycle that the sampling-only run does not exhibit. The super-additivity is quantitative: with</w:t>
+      </w:r>
+      <w:r>
+        <w:t xml:space="preserve"> </w:t>
+      </w:r>
+      <m:oMath>
+        <m:r>
+          <m:t>D</m:t>
+        </m:r>
+      </m:oMath>
+      <w:r>
+        <w:t xml:space="preserve"> </w:t>
+      </w:r>
+      <w:r>
+        <w:t xml:space="preserve">the normalized partial degradation (steady-state error, IAE, and limit cycle relative to the ideal digital controller), the individual terms are</w:t>
+      </w:r>
+      <w:r>
+        <w:t xml:space="preserve"> </w:t>
+      </w:r>
+      <m:oMath>
+        <m:sSub>
+          <m:e>
+            <m:r>
+              <m:t>D</m:t>
+            </m:r>
+          </m:e>
+          <m:sub>
+            <m:r>
+              <m:t>s</m:t>
+            </m:r>
+            <m:r>
+              <m:t>a</m:t>
+            </m:r>
+            <m:r>
+              <m:t>m</m:t>
+            </m:r>
+            <m:r>
+              <m:t>p</m:t>
+            </m:r>
+            <m:r>
+              <m:t>l</m:t>
+            </m:r>
+            <m:r>
+              <m:t>i</m:t>
+            </m:r>
+            <m:r>
+              <m:t>n</m:t>
+            </m:r>
+            <m:r>
+              <m:t>g</m:t>
+            </m:r>
+          </m:sub>
+        </m:sSub>
+        <m:r>
+          <m:rPr>
+            <m:sty m:val="p"/>
+          </m:rPr>
+          <m:t>(</m:t>
+        </m:r>
+        <m:r>
+          <m:t>5</m:t>
+        </m:r>
+        <m:r>
+          <m:rPr>
+            <m:sty m:val="p"/>
+          </m:rPr>
+          <m:t>×</m:t>
+        </m:r>
+        <m:r>
+          <m:rPr>
+            <m:sty m:val="p"/>
+          </m:rPr>
+          <m:t>)</m:t>
+        </m:r>
+        <m:r>
+          <m:rPr>
+            <m:sty m:val="p"/>
+          </m:rPr>
+          <m:t>=</m:t>
+        </m:r>
+        <m:r>
+          <m:t>1141.6</m:t>
+        </m:r>
+      </m:oMath>
+      <w:r>
+        <w:t xml:space="preserve">,</w:t>
+      </w:r>
+      <w:r>
+        <w:t xml:space="preserve"> </w:t>
+      </w:r>
+      <m:oMath>
+        <m:sSub>
+          <m:e>
+            <m:r>
+              <m:t>D</m:t>
+            </m:r>
+          </m:e>
+          <m:sub>
+            <m:r>
+              <m:t>A</m:t>
+            </m:r>
+            <m:r>
+              <m:t>D</m:t>
+            </m:r>
+            <m:r>
+              <m:t>C</m:t>
+            </m:r>
+          </m:sub>
+        </m:sSub>
+        <m:r>
+          <m:rPr>
+            <m:sty m:val="p"/>
+          </m:rPr>
+          <m:t>(</m:t>
+        </m:r>
+        <m:r>
+          <m:t>8</m:t>
+        </m:r>
+        <m:r>
+          <m:rPr>
+            <m:nor/>
+            <m:sty m:val="p"/>
+          </m:rPr>
+          <m:t>-bit</m:t>
+        </m:r>
+        <m:r>
+          <m:rPr>
+            <m:sty m:val="p"/>
+          </m:rPr>
+          <m:t>)</m:t>
+        </m:r>
+        <m:r>
+          <m:rPr>
+            <m:sty m:val="p"/>
+          </m:rPr>
+          <m:t>=</m:t>
+        </m:r>
+        <m:r>
+          <m:t>0.6</m:t>
+        </m:r>
+      </m:oMath>
+      <w:r>
+        <w:t xml:space="preserve">, and</w:t>
+      </w:r>
+      <w:r>
+        <w:t xml:space="preserve"> </w:t>
+      </w:r>
+      <m:oMath>
+        <m:sSub>
+          <m:e>
+            <m:r>
+              <m:t>D</m:t>
+            </m:r>
+          </m:e>
+          <m:sub>
+            <m:r>
+              <m:t>P</m:t>
+            </m:r>
+            <m:r>
+              <m:t>W</m:t>
+            </m:r>
+            <m:r>
+              <m:t>M</m:t>
+            </m:r>
+          </m:sub>
+        </m:sSub>
+        <m:r>
+          <m:rPr>
+            <m:sty m:val="p"/>
+          </m:rPr>
+          <m:t>(</m:t>
+        </m:r>
+        <m:r>
+          <m:t>12</m:t>
+        </m:r>
+        <m:r>
+          <m:rPr>
+            <m:nor/>
+            <m:sty m:val="p"/>
+          </m:rPr>
+          <m:t>-bit</m:t>
+        </m:r>
+        <m:r>
+          <m:rPr>
+            <m:sty m:val="p"/>
+          </m:rPr>
+          <m:t>)</m:t>
+        </m:r>
+        <m:r>
+          <m:rPr>
+            <m:sty m:val="p"/>
+          </m:rPr>
+          <m:t>=</m:t>
+        </m:r>
+        <m:r>
+          <m:t>0.0</m:t>
+        </m:r>
+      </m:oMath>
+      <w:r>
+        <w:t xml:space="preserve">; the additive prediction is 1142.2, whereas the measured combined degradation is</w:t>
+      </w:r>
+      <w:r>
+        <w:t xml:space="preserve"> </w:t>
+      </w:r>
+      <m:oMath>
+        <m:sSub>
+          <m:e>
+            <m:r>
+              <m:t>D</m:t>
+            </m:r>
+          </m:e>
+          <m:sub>
+            <m:r>
+              <m:t>t</m:t>
+            </m:r>
+            <m:r>
+              <m:t>o</m:t>
+            </m:r>
+            <m:r>
+              <m:t>t</m:t>
+            </m:r>
+            <m:r>
+              <m:t>a</m:t>
+            </m:r>
+            <m:r>
+              <m:t>l</m:t>
+            </m:r>
+          </m:sub>
+        </m:sSub>
+        <m:r>
+          <m:rPr>
+            <m:sty m:val="p"/>
+          </m:rPr>
+          <m:t>=</m:t>
+        </m:r>
         <m:r>
           <m:t>1309.2</m:t>
         </m:r>
@@ -5340,8 +5472,8 @@
         <w:t xml:space="preserve">). The 8-bit ADC coincidence, harmless alone, converts a slowly sampling loop into deep limit-cycle chatter once the 12-bit PWM pulls the operating point across the coincidence.</w:t>
       </w:r>
     </w:p>
-    <w:bookmarkEnd w:id="41"/>
-    <w:bookmarkStart w:id="47" w:name="disturbance-rejection"/>
+    <w:bookmarkEnd w:id="39"/>
+    <w:bookmarkStart w:id="44" w:name="disturbance-rejection"/>
     <w:p>
       <w:pPr>
         <w:pStyle w:val="Heading2"/>
@@ -5833,78 +5965,178 @@
         </w:tc>
       </w:tr>
     </w:tbl>
-    <w:bookmarkStart w:id="46" w:name="fig:dist"/>
-    <w:tbl>
-      <w:tblPr>
-        <w:tblStyle w:val="FigureTable"/>
-        <w:tblW w:type="auto" w:w="0"/>
-        <w:jc w:val="center"/>
-        <w:tblLook w:firstRow="0" w:lastRow="0" w:firstColumn="0" w:lastColumn="0"/>
-      </w:tblPr>
-      <w:tblGrid>
-        <w:gridCol w:w="7920"/>
-      </w:tblGrid>
-      <w:tr>
-        <w:tc>
-          <w:tcPr/>
-          <w:p>
-            <w:pPr>
-              <w:jc w:val="center"/>
-            </w:pPr>
-            <w:r>
-              <w:drawing>
-                <wp:inline>
-                  <wp:extent cx="4267200" cy="1517226"/>
-                  <wp:effectExtent b="0" l="0" r="0" t="0"/>
-                  <wp:docPr descr="image" title="" id="43" name="Picture"/>
-                  <a:graphic>
-                    <a:graphicData uri="http://schemas.openxmlformats.org/drawingml/2006/picture">
-                      <pic:pic>
-                        <pic:nvPicPr>
-                          <pic:cNvPr descr="/home/touhid/Documents/powerpaper/results/figures/fig7_disturbances.png" id="44" name="Picture"/>
-                          <pic:cNvPicPr>
-                            <a:picLocks noChangeArrowheads="1" noChangeAspect="1"/>
-                          </pic:cNvPicPr>
-                        </pic:nvPicPr>
-                        <pic:blipFill>
-                          <a:blip r:embed="rId42"/>
-                          <a:stretch>
-                            <a:fillRect/>
-                          </a:stretch>
-                        </pic:blipFill>
-                        <pic:spPr bwMode="auto">
-                          <a:xfrm>
-                            <a:off x="0" y="0"/>
-                            <a:ext cx="4267200" cy="1517226"/>
-                          </a:xfrm>
-                          <a:prstGeom prst="rect">
-                            <a:avLst/>
-                          </a:prstGeom>
-                          <a:noFill/>
-                          <a:ln w="9525">
-                            <a:noFill/>
-                            <a:headEnd/>
-                            <a:tailEnd/>
-                          </a:ln>
-                        </pic:spPr>
-                      </pic:pic>
-                    </a:graphicData>
-                  </a:graphic>
-                </wp:inline>
-              </w:drawing>
-            </w:r>
-            <w:r>
-              <w:t xml:space="preserve"> </w:t>
-            </w:r>
-            <w:bookmarkStart w:id="45" w:name="fig:dist"/>
-            <w:bookmarkEnd w:id="45"/>
-          </w:p>
-        </w:tc>
-      </w:tr>
-    </w:tbl>
-    <w:bookmarkEnd w:id="46"/>
-    <w:bookmarkEnd w:id="47"/>
-    <w:bookmarkStart w:id="48" w:name="operating-point-robustness"/>
+    <w:bookmarkStart w:id="43" w:name="fig:dist"/>
+    <w:p>
+      <w:pPr>
+        <w:pStyle w:val="CaptionedFigure"/>
+      </w:pPr>
+      <w:r>
+        <w:drawing>
+          <wp:inline>
+            <wp:extent cx="4267200" cy="1517226"/>
+            <wp:effectExtent b="0" l="0" r="0" t="0"/>
+            <wp:docPr descr="" title="" id="41" name="Picture"/>
+            <a:graphic>
+              <a:graphicData uri="http://schemas.openxmlformats.org/drawingml/2006/picture">
+                <pic:pic>
+                  <pic:nvPicPr>
+                    <pic:cNvPr descr="/home/touhid/Documents/powerpaper/results/figures/fig7_disturbances.png" id="42" name="Picture"/>
+                    <pic:cNvPicPr>
+                      <a:picLocks noChangeArrowheads="1" noChangeAspect="1"/>
+                    </pic:cNvPicPr>
+                  </pic:nvPicPr>
+                  <pic:blipFill>
+                    <a:blip r:embed="rId40"/>
+                    <a:stretch>
+                      <a:fillRect/>
+                    </a:stretch>
+                  </pic:blipFill>
+                  <pic:spPr bwMode="auto">
+                    <a:xfrm>
+                      <a:off x="0" y="0"/>
+                      <a:ext cx="4267200" cy="1517226"/>
+                    </a:xfrm>
+                    <a:prstGeom prst="rect">
+                      <a:avLst/>
+                    </a:prstGeom>
+                    <a:noFill/>
+                    <a:ln w="9525">
+                      <a:noFill/>
+                      <a:headEnd/>
+                      <a:tailEnd/>
+                    </a:ln>
+                  </pic:spPr>
+                </pic:pic>
+              </a:graphicData>
+            </a:graphic>
+          </wp:inline>
+        </w:drawing>
+      </w:r>
+    </w:p>
+    <w:p>
+      <w:pPr>
+        <w:pStyle w:val="ImageCaption"/>
+      </w:pPr>
+      <w:r>
+        <w:t xml:space="preserve">Disturbance response: 2\%-settling trajectories for input step</w:t>
+      </w:r>
+      <w:r>
+        <w:t xml:space="preserve"> </w:t>
+      </w:r>
+      <m:oMath>
+        <m:sSub>
+          <m:e>
+            <m:r>
+              <m:t>V</m:t>
+            </m:r>
+          </m:e>
+          <m:sub>
+            <m:r>
+              <m:t>i</m:t>
+            </m:r>
+            <m:r>
+              <m:t>n</m:t>
+            </m:r>
+          </m:sub>
+        </m:sSub>
+        <m:r>
+          <m:rPr>
+            <m:sty m:val="p"/>
+          </m:rPr>
+          <m:t>:</m:t>
+        </m:r>
+        <m:r>
+          <m:t>12</m:t>
+        </m:r>
+        <m:r>
+          <m:rPr>
+            <m:sty m:val="p"/>
+          </m:rPr>
+          <m:t>→</m:t>
+        </m:r>
+        <m:r>
+          <m:t>9</m:t>
+        </m:r>
+      </m:oMath>
+      <w:r>
+        <w:t xml:space="preserve"> V and load step</w:t>
+      </w:r>
+      <w:r>
+        <w:t xml:space="preserve"> </w:t>
+      </w:r>
+      <m:oMath>
+        <m:r>
+          <m:t>R</m:t>
+        </m:r>
+        <m:r>
+          <m:rPr>
+            <m:sty m:val="p"/>
+          </m:rPr>
+          <m:t>:</m:t>
+        </m:r>
+        <m:r>
+          <m:t>10</m:t>
+        </m:r>
+        <m:r>
+          <m:rPr>
+            <m:sty m:val="p"/>
+          </m:rPr>
+          <m:t>→</m:t>
+        </m:r>
+        <m:r>
+          <m:t>5</m:t>
+        </m:r>
+        <m:r>
+          <m:t> </m:t>
+        </m:r>
+        <m:r>
+          <m:rPr>
+            <m:sty m:val="p"/>
+          </m:rPr>
+          <m:t>Ω</m:t>
+        </m:r>
+      </m:oMath>
+      <w:r>
+        <w:t xml:space="preserve"> </w:t>
+      </w:r>
+      <w:r>
+        <w:t xml:space="preserve">at</w:t>
+      </w:r>
+      <w:r>
+        <w:t xml:space="preserve"> </w:t>
+      </w:r>
+      <m:oMath>
+        <m:r>
+          <m:t>t</m:t>
+        </m:r>
+        <m:r>
+          <m:rPr>
+            <m:sty m:val="p"/>
+          </m:rPr>
+          <m:t>=</m:t>
+        </m:r>
+        <m:r>
+          <m:t>60</m:t>
+        </m:r>
+      </m:oMath>
+      <w:r>
+        <w:t xml:space="preserve"> ms on the continuous baseline, ideal digital controller, and the worst combined configuration (5</w:t>
+      </w:r>
+      <m:oMath>
+        <m:r>
+          <m:rPr>
+            <m:sty m:val="p"/>
+          </m:rPr>
+          <m:t>×</m:t>
+        </m:r>
+      </m:oMath>
+      <w:r>
+        <w:t xml:space="preserve">, 8-bit ADC, 12-bit PWM).</w:t>
+      </w:r>
+    </w:p>
+    <w:bookmarkEnd w:id="43"/>
+    <w:bookmarkEnd w:id="44"/>
+    <w:bookmarkStart w:id="45" w:name="operating-point-robustness"/>
     <w:p>
       <w:pPr>
         <w:pStyle w:val="Heading2"/>
@@ -6370,9 +6602,9 @@
         </w:tc>
       </w:tr>
     </w:tbl>
-    <w:bookmarkEnd w:id="48"/>
-    <w:bookmarkEnd w:id="49"/>
-    <w:bookmarkStart w:id="50" w:name="conclusion"/>
+    <w:bookmarkEnd w:id="45"/>
+    <w:bookmarkEnd w:id="46"/>
+    <w:bookmarkStart w:id="47" w:name="conclusion"/>
     <w:p>
       <w:pPr>
         <w:pStyle w:val="Heading1"/>
@@ -6423,8 +6655,8 @@
         <w:t xml:space="preserve">s control-loop latency dominated by ADC acquisition, 1.3\% CPU utilization, and an acquisition noise floor that masks the quantization effects the simulation predicts. Slow sampling and fast sampling with added latency behave differently even on a plant with no dynamics of its own, confirming that the two implementation effects are not interchangeable. A lightweight quantization-aware adaptive PID switches between achievable schedules using a measured error/activity indicator with hysteresis, holds steady-state error below 40 mV, and cuts controller-update frequency by 84\%. The contributions are the integration, characterization, and experimental resource-aware validation of these effects on one platform, rather than any single technique in isolation. The on-chip ADC’s acquisition time is the binding constraint of this platform; future work with a faster external ADC or a real power stage would place the controller inside the simulated critical region and test directly whether the adaptive framework remains necessary at higher rates.</w:t>
       </w:r>
     </w:p>
-    <w:bookmarkEnd w:id="50"/>
-    <w:bookmarkStart w:id="51" w:name="acknowledgment"/>
+    <w:bookmarkEnd w:id="47"/>
+    <w:bookmarkStart w:id="48" w:name="acknowledgment"/>
     <w:p>
       <w:pPr>
         <w:pStyle w:val="Heading1"/>
@@ -6441,8 +6673,8 @@
         <w:t xml:space="preserve">The authors thank Tareq Anwar Shikdar for guidance; no external funding was received.</w:t>
       </w:r>
     </w:p>
-    <w:bookmarkEnd w:id="51"/>
-    <w:bookmarkStart w:id="76" w:name="experimental-closed-loop-platform"/>
+    <w:bookmarkEnd w:id="48"/>
+    <w:bookmarkStart w:id="73" w:name="experimental-closed-loop-platform"/>
     <w:p>
       <w:pPr>
         <w:pStyle w:val="Heading1"/>
@@ -6617,7 +6849,7 @@
         <w:t xml:space="preserve">exactly at the half-scale code, at which the paper’s ADC coincidence is active. The plant is intentionally not a real power stage: it is an emulated first-order plant whose dynamics are the pin-gain plus the EMA sensor filter, so the platform isolates the digital-implementation effects (sampling, quantization, latency, adaptation) that are the subject of this study. The controller executes velocity-form PID with the paper’s quantizers, and the loop is deterministic and periodic, driven by the achievable sample period rather than a free-running software loop.</w:t>
       </w:r>
     </w:p>
-    <w:bookmarkStart w:id="56" w:name="measured-control-loop-latency"/>
+    <w:bookmarkStart w:id="53" w:name="measured-control-loop-latency"/>
     <w:p>
       <w:pPr>
         <w:pStyle w:val="Heading2"/>
@@ -6663,7 +6895,7 @@
       </w:r>
       <m:oMath>
         <m:r>
-          <m:t>88.6</m:t>
+          <m:t>89.1</m:t>
         </m:r>
         <m:r>
           <m:t> </m:t>
@@ -6690,14 +6922,14 @@
         </m:r>
       </m:oMath>
       <w:r>
-        <w:t xml:space="preserve">s, and even the fastest single read never completes faster than</w:t>
-      </w:r>
-      <w:r>
-        <w:t xml:space="preserve"> </w:t>
-      </w:r>
-      <m:oMath>
-        <m:r>
-          <m:t>59.4</m:t>
+        <w:t xml:space="preserve">s, and the fastest single read never completes sooner than</w:t>
+      </w:r>
+      <w:r>
+        <w:t xml:space="preserve"> </w:t>
+      </w:r>
+      <m:oMath>
+        <m:r>
+          <m:t>59.5</m:t>
         </m:r>
         <m:r>
           <m:t> </m:t>
@@ -6914,35 +7146,12 @@
         </m:r>
       </m:oMath>
       <w:r>
-        <w:t xml:space="preserve">s switching period), and useful oversampled loops sit at</w:t>
-      </w:r>
-      <w:r>
-        <w:t xml:space="preserve"> </w:t>
-      </w:r>
-      <m:oMath>
-        <m:r>
-          <m:t>500</m:t>
-        </m:r>
-        <m:r>
-          <m:rPr>
-            <m:sty m:val="p"/>
-          </m:rPr>
-          <m:t>×</m:t>
-        </m:r>
-      </m:oMath>
-      <w:r>
-        <w:t xml:space="preserve">-</w:t>
-      </w:r>
-      <m:oMath>
-        <m:r>
-          <m:t>680</m:t>
-        </m:r>
-        <m:r>
-          <m:rPr>
-            <m:sty m:val="p"/>
-          </m:rPr>
-          <m:t>×</m:t>
-        </m:r>
+        <w:t xml:space="preserve">s switching period), and useful oversampled loops reach several hundred times</w:t>
+      </w:r>
+      <w:r>
+        <w:t xml:space="preserve"> </w:t>
+      </w:r>
+      <m:oMath>
         <m:sSub>
           <m:e>
             <m:r>
@@ -6960,10 +7169,39 @@
         </m:sSub>
       </m:oMath>
       <w:r>
-        <w:t xml:space="preserve">. The hardware therefore operates entirely in the sampling regime the simulation identifies as unstable or critically degraded; this is the central constraint that motivates the adaptive controller presented in the final subsection.</w:t>
+        <w:t xml:space="preserve"> </w:t>
+      </w:r>
+      <w:r>
+        <w:t xml:space="preserve">(up to</w:t>
+      </w:r>
+      <w:r>
+        <w:t xml:space="preserve"> </w:t>
+      </w:r>
+      <m:oMath>
+        <m:r>
+          <m:rPr>
+            <m:sty m:val="p"/>
+          </m:rPr>
+          <m:t>≈</m:t>
+        </m:r>
+        <m:r>
+          <m:t>680</m:t>
+        </m:r>
+        <m:r>
+          <m:rPr>
+            <m:sty m:val="p"/>
+          </m:rPr>
+          <m:t>×</m:t>
+        </m:r>
+      </m:oMath>
+      <w:r>
+        <w:t xml:space="preserve"> </w:t>
+      </w:r>
+      <w:r>
+        <w:t xml:space="preserve">at N=64). The hardware therefore operates entirely in the sampling regime the simulation identifies as unstable or critically degraded; this is the central constraint that motivates the adaptive controller presented in the final subsection.</w:t>
       </w:r>
     </w:p>
-    <w:bookmarkStart w:id="55" w:name="fig:lat"/>
+    <w:bookmarkStart w:id="52" w:name="fig:lat"/>
     <w:p>
       <w:pPr>
         <w:pStyle w:val="CaptionedFigure"/>
@@ -6973,18 +7211,18 @@
           <wp:inline>
             <wp:extent cx="4222781" cy="2389386"/>
             <wp:effectExtent b="0" l="0" r="0" t="0"/>
-            <wp:docPr descr="" title="" id="53" name="Picture"/>
+            <wp:docPr descr="" title="" id="50" name="Picture"/>
             <a:graphic>
               <a:graphicData uri="http://schemas.openxmlformats.org/drawingml/2006/picture">
                 <pic:pic>
                   <pic:nvPicPr>
-                    <pic:cNvPr descr="/home/touhid/Documents/powerpaper/esp32_feas/results/embedded/fig_v2_latency.png" id="54" name="Picture"/>
+                    <pic:cNvPr descr="/home/touhid/Documents/powerpaper/esp32_feas/results/embedded/fig_v2_latency.png" id="51" name="Picture"/>
                     <pic:cNvPicPr>
                       <a:picLocks noChangeArrowheads="1" noChangeAspect="1"/>
                     </pic:cNvPicPr>
                   </pic:nvPicPr>
                   <pic:blipFill>
-                    <a:blip r:embed="rId52"/>
+                    <a:blip r:embed="rId49"/>
                     <a:stretch>
                       <a:fillRect/>
                     </a:stretch>
@@ -7051,7 +7289,7 @@
         <w:t xml:space="preserve">s. Log scale.</w:t>
       </w:r>
     </w:p>
-    <w:bookmarkEnd w:id="55"/>
+    <w:bookmarkEnd w:id="52"/>
     <w:tbl>
       <w:tblPr>
         <w:tblStyle w:val="Table"/>
@@ -7109,7 +7347,29 @@
               <w:jc w:val="left"/>
             </w:pPr>
             <w:r>
-              <w:t xml:space="preserve">60.0 µs avg / 148 µs max</w:t>
+              <w:t xml:space="preserve">60.0</w:t>
+            </w:r>
+            <w:r>
+              <w:t xml:space="preserve"> </w:t>
+            </w:r>
+            <m:oMath>
+              <m:r>
+                <m:t>μ</m:t>
+              </m:r>
+            </m:oMath>
+            <w:r>
+              <w:t xml:space="preserve">s avg / 125.5</w:t>
+            </w:r>
+            <w:r>
+              <w:t xml:space="preserve"> </w:t>
+            </w:r>
+            <m:oMath>
+              <m:r>
+                <m:t>μ</m:t>
+              </m:r>
+            </m:oMath>
+            <w:r>
+              <w:t xml:space="preserve">s max</w:t>
             </w:r>
           </w:p>
         </w:tc>
@@ -7135,7 +7395,18 @@
               <w:jc w:val="left"/>
             </w:pPr>
             <w:r>
-              <w:t xml:space="preserve">88.6 µs avg</w:t>
+              <w:t xml:space="preserve">89.1</w:t>
+            </w:r>
+            <w:r>
+              <w:t xml:space="preserve"> </w:t>
+            </w:r>
+            <m:oMath>
+              <m:r>
+                <m:t>μ</m:t>
+              </m:r>
+            </m:oMath>
+            <w:r>
+              <w:t xml:space="preserve">s avg</w:t>
             </w:r>
           </w:p>
         </w:tc>
@@ -7161,7 +7432,18 @@
               <w:jc w:val="left"/>
             </w:pPr>
             <w:r>
-              <w:t xml:space="preserve">0.86 µs avg</w:t>
+              <w:t xml:space="preserve">0.86</w:t>
+            </w:r>
+            <w:r>
+              <w:t xml:space="preserve"> </w:t>
+            </w:r>
+            <m:oMath>
+              <m:r>
+                <m:t>μ</m:t>
+              </m:r>
+            </m:oMath>
+            <w:r>
+              <w:t xml:space="preserve">s avg</w:t>
             </w:r>
           </w:p>
         </w:tc>
@@ -7187,7 +7469,18 @@
               <w:jc w:val="left"/>
             </w:pPr>
             <w:r>
-              <w:t xml:space="preserve">6.8 µs avg</w:t>
+              <w:t xml:space="preserve">6.8</w:t>
+            </w:r>
+            <w:r>
+              <w:t xml:space="preserve"> </w:t>
+            </w:r>
+            <m:oMath>
+              <m:r>
+                <m:t>μ</m:t>
+              </m:r>
+            </m:oMath>
+            <w:r>
+              <w:t xml:space="preserve">s avg</w:t>
             </w:r>
           </w:p>
         </w:tc>
@@ -7213,7 +7506,18 @@
               <w:jc w:val="left"/>
             </w:pPr>
             <w:r>
-              <w:t xml:space="preserve">4.2 µs avg</w:t>
+              <w:t xml:space="preserve">4.2</w:t>
+            </w:r>
+            <w:r>
+              <w:t xml:space="preserve"> </w:t>
+            </w:r>
+            <m:oMath>
+              <m:r>
+                <m:t>μ</m:t>
+              </m:r>
+            </m:oMath>
+            <w:r>
+              <w:t xml:space="preserve">s avg</w:t>
             </w:r>
           </w:p>
         </w:tc>
@@ -7238,8 +7542,27 @@
               <w:pStyle w:val="Compact"/>
               <w:jc w:val="left"/>
             </w:pPr>
-            <w:r>
-              <w:t xml:space="preserve">≈65 µs</w:t>
+            <m:oMath>
+              <m:r>
+                <m:rPr>
+                  <m:sty m:val="p"/>
+                </m:rPr>
+                <m:t>≈</m:t>
+              </m:r>
+            </m:oMath>
+            <w:r>
+              <w:t xml:space="preserve">65</w:t>
+            </w:r>
+            <w:r>
+              <w:t xml:space="preserve"> </w:t>
+            </w:r>
+            <m:oMath>
+              <m:r>
+                <m:t>μ</m:t>
+              </m:r>
+            </m:oMath>
+            <w:r>
+              <w:t xml:space="preserve">s</w:t>
             </w:r>
           </w:p>
         </w:tc>
@@ -7290,8 +7613,33 @@
               <w:pStyle w:val="Compact"/>
               <w:jc w:val="left"/>
             </w:pPr>
-            <w:r>
-              <w:t xml:space="preserve">≈6 × Tsw</w:t>
+            <m:oMath>
+              <m:r>
+                <m:rPr>
+                  <m:sty m:val="p"/>
+                </m:rPr>
+                <m:t>≈</m:t>
+              </m:r>
+            </m:oMath>
+            <w:r>
+              <w:t xml:space="preserve">6</w:t>
+            </w:r>
+            <w:r>
+              <w:t xml:space="preserve"> </w:t>
+            </w:r>
+            <m:oMath>
+              <m:r>
+                <m:rPr>
+                  <m:sty m:val="p"/>
+                </m:rPr>
+                <m:t>×</m:t>
+              </m:r>
+            </m:oMath>
+            <w:r>
+              <w:t xml:space="preserve"> </w:t>
+            </w:r>
+            <w:r>
+              <w:t xml:space="preserve">Tsw</w:t>
             </w:r>
           </w:p>
         </w:tc>
@@ -7305,26 +7653,51 @@
               <w:jc w:val="left"/>
             </w:pPr>
             <w:r>
-              <w:t xml:space="preserve">Useful oversampled loop</w:t>
-            </w:r>
-          </w:p>
-        </w:tc>
-        <w:tc>
-          <w:tcPr/>
-          <w:p>
-            <w:pPr>
-              <w:pStyle w:val="Compact"/>
-              <w:jc w:val="left"/>
-            </w:pPr>
-            <w:r>
-              <w:t xml:space="preserve">500–680 × Tsw</w:t>
+              <w:t xml:space="preserve">Oversampled loop (N=64)</w:t>
+            </w:r>
+          </w:p>
+        </w:tc>
+        <w:tc>
+          <w:tcPr/>
+          <w:p>
+            <w:pPr>
+              <w:pStyle w:val="Compact"/>
+              <w:jc w:val="left"/>
+            </w:pPr>
+            <m:oMath>
+              <m:r>
+                <m:rPr>
+                  <m:sty m:val="p"/>
+                </m:rPr>
+                <m:t>≈</m:t>
+              </m:r>
+            </m:oMath>
+            <w:r>
+              <w:t xml:space="preserve">680</w:t>
+            </w:r>
+            <w:r>
+              <w:t xml:space="preserve"> </w:t>
+            </w:r>
+            <m:oMath>
+              <m:r>
+                <m:rPr>
+                  <m:sty m:val="p"/>
+                </m:rPr>
+                <m:t>×</m:t>
+              </m:r>
+            </m:oMath>
+            <w:r>
+              <w:t xml:space="preserve"> </w:t>
+            </w:r>
+            <w:r>
+              <w:t xml:space="preserve">Tsw</w:t>
             </w:r>
           </w:p>
         </w:tc>
       </w:tr>
     </w:tbl>
-    <w:bookmarkEnd w:id="56"/>
-    <w:bookmarkStart w:id="61" w:name="effective-resolution-sweep"/>
+    <w:bookmarkEnd w:id="53"/>
+    <w:bookmarkStart w:id="58" w:name="effective-resolution-sweep"/>
     <w:p>
       <w:pPr>
         <w:pStyle w:val="Heading2"/>
@@ -7363,7 +7736,7 @@
         </m:r>
       </m:oMath>
       <w:r>
-        <w:t xml:space="preserve">35 mV in every cell, and the per-cell IAE variation (6.8-8.3) is within the run-to-run noise of the platform. The simulation predicts that coarse PWM adds a 200-300 mV limit cycle and that coarse ADC shifts the lock-on point. On the ESP32-S3 these effects do not appear, because the acquisition noise floor is far larger: the averaged read at this schedule carries</w:t>
+        <w:t xml:space="preserve">18 mV in every cell, and the per-cell IAE variation (6.8-8.3) is within the run-to-run noise of the platform. The simulation predicts that coarse PWM adds a 200-300 mV limit cycle and that coarse ADC shifts the lock-on point. On the ESP32-S3 these effects do not appear, because the acquisition noise floor is far larger: the averaged read at this schedule carries</w:t>
       </w:r>
       <w:r>
         <w:t xml:space="preserve"> </w:t>
@@ -7377,7 +7750,7 @@
         </m:r>
       </m:oMath>
       <w:r>
-        <w:t xml:space="preserve">0.95 V rms in the output frame (measured</w:t>
+        <w:t xml:space="preserve">1.5 V rms in the output frame (measured</w:t>
       </w:r>
       <w:r>
         <w:t xml:space="preserve"> </w:t>
@@ -7452,10 +7825,24 @@
         <w:t xml:space="preserve"> </w:t>
       </w:r>
       <w:r>
-        <w:t xml:space="preserve">into the output frame), and the closed-loop ripple remains at 1.2-1.9 V peak-to-peak regardless of resolution. The quantization effects predicted by simulation are real, but at every schedule this platform can sustain they are masked by the ADC noise floor. This is the central measurement-level result: quantization limits are observable only after the acquisition noise is reduced below the quantization step, which the on-chip ADC at these schedules cannot provide.</w:t>
+        <w:t xml:space="preserve">into the output frame, giving</w:t>
+      </w:r>
+      <w:r>
+        <w:t xml:space="preserve"> </w:t>
+      </w:r>
+      <m:oMath>
+        <m:r>
+          <m:rPr>
+            <m:sty m:val="p"/>
+          </m:rPr>
+          <m:t>≈</m:t>
+        </m:r>
+      </m:oMath>
+      <w:r>
+        <w:t xml:space="preserve">1.5 V at N=64), and the closed-loop ripple remains at 1.6-1.9 V peak-to-peak regardless of resolution. The quantization effects predicted by simulation are real, but at every schedule this platform can sustain they are masked by the ADC noise floor. This is the central measurement-level result: quantization limits are observable only after the acquisition noise is reduced below the quantization step, which the on-chip ADC at these schedules cannot provide.</w:t>
       </w:r>
     </w:p>
-    <w:bookmarkStart w:id="60" w:name="fig:effres"/>
+    <w:bookmarkStart w:id="57" w:name="fig:effres"/>
     <w:p>
       <w:pPr>
         <w:pStyle w:val="CaptionedFigure"/>
@@ -7465,18 +7852,18 @@
           <wp:inline>
             <wp:extent cx="4267200" cy="1493520"/>
             <wp:effectExtent b="0" l="0" r="0" t="0"/>
-            <wp:docPr descr="" title="" id="58" name="Picture"/>
+            <wp:docPr descr="" title="" id="55" name="Picture"/>
             <a:graphic>
               <a:graphicData uri="http://schemas.openxmlformats.org/drawingml/2006/picture">
                 <pic:pic>
                   <pic:nvPicPr>
-                    <pic:cNvPr descr="/home/touhid/Documents/powerpaper/esp32_feas/results/embedded/fig_v2_effres.png" id="59" name="Picture"/>
+                    <pic:cNvPr descr="/home/touhid/Documents/powerpaper/esp32_feas/results/embedded/fig_v2_effres.png" id="56" name="Picture"/>
                     <pic:cNvPicPr>
                       <a:picLocks noChangeArrowheads="1" noChangeAspect="1"/>
                     </pic:cNvPicPr>
                   </pic:nvPicPr>
                   <pic:blipFill>
-                    <a:blip r:embed="rId57"/>
+                    <a:blip r:embed="rId54"/>
                     <a:stretch>
                       <a:fillRect/>
                     </a:stretch>
@@ -7511,9 +7898,9 @@
         <w:t xml:space="preserve">Effective-resolution sweep at the N=64 achievable schedule. IAE (left: ADC sweep at 8-bit PWM; right: PWM sweep at 8-bit ADC) is flat within the noise band: the acquisition noise floor masks the quantization effects the switched-model simulation predicts.</w:t>
       </w:r>
     </w:p>
-    <w:bookmarkEnd w:id="60"/>
-    <w:bookmarkEnd w:id="61"/>
-    <w:bookmarkStart w:id="70" w:name="Xf6161db447219dbfd8cafe99c2b7b8b3c3ed412"/>
+    <w:bookmarkEnd w:id="57"/>
+    <w:bookmarkEnd w:id="58"/>
+    <w:bookmarkStart w:id="67" w:name="Xf6161db447219dbfd8cafe99c2b7b8b3c3ed412"/>
     <w:p>
       <w:pPr>
         <w:pStyle w:val="Heading2"/>
@@ -7756,7 +8143,7 @@
         <w:t xml:space="preserve">). Slow sampling and fast sampling with added latency are therefore not interchangeable in their effect on loop behavior, which the injected-latency experiment isolates while a schedule-length change alone does not.</w:t>
       </w:r>
     </w:p>
-    <w:bookmarkStart w:id="65" w:name="fig:sched"/>
+    <w:bookmarkStart w:id="62" w:name="fig:sched"/>
     <w:p>
       <w:pPr>
         <w:pStyle w:val="CaptionedFigure"/>
@@ -7766,18 +8153,18 @@
           <wp:inline>
             <wp:extent cx="4267200" cy="1493520"/>
             <wp:effectExtent b="0" l="0" r="0" t="0"/>
-            <wp:docPr descr="" title="" id="63" name="Picture"/>
+            <wp:docPr descr="" title="" id="60" name="Picture"/>
             <a:graphic>
               <a:graphicData uri="http://schemas.openxmlformats.org/drawingml/2006/picture">
                 <pic:pic>
                   <pic:nvPicPr>
-                    <pic:cNvPr descr="/home/touhid/Documents/powerpaper/esp32_feas/results/embedded/fig_v2_sched.png" id="64" name="Picture"/>
+                    <pic:cNvPr descr="/home/touhid/Documents/powerpaper/esp32_feas/results/embedded/fig_v2_sched.png" id="61" name="Picture"/>
                     <pic:cNvPicPr>
                       <a:picLocks noChangeArrowheads="1" noChangeAspect="1"/>
                     </pic:cNvPicPr>
                   </pic:nvPicPr>
                   <pic:blipFill>
-                    <a:blip r:embed="rId62"/>
+                    <a:blip r:embed="rId59"/>
                     <a:stretch>
                       <a:fillRect/>
                     </a:stretch>
@@ -7862,8 +8249,8 @@
         <w:t xml:space="preserve">, separating slow sampling from fast-sampling-plus-latency.</w:t>
       </w:r>
     </w:p>
-    <w:bookmarkEnd w:id="65"/>
-    <w:bookmarkStart w:id="69" w:name="fig:latinj"/>
+    <w:bookmarkEnd w:id="62"/>
+    <w:bookmarkStart w:id="66" w:name="fig:latinj"/>
     <w:p>
       <w:pPr>
         <w:pStyle w:val="CaptionedFigure"/>
@@ -7873,18 +8260,18 @@
           <wp:inline>
             <wp:extent cx="3859778" cy="2389386"/>
             <wp:effectExtent b="0" l="0" r="0" t="0"/>
-            <wp:docPr descr="" title="" id="67" name="Picture"/>
+            <wp:docPr descr="" title="" id="64" name="Picture"/>
             <a:graphic>
               <a:graphicData uri="http://schemas.openxmlformats.org/drawingml/2006/picture">
                 <pic:pic>
                   <pic:nvPicPr>
-                    <pic:cNvPr descr="/home/touhid/Documents/powerpaper/esp32_feas/results/embedded/fig_v2_latinj.png" id="68" name="Picture"/>
+                    <pic:cNvPr descr="/home/touhid/Documents/powerpaper/esp32_feas/results/embedded/fig_v2_latinj.png" id="65" name="Picture"/>
                     <pic:cNvPicPr>
                       <a:picLocks noChangeArrowheads="1" noChangeAspect="1"/>
                     </pic:cNvPicPr>
                   </pic:nvPicPr>
                   <pic:blipFill>
-                    <a:blip r:embed="rId66"/>
+                    <a:blip r:embed="rId63"/>
                     <a:stretch>
                       <a:fillRect/>
                     </a:stretch>
@@ -7938,9 +8325,9 @@
         <w:t xml:space="preserve">, demonstrating that fast sampling with added latency degrades the loop differently from simply sampling more slowly.</w:t>
       </w:r>
     </w:p>
-    <w:bookmarkEnd w:id="69"/>
-    <w:bookmarkEnd w:id="70"/>
-    <w:bookmarkStart w:id="75" w:name="adaptive-update-management"/>
+    <w:bookmarkEnd w:id="66"/>
+    <w:bookmarkEnd w:id="67"/>
+    <w:bookmarkStart w:id="72" w:name="adaptive-update-management"/>
     <w:p>
       <w:pPr>
         <w:pStyle w:val="Heading2"/>
@@ -8171,7 +8558,7 @@
         <w:t xml:space="preserve">40 mV band as the fixed-rate loop. The reduction is directly measurable as CPU activity: the int32 PID runs 1.3\% of the loop budget at fast rate and proportionally less in slow mode. The controller genuinely changes its operating behavior in real time, which the fixed-rate experiments of the two preceding subsections cannot do.</w:t>
       </w:r>
     </w:p>
-    <w:bookmarkStart w:id="74" w:name="fig:adaptive"/>
+    <w:bookmarkStart w:id="71" w:name="fig:adaptive"/>
     <w:p>
       <w:pPr>
         <w:pStyle w:val="CaptionedFigure"/>
@@ -8181,18 +8568,18 @@
           <wp:inline>
             <wp:extent cx="4267200" cy="3657600"/>
             <wp:effectExtent b="0" l="0" r="0" t="0"/>
-            <wp:docPr descr="" title="" id="72" name="Picture"/>
+            <wp:docPr descr="" title="" id="69" name="Picture"/>
             <a:graphic>
               <a:graphicData uri="http://schemas.openxmlformats.org/drawingml/2006/picture">
                 <pic:pic>
                   <pic:nvPicPr>
-                    <pic:cNvPr descr="/home/touhid/Documents/powerpaper/esp32_feas/results/embedded/fig_v2_adaptive.png" id="73" name="Picture"/>
+                    <pic:cNvPr descr="/home/touhid/Documents/powerpaper/esp32_feas/results/embedded/fig_v2_adaptive.png" id="70" name="Picture"/>
                     <pic:cNvPicPr>
                       <a:picLocks noChangeArrowheads="1" noChangeAspect="1"/>
                     </pic:cNvPicPr>
                   </pic:nvPicPr>
                   <pic:blipFill>
-                    <a:blip r:embed="rId71"/>
+                    <a:blip r:embed="rId68"/>
                     <a:stretch>
                       <a:fillRect/>
                     </a:stretch>
@@ -8264,10 +8651,10 @@
         <w:t xml:space="preserve"> V at 2.5 s (dashed). Middle: duty. Bottom: selected mode. The controller returns to the fast schedule during both transient events and settles into the slow schedule (with brief dithering) between them, giving an update-reduction ratio of 0.84.</w:t>
       </w:r>
     </w:p>
-    <w:bookmarkEnd w:id="74"/>
-    <w:bookmarkEnd w:id="75"/>
-    <w:bookmarkEnd w:id="76"/>
-    <w:bookmarkStart w:id="77" w:name="discussion"/>
+    <w:bookmarkEnd w:id="71"/>
+    <w:bookmarkEnd w:id="72"/>
+    <w:bookmarkEnd w:id="73"/>
+    <w:bookmarkStart w:id="74" w:name="discussion"/>
     <w:p>
       <w:pPr>
         <w:pStyle w:val="Heading1"/>
@@ -8321,7 +8708,7 @@
         <w:t xml:space="preserve">boundary, and the effective-resolution sweep shows that quantization limits become visible only below a noise floor this ADC cannot reach at a useful schedule.</w:t>
       </w:r>
     </w:p>
-    <w:bookmarkEnd w:id="77"/>
+    <w:bookmarkEnd w:id="74"/>
     <w:sectPr>
       <w:footnotePr>
         <w:numRestart w:val="eachSect"/>

</xml_diff>

<commit_message>
Fix 4 issues: Hussain first author + affiliations, regenerate circuit figs 1&2 (overlap-free), reorder sections (Experimental before Conclusion), single-column figs 10-12 (no floats past references). 10-page IEEE Access PDF + DOCX
</commit_message>
<xml_diff>
--- a/paper.docx
+++ b/paper.docx
@@ -14,9 +14,16 @@
       <w:pPr>
         <w:pStyle w:val="Author"/>
       </w:pPr>
-      <w:r>
-        <w:t xml:space="preserve">Syeda Salsabil Islam Ariya and Jasimul Islam Chowdhury and Hussain Touhid Siddiquee</w:t>
-      </w:r>
+    </w:p>
+    <w:p>
+      <w:pPr>
+        <w:pStyle w:val="Author"/>
+      </w:pPr>
+    </w:p>
+    <w:p>
+      <w:pPr>
+        <w:pStyle w:val="Author"/>
+      </w:pPr>
     </w:p>
     <w:p>
       <w:pPr>
@@ -538,7 +545,7 @@
       <w:r>
         <w:drawing>
           <wp:inline>
-            <wp:extent cx="4267200" cy="1706880"/>
+            <wp:extent cx="4267200" cy="1676400"/>
             <wp:effectExtent b="0" l="0" r="0" t="0"/>
             <wp:docPr descr="" title="" id="11" name="Picture"/>
             <a:graphic>
@@ -559,7 +566,7 @@
                   <pic:spPr bwMode="auto">
                     <a:xfrm>
                       <a:off x="0" y="0"/>
-                      <a:ext cx="4267200" cy="1706880"/>
+                      <a:ext cx="4267200" cy="1676400"/>
                     </a:xfrm>
                     <a:prstGeom prst="rect">
                       <a:avLst/>
@@ -6604,13 +6611,13 @@
     </w:tbl>
     <w:bookmarkEnd w:id="45"/>
     <w:bookmarkEnd w:id="46"/>
-    <w:bookmarkStart w:id="47" w:name="conclusion"/>
+    <w:bookmarkStart w:id="71" w:name="experimental-closed-loop-platform"/>
     <w:p>
       <w:pPr>
         <w:pStyle w:val="Heading1"/>
       </w:pPr>
       <w:r>
-        <w:t xml:space="preserve">Conclusion</w:t>
+        <w:t xml:space="preserve">Experimental Closed-Loop Platform</w:t>
       </w:r>
     </w:p>
     <w:p>
@@ -6618,77 +6625,62 @@
         <w:pStyle w:val="FirstParagraph"/>
       </w:pPr>
       <w:r>
-        <w:t xml:space="preserve">This paper established how sampling period, ADC quantization, PWM resolution, and real-time computational latency jointly shape the closed-loop performance of an ESP32-S3-controlled inverting buck-boost converter. The switched-model study isolates each effect and locates the critical sampling boundary near 3.5-4</w:t>
-      </w:r>
-      <m:oMath>
-        <m:r>
-          <m:rPr>
-            <m:sty m:val="p"/>
-          </m:rPr>
-          <m:t>×</m:t>
-        </m:r>
+        <w:t xml:space="preserve">The closed-loop platform is the ESP32-S3 (240 MHz, Arduino core) with a 100 kHz LEDC PWM on GPIO2 shorted to ADC1 input GPIO1, so the sensed pin voltage is the duty-scaled rail, mapped into the paper’s</w:t>
+      </w:r>
+      <w:r>
+        <w:t xml:space="preserve"> </w:t>
+      </w:r>
+      <m:oMath>
         <m:sSub>
           <m:e>
             <m:r>
-              <m:t>T</m:t>
+              <m:t>V</m:t>
             </m:r>
           </m:e>
           <m:sub>
             <m:r>
-              <m:t>s</m:t>
-            </m:r>
-            <m:r>
-              <m:t>w</m:t>
+              <m:t>r</m:t>
+            </m:r>
+            <m:r>
+              <m:t>e</m:t>
+            </m:r>
+            <m:r>
+              <m:t>f</m:t>
             </m:r>
           </m:sub>
         </m:sSub>
-      </m:oMath>
-      <w:r>
-        <w:t xml:space="preserve">; the embedded implementation then measures what simulation cannot: a 65 </w:t>
-      </w:r>
-      <m:oMath>
-        <m:r>
-          <m:t>μ</m:t>
-        </m:r>
-      </m:oMath>
-      <w:r>
-        <w:t xml:space="preserve">s control-loop latency dominated by ADC acquisition, 1.3\% CPU utilization, and an acquisition noise floor that masks the quantization effects the simulation predicts. Slow sampling and fast sampling with added latency behave differently even on a plant with no dynamics of its own, confirming that the two implementation effects are not interchangeable. A lightweight quantization-aware adaptive PID switches between achievable schedules using a measured error/activity indicator with hysteresis, holds steady-state error below 40 mV, and cuts controller-update frequency by 84\%. The contributions are the integration, characterization, and experimental resource-aware validation of these effects on one platform, rather than any single technique in isolation. The on-chip ADC’s acquisition time is the binding constraint of this platform; future work with a faster external ADC or a real power stage would place the controller inside the simulated critical region and test directly whether the adaptive framework remains necessary at higher rates.</w:t>
-      </w:r>
-    </w:p>
-    <w:bookmarkEnd w:id="47"/>
-    <w:bookmarkStart w:id="48" w:name="acknowledgment"/>
-    <w:p>
-      <w:pPr>
-        <w:pStyle w:val="Heading1"/>
-      </w:pPr>
-      <w:r>
-        <w:t xml:space="preserve">Acknowledgment</w:t>
-      </w:r>
-    </w:p>
-    <w:p>
-      <w:pPr>
-        <w:pStyle w:val="FirstParagraph"/>
-      </w:pPr>
-      <w:r>
-        <w:t xml:space="preserve">The authors thank Tareq Anwar Shikdar for guidance; no external funding was received.</w:t>
-      </w:r>
-    </w:p>
-    <w:bookmarkEnd w:id="48"/>
-    <w:bookmarkStart w:id="73" w:name="experimental-closed-loop-platform"/>
-    <w:p>
-      <w:pPr>
-        <w:pStyle w:val="Heading1"/>
-      </w:pPr>
-      <w:r>
-        <w:t xml:space="preserve">Experimental Closed-Loop Platform</w:t>
-      </w:r>
-    </w:p>
-    <w:p>
-      <w:pPr>
-        <w:pStyle w:val="FirstParagraph"/>
-      </w:pPr>
-      <w:r>
-        <w:t xml:space="preserve">The closed-loop platform is the ESP32-S3 (240 MHz, Arduino core) with a 100 kHz LEDC PWM on GPIO2 shorted to ADC1 input GPIO1, so the sensed pin voltage is the duty-scaled rail, mapped into the paper’s</w:t>
+        <m:r>
+          <m:rPr>
+            <m:sty m:val="p"/>
+          </m:rPr>
+          <m:t>=</m:t>
+        </m:r>
+        <m:r>
+          <m:rPr>
+            <m:sty m:val="p"/>
+          </m:rPr>
+          <m:t>−</m:t>
+        </m:r>
+        <m:r>
+          <m:t>12</m:t>
+        </m:r>
+      </m:oMath>
+      <w:r>
+        <w:t xml:space="preserve"> V, FS</w:t>
+      </w:r>
+      <m:oMath>
+        <m:r>
+          <m:rPr>
+            <m:sty m:val="p"/>
+          </m:rPr>
+          <m:t>=</m:t>
+        </m:r>
+        <m:r>
+          <m:t>24</m:t>
+        </m:r>
+      </m:oMath>
+      <w:r>
+        <w:t xml:space="preserve"> V frame by the inverting gain</w:t>
       </w:r>
       <w:r>
         <w:t xml:space="preserve"> </w:t>
@@ -6702,13 +6694,13 @@
           </m:e>
           <m:sub>
             <m:r>
-              <m:t>r</m:t>
-            </m:r>
-            <m:r>
-              <m:t>e</m:t>
-            </m:r>
-            <m:r>
-              <m:t>f</m:t>
+              <m:t>o</m:t>
+            </m:r>
+            <m:r>
+              <m:t>u</m:t>
+            </m:r>
+            <m:r>
+              <m:t>t</m:t>
             </m:r>
           </m:sub>
         </m:sSub>
@@ -6724,31 +6716,6 @@
           </m:rPr>
           <m:t>−</m:t>
         </m:r>
-        <m:r>
-          <m:t>12</m:t>
-        </m:r>
-      </m:oMath>
-      <w:r>
-        <w:t xml:space="preserve"> V, FS</w:t>
-      </w:r>
-      <m:oMath>
-        <m:r>
-          <m:rPr>
-            <m:sty m:val="p"/>
-          </m:rPr>
-          <m:t>=</m:t>
-        </m:r>
-        <m:r>
-          <m:t>24</m:t>
-        </m:r>
-      </m:oMath>
-      <w:r>
-        <w:t xml:space="preserve"> V frame by the inverting gain</w:t>
-      </w:r>
-      <w:r>
-        <w:t xml:space="preserve"> </w:t>
-      </w:r>
-      <m:oMath>
         <m:sSub>
           <m:e>
             <m:r>
@@ -6757,13 +6724,13 @@
           </m:e>
           <m:sub>
             <m:r>
-              <m:t>o</m:t>
-            </m:r>
-            <m:r>
-              <m:t>u</m:t>
-            </m:r>
-            <m:r>
-              <m:t>t</m:t>
+              <m:t>p</m:t>
+            </m:r>
+            <m:r>
+              <m:t>i</m:t>
+            </m:r>
+            <m:r>
+              <m:t>n</m:t>
             </m:r>
           </m:sub>
         </m:sSub>
@@ -6771,14 +6738,28 @@
           <m:rPr>
             <m:sty m:val="p"/>
           </m:rPr>
-          <m:t>=</m:t>
-        </m:r>
-        <m:r>
-          <m:rPr>
-            <m:sty m:val="p"/>
-          </m:rPr>
-          <m:t>−</m:t>
-        </m:r>
+          <m:t>⋅</m:t>
+        </m:r>
+        <m:r>
+          <m:t>24</m:t>
+        </m:r>
+        <m:r>
+          <m:rPr>
+            <m:sty m:val="p"/>
+          </m:rPr>
+          <m:t>/</m:t>
+        </m:r>
+        <m:r>
+          <m:t>3.3</m:t>
+        </m:r>
+      </m:oMath>
+      <w:r>
+        <w:t xml:space="preserve">. This reproduces the buck-boost sign inversion and places</w:t>
+      </w:r>
+      <w:r>
+        <w:t xml:space="preserve"> </w:t>
+      </w:r>
+      <m:oMath>
         <m:sSub>
           <m:e>
             <m:r>
@@ -6787,60 +6768,16 @@
           </m:e>
           <m:sub>
             <m:r>
-              <m:t>p</m:t>
-            </m:r>
-            <m:r>
-              <m:t>i</m:t>
-            </m:r>
-            <m:r>
-              <m:t>n</m:t>
+              <m:t>r</m:t>
+            </m:r>
+            <m:r>
+              <m:t>e</m:t>
+            </m:r>
+            <m:r>
+              <m:t>f</m:t>
             </m:r>
           </m:sub>
         </m:sSub>
-        <m:r>
-          <m:rPr>
-            <m:sty m:val="p"/>
-          </m:rPr>
-          <m:t>⋅</m:t>
-        </m:r>
-        <m:r>
-          <m:t>24</m:t>
-        </m:r>
-        <m:r>
-          <m:rPr>
-            <m:sty m:val="p"/>
-          </m:rPr>
-          <m:t>/</m:t>
-        </m:r>
-        <m:r>
-          <m:t>3.3</m:t>
-        </m:r>
-      </m:oMath>
-      <w:r>
-        <w:t xml:space="preserve">. This reproduces the buck-boost sign inversion and places</w:t>
-      </w:r>
-      <w:r>
-        <w:t xml:space="preserve"> </w:t>
-      </w:r>
-      <m:oMath>
-        <m:sSub>
-          <m:e>
-            <m:r>
-              <m:t>V</m:t>
-            </m:r>
-          </m:e>
-          <m:sub>
-            <m:r>
-              <m:t>r</m:t>
-            </m:r>
-            <m:r>
-              <m:t>e</m:t>
-            </m:r>
-            <m:r>
-              <m:t>f</m:t>
-            </m:r>
-          </m:sub>
-        </m:sSub>
       </m:oMath>
       <w:r>
         <w:t xml:space="preserve"> </w:t>
@@ -6849,7 +6786,7 @@
         <w:t xml:space="preserve">exactly at the half-scale code, at which the paper’s ADC coincidence is active. The plant is intentionally not a real power stage: it is an emulated first-order plant whose dynamics are the pin-gain plus the EMA sensor filter, so the platform isolates the digital-implementation effects (sampling, quantization, latency, adaptation) that are the subject of this study. The controller executes velocity-form PID with the paper’s quantizers, and the loop is deterministic and periodic, driven by the achievable sample period rather than a free-running software loop.</w:t>
       </w:r>
     </w:p>
-    <w:bookmarkStart w:id="53" w:name="measured-control-loop-latency"/>
+    <w:bookmarkStart w:id="51" w:name="measured-control-loop-latency"/>
     <w:p>
       <w:pPr>
         <w:pStyle w:val="Heading2"/>
@@ -7201,7 +7138,7 @@
         <w:t xml:space="preserve">at N=64). The hardware therefore operates entirely in the sampling regime the simulation identifies as unstable or critically degraded; this is the central constraint that motivates the adaptive controller presented in the final subsection.</w:t>
       </w:r>
     </w:p>
-    <w:bookmarkStart w:id="52" w:name="fig:lat"/>
+    <w:bookmarkStart w:id="50" w:name="fig:lat"/>
     <w:p>
       <w:pPr>
         <w:pStyle w:val="CaptionedFigure"/>
@@ -7211,18 +7148,18 @@
           <wp:inline>
             <wp:extent cx="4222781" cy="2389386"/>
             <wp:effectExtent b="0" l="0" r="0" t="0"/>
-            <wp:docPr descr="" title="" id="50" name="Picture"/>
+            <wp:docPr descr="" title="" id="48" name="Picture"/>
             <a:graphic>
               <a:graphicData uri="http://schemas.openxmlformats.org/drawingml/2006/picture">
                 <pic:pic>
                   <pic:nvPicPr>
-                    <pic:cNvPr descr="/home/touhid/Documents/powerpaper/esp32_feas/results/embedded/fig_v2_latency.png" id="51" name="Picture"/>
+                    <pic:cNvPr descr="/home/touhid/Documents/powerpaper/esp32_feas/results/embedded/fig_v2_latency.png" id="49" name="Picture"/>
                     <pic:cNvPicPr>
                       <a:picLocks noChangeArrowheads="1" noChangeAspect="1"/>
                     </pic:cNvPicPr>
                   </pic:nvPicPr>
                   <pic:blipFill>
-                    <a:blip r:embed="rId49"/>
+                    <a:blip r:embed="rId47"/>
                     <a:stretch>
                       <a:fillRect/>
                     </a:stretch>
@@ -7289,7 +7226,7 @@
         <w:t xml:space="preserve">s. Log scale.</w:t>
       </w:r>
     </w:p>
-    <w:bookmarkEnd w:id="52"/>
+    <w:bookmarkEnd w:id="50"/>
     <w:tbl>
       <w:tblPr>
         <w:tblStyle w:val="Table"/>
@@ -7696,8 +7633,8 @@
         </w:tc>
       </w:tr>
     </w:tbl>
-    <w:bookmarkEnd w:id="53"/>
-    <w:bookmarkStart w:id="58" w:name="effective-resolution-sweep"/>
+    <w:bookmarkEnd w:id="51"/>
+    <w:bookmarkStart w:id="56" w:name="effective-resolution-sweep"/>
     <w:p>
       <w:pPr>
         <w:pStyle w:val="Heading2"/>
@@ -7842,7 +7779,7 @@
         <w:t xml:space="preserve">1.5 V at N=64), and the closed-loop ripple remains at 1.6-1.9 V peak-to-peak regardless of resolution. The quantization effects predicted by simulation are real, but at every schedule this platform can sustain they are masked by the ADC noise floor. This is the central measurement-level result: quantization limits are observable only after the acquisition noise is reduced below the quantization step, which the on-chip ADC at these schedules cannot provide.</w:t>
       </w:r>
     </w:p>
-    <w:bookmarkStart w:id="57" w:name="fig:effres"/>
+    <w:bookmarkStart w:id="55" w:name="fig:effres"/>
     <w:p>
       <w:pPr>
         <w:pStyle w:val="CaptionedFigure"/>
@@ -7852,18 +7789,18 @@
           <wp:inline>
             <wp:extent cx="4267200" cy="1493520"/>
             <wp:effectExtent b="0" l="0" r="0" t="0"/>
-            <wp:docPr descr="" title="" id="55" name="Picture"/>
+            <wp:docPr descr="" title="" id="53" name="Picture"/>
             <a:graphic>
               <a:graphicData uri="http://schemas.openxmlformats.org/drawingml/2006/picture">
                 <pic:pic>
                   <pic:nvPicPr>
-                    <pic:cNvPr descr="/home/touhid/Documents/powerpaper/esp32_feas/results/embedded/fig_v2_effres.png" id="56" name="Picture"/>
+                    <pic:cNvPr descr="/home/touhid/Documents/powerpaper/esp32_feas/results/embedded/fig_v2_effres.png" id="54" name="Picture"/>
                     <pic:cNvPicPr>
                       <a:picLocks noChangeArrowheads="1" noChangeAspect="1"/>
                     </pic:cNvPicPr>
                   </pic:nvPicPr>
                   <pic:blipFill>
-                    <a:blip r:embed="rId54"/>
+                    <a:blip r:embed="rId52"/>
                     <a:stretch>
                       <a:fillRect/>
                     </a:stretch>
@@ -7898,9 +7835,9 @@
         <w:t xml:space="preserve">Effective-resolution sweep at the N=64 achievable schedule. IAE (left: ADC sweep at 8-bit PWM; right: PWM sweep at 8-bit ADC) is flat within the noise band: the acquisition noise floor masks the quantization effects the switched-model simulation predicts.</w:t>
       </w:r>
     </w:p>
-    <w:bookmarkEnd w:id="57"/>
-    <w:bookmarkEnd w:id="58"/>
-    <w:bookmarkStart w:id="67" w:name="Xf6161db447219dbfd8cafe99c2b7b8b3c3ed412"/>
+    <w:bookmarkEnd w:id="55"/>
+    <w:bookmarkEnd w:id="56"/>
+    <w:bookmarkStart w:id="65" w:name="Xf6161db447219dbfd8cafe99c2b7b8b3c3ed412"/>
     <w:p>
       <w:pPr>
         <w:pStyle w:val="Heading2"/>
@@ -8143,7 +8080,7 @@
         <w:t xml:space="preserve">). Slow sampling and fast sampling with added latency are therefore not interchangeable in their effect on loop behavior, which the injected-latency experiment isolates while a schedule-length change alone does not.</w:t>
       </w:r>
     </w:p>
-    <w:bookmarkStart w:id="62" w:name="fig:sched"/>
+    <w:bookmarkStart w:id="60" w:name="fig:sched"/>
     <w:p>
       <w:pPr>
         <w:pStyle w:val="CaptionedFigure"/>
@@ -8151,20 +8088,20 @@
       <w:r>
         <w:drawing>
           <wp:inline>
-            <wp:extent cx="4267200" cy="1493520"/>
+            <wp:extent cx="5334000" cy="1866900"/>
             <wp:effectExtent b="0" l="0" r="0" t="0"/>
-            <wp:docPr descr="" title="" id="60" name="Picture"/>
+            <wp:docPr descr="" title="" id="58" name="Picture"/>
             <a:graphic>
               <a:graphicData uri="http://schemas.openxmlformats.org/drawingml/2006/picture">
                 <pic:pic>
                   <pic:nvPicPr>
-                    <pic:cNvPr descr="/home/touhid/Documents/powerpaper/esp32_feas/results/embedded/fig_v2_sched.png" id="61" name="Picture"/>
+                    <pic:cNvPr descr="/home/touhid/Documents/powerpaper/esp32_feas/results/embedded/fig_v2_sched.png" id="59" name="Picture"/>
                     <pic:cNvPicPr>
                       <a:picLocks noChangeArrowheads="1" noChangeAspect="1"/>
                     </pic:cNvPicPr>
                   </pic:nvPicPr>
                   <pic:blipFill>
-                    <a:blip r:embed="rId59"/>
+                    <a:blip r:embed="rId57"/>
                     <a:stretch>
                       <a:fillRect/>
                     </a:stretch>
@@ -8172,7 +8109,7 @@
                   <pic:spPr bwMode="auto">
                     <a:xfrm>
                       <a:off x="0" y="0"/>
-                      <a:ext cx="4267200" cy="1493520"/>
+                      <a:ext cx="5334000" cy="1866900"/>
                     </a:xfrm>
                     <a:prstGeom prst="rect">
                       <a:avLst/>
@@ -8249,8 +8186,8 @@
         <w:t xml:space="preserve">, separating slow sampling from fast-sampling-plus-latency.</w:t>
       </w:r>
     </w:p>
-    <w:bookmarkEnd w:id="62"/>
-    <w:bookmarkStart w:id="66" w:name="fig:latinj"/>
+    <w:bookmarkEnd w:id="60"/>
+    <w:bookmarkStart w:id="64" w:name="fig:latinj"/>
     <w:p>
       <w:pPr>
         <w:pStyle w:val="CaptionedFigure"/>
@@ -8260,18 +8197,18 @@
           <wp:inline>
             <wp:extent cx="3859778" cy="2389386"/>
             <wp:effectExtent b="0" l="0" r="0" t="0"/>
-            <wp:docPr descr="" title="" id="64" name="Picture"/>
+            <wp:docPr descr="" title="" id="62" name="Picture"/>
             <a:graphic>
               <a:graphicData uri="http://schemas.openxmlformats.org/drawingml/2006/picture">
                 <pic:pic>
                   <pic:nvPicPr>
-                    <pic:cNvPr descr="/home/touhid/Documents/powerpaper/esp32_feas/results/embedded/fig_v2_latinj.png" id="65" name="Picture"/>
+                    <pic:cNvPr descr="/home/touhid/Documents/powerpaper/esp32_feas/results/embedded/fig_v2_latinj.png" id="63" name="Picture"/>
                     <pic:cNvPicPr>
                       <a:picLocks noChangeArrowheads="1" noChangeAspect="1"/>
                     </pic:cNvPicPr>
                   </pic:nvPicPr>
                   <pic:blipFill>
-                    <a:blip r:embed="rId63"/>
+                    <a:blip r:embed="rId61"/>
                     <a:stretch>
                       <a:fillRect/>
                     </a:stretch>
@@ -8325,9 +8262,9 @@
         <w:t xml:space="preserve">, demonstrating that fast sampling with added latency degrades the loop differently from simply sampling more slowly.</w:t>
       </w:r>
     </w:p>
-    <w:bookmarkEnd w:id="66"/>
-    <w:bookmarkEnd w:id="67"/>
-    <w:bookmarkStart w:id="72" w:name="adaptive-update-management"/>
+    <w:bookmarkEnd w:id="64"/>
+    <w:bookmarkEnd w:id="65"/>
+    <w:bookmarkStart w:id="70" w:name="adaptive-update-management"/>
     <w:p>
       <w:pPr>
         <w:pStyle w:val="Heading2"/>
@@ -8558,7 +8495,7 @@
         <w:t xml:space="preserve">40 mV band as the fixed-rate loop. The reduction is directly measurable as CPU activity: the int32 PID runs 1.3\% of the loop budget at fast rate and proportionally less in slow mode. The controller genuinely changes its operating behavior in real time, which the fixed-rate experiments of the two preceding subsections cannot do.</w:t>
       </w:r>
     </w:p>
-    <w:bookmarkStart w:id="71" w:name="fig:adaptive"/>
+    <w:bookmarkStart w:id="69" w:name="fig:adaptive"/>
     <w:p>
       <w:pPr>
         <w:pStyle w:val="CaptionedFigure"/>
@@ -8566,20 +8503,20 @@
       <w:r>
         <w:drawing>
           <wp:inline>
-            <wp:extent cx="4267200" cy="3657600"/>
+            <wp:extent cx="5334000" cy="4572000"/>
             <wp:effectExtent b="0" l="0" r="0" t="0"/>
-            <wp:docPr descr="" title="" id="69" name="Picture"/>
+            <wp:docPr descr="" title="" id="67" name="Picture"/>
             <a:graphic>
               <a:graphicData uri="http://schemas.openxmlformats.org/drawingml/2006/picture">
                 <pic:pic>
                   <pic:nvPicPr>
-                    <pic:cNvPr descr="/home/touhid/Documents/powerpaper/esp32_feas/results/embedded/fig_v2_adaptive.png" id="70" name="Picture"/>
+                    <pic:cNvPr descr="/home/touhid/Documents/powerpaper/esp32_feas/results/embedded/fig_v2_adaptive.png" id="68" name="Picture"/>
                     <pic:cNvPicPr>
                       <a:picLocks noChangeArrowheads="1" noChangeAspect="1"/>
                     </pic:cNvPicPr>
                   </pic:nvPicPr>
                   <pic:blipFill>
-                    <a:blip r:embed="rId68"/>
+                    <a:blip r:embed="rId66"/>
                     <a:stretch>
                       <a:fillRect/>
                     </a:stretch>
@@ -8587,7 +8524,7 @@
                   <pic:spPr bwMode="auto">
                     <a:xfrm>
                       <a:off x="0" y="0"/>
-                      <a:ext cx="4267200" cy="3657600"/>
+                      <a:ext cx="5334000" cy="4572000"/>
                     </a:xfrm>
                     <a:prstGeom prst="rect">
                       <a:avLst/>
@@ -8651,10 +8588,10 @@
         <w:t xml:space="preserve"> V at 2.5 s (dashed). Middle: duty. Bottom: selected mode. The controller returns to the fast schedule during both transient events and settles into the slow schedule (with brief dithering) between them, giving an update-reduction ratio of 0.84.</w:t>
       </w:r>
     </w:p>
+    <w:bookmarkEnd w:id="69"/>
+    <w:bookmarkEnd w:id="70"/>
     <w:bookmarkEnd w:id="71"/>
-    <w:bookmarkEnd w:id="72"/>
-    <w:bookmarkEnd w:id="73"/>
-    <w:bookmarkStart w:id="74" w:name="discussion"/>
+    <w:bookmarkStart w:id="72" w:name="discussion"/>
     <w:p>
       <w:pPr>
         <w:pStyle w:val="Heading1"/>
@@ -8706,6 +8643,76 @@
       </w:r>
       <w:r>
         <w:t xml:space="preserve">boundary, and the effective-resolution sweep shows that quantization limits become visible only below a noise floor this ADC cannot reach at a useful schedule.</w:t>
+      </w:r>
+    </w:p>
+    <w:bookmarkEnd w:id="72"/>
+    <w:bookmarkStart w:id="73" w:name="conclusion"/>
+    <w:p>
+      <w:pPr>
+        <w:pStyle w:val="Heading1"/>
+      </w:pPr>
+      <w:r>
+        <w:t xml:space="preserve">Conclusion</w:t>
+      </w:r>
+    </w:p>
+    <w:p>
+      <w:pPr>
+        <w:pStyle w:val="FirstParagraph"/>
+      </w:pPr>
+      <w:r>
+        <w:t xml:space="preserve">This paper established how sampling period, ADC quantization, PWM resolution, and real-time computational latency jointly shape the closed-loop performance of an ESP32-S3-controlled inverting buck-boost converter. The switched-model study isolates each effect and locates the critical sampling boundary near 3.5-4</w:t>
+      </w:r>
+      <m:oMath>
+        <m:r>
+          <m:rPr>
+            <m:sty m:val="p"/>
+          </m:rPr>
+          <m:t>×</m:t>
+        </m:r>
+        <m:sSub>
+          <m:e>
+            <m:r>
+              <m:t>T</m:t>
+            </m:r>
+          </m:e>
+          <m:sub>
+            <m:r>
+              <m:t>s</m:t>
+            </m:r>
+            <m:r>
+              <m:t>w</m:t>
+            </m:r>
+          </m:sub>
+        </m:sSub>
+      </m:oMath>
+      <w:r>
+        <w:t xml:space="preserve">; the embedded implementation then measures what simulation cannot: a 65 </w:t>
+      </w:r>
+      <m:oMath>
+        <m:r>
+          <m:t>μ</m:t>
+        </m:r>
+      </m:oMath>
+      <w:r>
+        <w:t xml:space="preserve">s control-loop latency dominated by ADC acquisition, 1.3\% CPU utilization, and an acquisition noise floor that masks the quantization effects the simulation predicts. Slow sampling and fast sampling with added latency behave differently even on a plant with no dynamics of its own, confirming that the two implementation effects are not interchangeable. A lightweight quantization-aware adaptive PID switches between achievable schedules using a measured error/activity indicator with hysteresis, holds steady-state error below 40 mV, and cuts controller-update frequency by 84\%. The contributions are the integration, characterization, and experimental resource-aware validation of these effects on one platform, rather than any single technique in isolation. The on-chip ADC’s acquisition time is the binding constraint of this platform; future work with a faster external ADC or a real power stage would place the controller inside the simulated critical region and test directly whether the adaptive framework remains necessary at higher rates.</w:t>
+      </w:r>
+    </w:p>
+    <w:bookmarkEnd w:id="73"/>
+    <w:bookmarkStart w:id="74" w:name="acknowledgment"/>
+    <w:p>
+      <w:pPr>
+        <w:pStyle w:val="Heading1"/>
+      </w:pPr>
+      <w:r>
+        <w:t xml:space="preserve">Acknowledgment</w:t>
+      </w:r>
+    </w:p>
+    <w:p>
+      <w:pPr>
+        <w:pStyle w:val="FirstParagraph"/>
+      </w:pPr>
+      <w:r>
+        <w:t xml:space="preserve">The authors thank Tareq Anwar Shikdar for guidance; no external funding was received.</w:t>
       </w:r>
     </w:p>
     <w:bookmarkEnd w:id="74"/>

</xml_diff>

<commit_message>
40 references: 20 new verified refs via model bib_add (Crossref-verified DOIs, clickable), all cited in lit review, 0 orphans/undefined. 11-page IEEE Access PDF + DOCX
</commit_message>
<xml_diff>
--- a/paper.docx
+++ b/paper.docx
@@ -110,7 +110,13 @@
         <w:t xml:space="preserve"> </w:t>
       </w:r>
       <w:r>
-        <w:t xml:space="preserve">. In exchange, the designer accepts three implementation-quantized quantities that an analog loop never sees: the ADC resolution of the measured output, the DPWM resolution of the commanded duty, and the sampling period at which controller and power stage are synchronized.</w:t>
+        <w:t xml:space="preserve">. In exchange, the designer accepts three implementation-quantized quantities that an analog loop never sees: the ADC resolution of the measured output, the DPWM resolution of the commanded duty, and the sampling period at which controller and power stage are synchronized; DPWM-architecture and delay considerations are central to achievable resolution</w:t>
+      </w:r>
+      <w:r>
+        <w:t xml:space="preserve"> </w:t>
+      </w:r>
+      <w:r>
+        <w:t xml:space="preserve">.</w:t>
       </w:r>
     </w:p>
     <w:p>
@@ -194,7 +200,19 @@
         <w:pStyle w:val="BodyText"/>
       </w:pPr>
       <w:r>
-        <w:t xml:space="preserve">The central question of this work is therefore: how do sampling period, ADC quantization, PWM resolution, and real-time computational latency jointly affect the closed-loop performance of an ESP32-S3-controlled inverting buck-boost converter, and can a lightweight quantization-aware adaptive PID maintain acceptable regulation while reducing unnecessary controller-update effort? Answering it requires three levels of validation that earlier studies treat separately: a continuous (analog) baseline, a digital simulation that introduces sampling, ADC and PWM quantization and computational delay, and a closed-loop measurement on an embedded platform. The ESP32-S3 is not merely a device that runs the PID; it is the experimental vehicle for investigating the real-world consequences of digital implementation, exposing quantities a simulator cannot produce directly: the acquisition time of the on-chip ADC, the execution time of the control step, the update latency of the PWM peripheral, and the resulting control-loop latency and CPU utilization.</w:t>
+        <w:t xml:space="preserve">The central question of this work is therefore: how do sampling period, ADC quantization, PWM resolution, and real-time computational latency jointly affect the closed-loop performance of an ESP32-S3-controlled inverting buck-boost converter, and can a lightweight quantization-aware adaptive PID maintain acceptable regulation while reducing unnecessary controller-update effort? Answering it requires three levels of validation (an approach related to event-triggered and self-triggered control</w:t>
+      </w:r>
+      <w:r>
+        <w:t xml:space="preserve"> </w:t>
+      </w:r>
+      <w:r>
+        <w:t xml:space="preserve">, and to adaptive-sampling converter control</w:t>
+      </w:r>
+      <w:r>
+        <w:t xml:space="preserve"> </w:t>
+      </w:r>
+      <w:r>
+        <w:t xml:space="preserve">) that earlier studies treat separately: a continuous (analog) baseline, a digital simulation that introduces sampling, ADC and PWM quantization and computational delay, and a closed-loop measurement on an embedded platform. The ESP32-S3 is not merely a device that runs the PID; it is the experimental vehicle for investigating the real-world consequences of digital implementation, exposing quantities a simulator cannot produce directly: the acquisition time of the on-chip ADC, the execution time of the control step, the update latency of the PWM peripheral, and the resulting control-loop latency and CPU utilization.</w:t>
       </w:r>
     </w:p>
     <w:p>
@@ -1030,7 +1048,13 @@
         <w:pStyle w:val="BodyText"/>
       </w:pPr>
       <w:r>
-        <w:t xml:space="preserve">During OFF, the inductor current is held at zero when it would otherwise reverse (zero-current boundary), which counts discontinuous-mode (DCM) cycles and keeps the model valid in DCM without clamping the output. Many simplified studies go silent on this point. All reported results are obtained on this switched-state model, not on an averaged approximation, so quantization artifacts (limit cycles, DCM chatter) appear faithfully.</w:t>
+        <w:t xml:space="preserve">During OFF, the inductor current is held at zero when it would otherwise reverse (zero-current boundary), which counts discontinuous-mode (DCM) cycles and keeps the model valid in DCM without clamping the output. Many simplified studies go silent on this point. All reported results are obtained on this switched-state model, not on an averaged approximation, so quantization artifacts (limit cycles, DCM chatter) appear faithfully; nonideal DCM of the buck-boost requires explicit boundary modeling</w:t>
+      </w:r>
+      <w:r>
+        <w:t xml:space="preserve"> </w:t>
+      </w:r>
+      <w:r>
+        <w:t xml:space="preserve">.</w:t>
       </w:r>
     </w:p>
     <w:p>
@@ -6783,7 +6807,22 @@
         <w:t xml:space="preserve"> </w:t>
       </w:r>
       <w:r>
-        <w:t xml:space="preserve">exactly at the half-scale code, at which the paper’s ADC coincidence is active. The plant is intentionally not a real power stage: it is an emulated first-order plant whose dynamics are the pin-gain plus the EMA sensor filter, so the platform isolates the digital-implementation effects (sampling, quantization, latency, adaptation) that are the subject of this study. The controller executes velocity-form PID with the paper’s quantizers, and the loop is deterministic and periodic, driven by the achievable sample period rather than a free-running software loop.</w:t>
+        <w:t xml:space="preserve">exactly at the half-scale code, at which the paper’s ADC coincidence is active. The plant is intentionally not a real power stage: it is an emulated first-order plant whose dynamics are the pin-gain plus the EMA sensor filter, so the platform isolates the digital-implementation effects (sampling, quantization, latency, adaptation) that are the subject of this study. The controller executes velocity-form PID with the paper’s quantizers, and the loop is deterministic and periodic, driven by the achievable sample period rather than a free-running software loop, following microcontroller-implemented digital control</w:t>
+      </w:r>
+      <w:r>
+        <w:t xml:space="preserve"> </w:t>
+      </w:r>
+      <w:r>
+        <w:t xml:space="preserve"> </w:t>
+      </w:r>
+      <w:r>
+        <w:t xml:space="preserve">and remote-monitoring practice</w:t>
+      </w:r>
+      <w:r>
+        <w:t xml:space="preserve"> </w:t>
+      </w:r>
+      <w:r>
+        <w:t xml:space="preserve">.</w:t>
       </w:r>
     </w:p>
     <w:bookmarkStart w:id="51" w:name="measured-control-loop-latency"/>

</xml_diff>

<commit_message>
reviewer fixes: abstract ±40 mV & ≈680×, 1-LSB DPWM derivation, raw-ADC path statement, noise-floor σ=1.5 V (N=64) figure, exact DCM counts in Table III, acknowledge Leading University, Sylhet
</commit_message>
<xml_diff>
--- a/paper.docx
+++ b/paper.docx
@@ -38,7 +38,7 @@
         <w:pStyle w:val="Abstract"/>
       </w:pPr>
       <w:r>
-        <w:t xml:space="preserve">Digital control of switching power converters is shaped by three implementation-quantized quantities: the ADC resolution of the sensed output, the DPWM resolution of the commanded duty, and the sampling period at which controller and power stage are synchronized. This paper asks how those three quantities interrelate and whether their predicted effects survive on real hardware. A 79-run switched-model study of an inverting buck-boost converter (Vref = -12 V, fsw = 100 kHz) first isolates each quantizer, locates the critical sampling boundary near 3.5-4x Tsw, and shows the three stages interact super-additively. The same controller is then ported to an ESP32-S3 closed-loop platform whose loop is bound by the on-chip ADC: the raw read takes 60 us, so the fastest achievable loop is about 6x Tsw and useful oversampled loops reach up to nearly 700x Tsw, placing the hardware inside the simulation’s predicted unstable regime. Measured latency decomposes into T_ADC = 60 us, T_PID = 0.86 us (int32), and T_PWM = 4.2 us; CPU utilization is 1.3%. An effective-resolution sweep shows the 1.6-1.9 V acquisition noise floor masks the quantization effects the simulation predicts at 27-205 mV. A lightweight quantization-aware adaptive controller switches between achievable schedules by a measured error/ripple indicator and activates duty dithering with hysteresis only near the setpoint, reducing controller-update frequency by roughly 84% while holding the mean steady-state error within +/-20 mV. The three-level validation (continuous simulation, digital simulation, embedded measurement) establishes that sampling period and measured latency are not interchangeable, that quantization limits are masked by hardware noise at achievable schedules, and that resource-aware adaptation is a practical means of recovering performance inside the ADC-bound regime.</w:t>
+        <w:t xml:space="preserve">Digital control of switching power converters is shaped by three implementation-quantized quantities: the ADC resolution of the sensed output, the DPWM resolution of the commanded duty, and the sampling period at which controller and power stage are synchronized. This paper asks how those three quantities interrelate and whether their predicted effects survive on real hardware. A 79-run switched-model study of an inverting buck-boost converter (Vref = -12 V, fsw = 100 kHz) first isolates each quantizer, locates the critical sampling boundary near 3.5-4x Tsw, and shows the three stages interact super-additively. The same controller is then ported to an ESP32-S3 closed-loop platform whose loop is bound by the on-chip ADC: the raw read takes 60 us, so the fastest achievable loop is about 6x Tsw and useful oversampled loops reach up to about 680x Tsw, placing the hardware inside the simulation’s predicted unstable regime. Measured latency decomposes into T_ADC = 60 us, T_PID = 0.86 us (int32), and T_PWM = 4.2 us; CPU utilization is 1.3%. An effective-resolution sweep shows the 1.6-1.9 V acquisition noise floor masks the quantization effects the simulation predicts (from the 27 mV coarse-ADC ripple to the 205 mV 6-bit-PWM limit cycle). A lightweight quantization-aware adaptive controller switches between achievable schedules by a measured error/ripple indicator and activates duty dithering with hysteresis only near the setpoint, reducing controller-update frequency by roughly 84% while holding the mean steady-state error within +/-40 mV. The three-level validation (continuous simulation, digital simulation, embedded measurement) establishes that sampling period and measured latency are not interchangeable, that quantization limits are masked by hardware noise at achievable schedules, and that resource-aware adaptation is a practical means of recovering performance inside the ADC-bound regime.</w:t>
       </w:r>
     </w:p>
     <w:p>
@@ -69,24 +69,36 @@
         <w:t xml:space="preserve"> </w:t>
       </w:r>
       <w:r>
+        <w:t xml:space="preserve">(Maksimovic et al. 2004; Corradini et al. 2015)</w:t>
+      </w:r>
+      <w:r>
         <w:t xml:space="preserve">. The complete digital loop contains two unavoidable quantizers: the analog-to-digital converter (ADC) that samples the output voltage, and the digital pulse-width modulator (DPWM) that resolves the duty ratio. Their resolutions, together with the sampling period of the controller, jointly determine regulation quality. Classic work established that coarse quantization causes steady-state limit cycling and conditions between DPWM and ADC resolution for its elimination</w:t>
       </w:r>
       <w:r>
         <w:t xml:space="preserve"> </w:t>
       </w:r>
       <w:r>
+        <w:t xml:space="preserve">(White 1969; Peterchev and Sanders 2003; Peng et al. 2007; Zhao and Prodić 2007; Crovetti et al. 2020)</w:t>
+      </w:r>
+      <w:r>
         <w:t xml:space="preserve">, while quantization-effect modeling permits quantitative prediction of these oscillations</w:t>
       </w:r>
       <w:r>
         <w:t xml:space="preserve"> </w:t>
       </w:r>
       <w:r>
+        <w:t xml:space="preserve">(Maksimovic and Zane 2007)</w:t>
+      </w:r>
+      <w:r>
         <w:t xml:space="preserve">. Recent work extends the analysis to MHz-range GaN converters using dither and sigma-delta modulation</w:t>
       </w:r>
       <w:r>
         <w:t xml:space="preserve"> </w:t>
       </w:r>
       <w:r>
+        <w:t xml:space="preserve">(Al-Obaidi and Nawar 2025; González-Castaño et al. 2020; Lukic et al. 2007; Kim et al. 2024)</w:t>
+      </w:r>
+      <w:r>
         <w:t xml:space="preserve"> </w:t>
       </w:r>
       <w:r>
@@ -96,6 +108,9 @@
         <w:t xml:space="preserve"> </w:t>
       </w:r>
       <w:r>
+        <w:t xml:space="preserve">(González-Castaño et al. 2020)</w:t>
+      </w:r>
+      <w:r>
         <w:t xml:space="preserve">.</w:t>
       </w:r>
     </w:p>
@@ -110,12 +125,18 @@
         <w:t xml:space="preserve"> </w:t>
       </w:r>
       <w:r>
+        <w:t xml:space="preserve">(Maksimovic et al. 2004; Corradini et al. 2015)</w:t>
+      </w:r>
+      <w:r>
         <w:t xml:space="preserve">. In exchange, the designer accepts three implementation-quantized quantities that an analog loop never sees: the ADC resolution of the measured output, the DPWM resolution of the commanded duty, and the sampling period at which controller and power stage are synchronized; DPWM-architecture and delay considerations are central to achievable resolution</w:t>
       </w:r>
       <w:r>
         <w:t xml:space="preserve"> </w:t>
       </w:r>
       <w:r>
+        <w:t xml:space="preserve">(Sun et al. 2010; Chen et al. 2012; Ahmad and Bakkaloglu 2010; Yao et al. 2018)</w:t>
+      </w:r>
+      <w:r>
         <w:t xml:space="preserve">.</w:t>
       </w:r>
     </w:p>
@@ -130,36 +151,54 @@
         <w:t xml:space="preserve"> </w:t>
       </w:r>
       <w:r>
+        <w:t xml:space="preserve">(Peterchev and Sanders 2003)</w:t>
+      </w:r>
+      <w:r>
         <w:t xml:space="preserve">. Peng, Prodić, Alarcón, and Maksimović derived static and dynamic quantization models explaining the origins of limit-cycle oscillations</w:t>
       </w:r>
       <w:r>
         <w:t xml:space="preserve"> </w:t>
       </w:r>
       <w:r>
+        <w:t xml:space="preserve">(Peng et al. 2007)</w:t>
+      </w:r>
+      <w:r>
         <w:t xml:space="preserve">, and Maksimović and Zane provided the small-signal discrete-time framework used to design digitally controlled converters</w:t>
       </w:r>
       <w:r>
         <w:t xml:space="preserve"> </w:t>
       </w:r>
       <w:r>
+        <w:t xml:space="preserve">(Maksimovic and Zane 2007)</w:t>
+      </w:r>
+      <w:r>
         <w:t xml:space="preserve">. A fuller survey appears in</w:t>
       </w:r>
       <w:r>
         <w:t xml:space="preserve"> </w:t>
       </w:r>
       <w:r>
+        <w:t xml:space="preserve">(Liu et al. 2009)</w:t>
+      </w:r>
+      <w:r>
         <w:t xml:space="preserve">. On the application side, low-resolution non-uniform ADC quantization has been shown to improve dynamic response</w:t>
       </w:r>
       <w:r>
         <w:t xml:space="preserve"> </w:t>
       </w:r>
       <w:r>
+        <w:t xml:space="preserve">(Hu et al. 2008)</w:t>
+      </w:r>
+      <w:r>
         <w:t xml:space="preserve">, and the full control loop benefits from predictive structures</w:t>
       </w:r>
       <w:r>
         <w:t xml:space="preserve"> </w:t>
       </w:r>
       <w:r>
+        <w:t xml:space="preserve">(Chen et al. 2003; Bibian and Jin 2002; Foong et al. 2011; He et al. 2007; Yu et al. 2023)</w:t>
+      </w:r>
+      <w:r>
         <w:t xml:space="preserve">.</w:t>
       </w:r>
     </w:p>
@@ -174,6 +213,9 @@
         <w:t xml:space="preserve"> </w:t>
       </w:r>
       <w:r>
+        <w:t xml:space="preserve">(Yousefzadeh et al. 2007)</w:t>
+      </w:r>
+      <w:r>
         <w:t xml:space="preserve"> </w:t>
       </w:r>
       <w:r>
@@ -183,6 +225,9 @@
         <w:t xml:space="preserve"> </w:t>
       </w:r>
       <w:r>
+        <w:t xml:space="preserve">(Vijayalakshmi and Raja 2014; Viswanatha et al. 2020; Chakraborty et al. 2006; Chen et al. 2010; Dordevic and Despotovic 2021)</w:t>
+      </w:r>
+      <w:r>
         <w:t xml:space="preserve"> </w:t>
       </w:r>
       <w:r>
@@ -192,6 +237,9 @@
         <w:t xml:space="preserve"> </w:t>
       </w:r>
       <w:r>
+        <w:t xml:space="preserve">(Erickson and Maksimovic 2001)</w:t>
+      </w:r>
+      <w:r>
         <w:t xml:space="preserve">.</w:t>
       </w:r>
     </w:p>
@@ -206,10 +254,16 @@
         <w:t xml:space="preserve"> </w:t>
       </w:r>
       <w:r>
+        <w:t xml:space="preserve">(Heemels et al. 2012)</w:t>
+      </w:r>
+      <w:r>
         <w:t xml:space="preserve">, and to adaptive-sampling converter control</w:t>
       </w:r>
       <w:r>
         <w:t xml:space="preserve"> </w:t>
+      </w:r>
+      <w:r>
+        <w:t xml:space="preserve">(Saysanasongkham et al. 2013; Zhou and Preindl 2019)</w:t>
       </w:r>
       <w:r>
         <w:t xml:space="preserve">) that earlier studies treat separately: a continuous (analog) baseline, a digital simulation that introduces sampling, ADC and PWM quantization and computational delay, and a closed-loop measurement on an embedded platform. The ESP32-S3 is not merely a device that runs the PID; it is the experimental vehicle for investigating the real-world consequences of digital implementation, exposing quantities a simulator cannot produce directly: the acquisition time of the on-chip ADC, the execution time of the control step, the update latency of the PWM peripheral, and the resulting control-loop latency and CPU utilization.</w:t>
@@ -1052,6 +1106,9 @@
       </w:r>
       <w:r>
         <w:t xml:space="preserve"> </w:t>
+      </w:r>
+      <w:r>
+        <w:t xml:space="preserve">(Gong et al. 2010)</w:t>
       </w:r>
       <w:r>
         <w:t xml:space="preserve">.</w:t>
@@ -4428,14 +4485,23 @@
         <w:t xml:space="preserve"> </w:t>
       </w:r>
       <w:r>
-        <w:t xml:space="preserve">; at 6-bit the DPWM step is</w:t>
-      </w:r>
-      <w:r>
-        <w:t xml:space="preserve"> </w:t>
-      </w:r>
-      <m:oMath>
-        <m:r>
-          <m:t>2</m:t>
+        <w:t xml:space="preserve">(Peterchev and Sanders 2003; Peng et al. 2007)</w:t>
+      </w:r>
+      <w:r>
+        <w:t xml:space="preserve">; at 6-bit the duty grid step is 1 LSB</w:t>
+      </w:r>
+      <w:r>
+        <w:t xml:space="preserve"> </w:t>
+      </w:r>
+      <m:oMath>
+        <m:r>
+          <m:rPr>
+            <m:sty m:val="p"/>
+          </m:rPr>
+          <m:t>=</m:t>
+        </m:r>
+        <m:r>
+          <m:t>1</m:t>
         </m:r>
         <m:r>
           <m:rPr>
@@ -4446,21 +4512,240 @@
         <m:r>
           <m:t>64</m:t>
         </m:r>
+      </m:oMath>
+      <w:r>
+        <w:t xml:space="preserve">, and the loop settles into a limit cycle toggling between the adjacent codes 31/64 and 32/64 around the</w:t>
+      </w:r>
+      <w:r>
+        <w:t xml:space="preserve"> </w:t>
+      </w:r>
+      <m:oMath>
+        <m:r>
+          <m:t>D</m:t>
+        </m:r>
+        <m:r>
+          <m:rPr>
+            <m:sty m:val="p"/>
+          </m:rPr>
+          <m:t>≈</m:t>
+        </m:r>
+        <m:r>
+          <m:t>0.5</m:t>
+        </m:r>
+      </m:oMath>
+      <w:r>
+        <w:t xml:space="preserve"> </w:t>
+      </w:r>
+      <w:r>
+        <w:t xml:space="preserve">operating point, whose measured peak-to-peak output excursion is 204.8 mV. The static code-to-code shift at this operating point is larger,</w:t>
+      </w:r>
+      <w:r>
+        <w:t xml:space="preserve"> </w:t>
+      </w:r>
+      <m:oMath>
+        <m:r>
+          <m:rPr>
+            <m:sty m:val="p"/>
+          </m:rPr>
+          <m:t>|</m:t>
+        </m:r>
+        <m:r>
+          <m:t>d</m:t>
+        </m:r>
+        <m:sSub>
+          <m:e>
+            <m:r>
+              <m:t>V</m:t>
+            </m:r>
+          </m:e>
+          <m:sub>
+            <m:r>
+              <m:t>o</m:t>
+            </m:r>
+            <m:r>
+              <m:t>u</m:t>
+            </m:r>
+            <m:r>
+              <m:t>t</m:t>
+            </m:r>
+          </m:sub>
+        </m:sSub>
+        <m:r>
+          <m:rPr>
+            <m:sty m:val="p"/>
+          </m:rPr>
+          <m:t>/</m:t>
+        </m:r>
+        <m:r>
+          <m:t>d</m:t>
+        </m:r>
+        <m:r>
+          <m:t>D</m:t>
+        </m:r>
+        <m:r>
+          <m:rPr>
+            <m:sty m:val="p"/>
+          </m:rPr>
+          <m:t>|</m:t>
+        </m:r>
+        <m:r>
+          <m:rPr>
+            <m:sty m:val="p"/>
+          </m:rPr>
+          <m:t>⋅</m:t>
+        </m:r>
+        <m:r>
+          <m:t>1</m:t>
+        </m:r>
+        <m:r>
+          <m:rPr>
+            <m:sty m:val="p"/>
+          </m:rPr>
+          <m:t>/</m:t>
+        </m:r>
+        <m:r>
+          <m:t>64</m:t>
+        </m:r>
+        <m:r>
+          <m:rPr>
+            <m:sty m:val="p"/>
+          </m:rPr>
+          <m:t>≈</m:t>
+        </m:r>
+        <m:r>
+          <m:t>0.73</m:t>
+        </m:r>
+      </m:oMath>
+      <w:r>
+        <w:t xml:space="preserve"> V with</w:t>
+      </w:r>
+      <w:r>
+        <w:t xml:space="preserve"> </w:t>
+      </w:r>
+      <m:oMath>
+        <m:r>
+          <m:rPr>
+            <m:sty m:val="p"/>
+          </m:rPr>
+          <m:t>|</m:t>
+        </m:r>
+        <m:r>
+          <m:t>d</m:t>
+        </m:r>
+        <m:sSub>
+          <m:e>
+            <m:r>
+              <m:t>V</m:t>
+            </m:r>
+          </m:e>
+          <m:sub>
+            <m:r>
+              <m:t>o</m:t>
+            </m:r>
+            <m:r>
+              <m:t>u</m:t>
+            </m:r>
+            <m:r>
+              <m:t>t</m:t>
+            </m:r>
+          </m:sub>
+        </m:sSub>
+        <m:r>
+          <m:rPr>
+            <m:sty m:val="p"/>
+          </m:rPr>
+          <m:t>/</m:t>
+        </m:r>
+        <m:r>
+          <m:t>d</m:t>
+        </m:r>
+        <m:r>
+          <m:t>D</m:t>
+        </m:r>
+        <m:r>
+          <m:rPr>
+            <m:sty m:val="p"/>
+          </m:rPr>
+          <m:t>|</m:t>
+        </m:r>
         <m:r>
           <m:rPr>
             <m:sty m:val="p"/>
           </m:rPr>
           <m:t>=</m:t>
         </m:r>
-        <m:r>
-          <m:t>31.25</m:t>
-        </m:r>
-      </m:oMath>
-      <w:r>
-        <w:t xml:space="preserve"> mV of duty, which maps through the control-to-output gain into the observed 204.8 mV ripple. This is precisely the regime addressed by finer DPWM controller implementations</w:t>
-      </w:r>
-      <w:r>
-        <w:t xml:space="preserve"> </w:t>
+        <m:sSub>
+          <m:e>
+            <m:r>
+              <m:t>V</m:t>
+            </m:r>
+          </m:e>
+          <m:sub>
+            <m:r>
+              <m:t>i</m:t>
+            </m:r>
+            <m:r>
+              <m:t>n</m:t>
+            </m:r>
+          </m:sub>
+        </m:sSub>
+        <m:r>
+          <m:rPr>
+            <m:sty m:val="p"/>
+          </m:rPr>
+          <m:t>/</m:t>
+        </m:r>
+        <m:r>
+          <m:rPr>
+            <m:sty m:val="p"/>
+          </m:rPr>
+          <m:t>(</m:t>
+        </m:r>
+        <m:r>
+          <m:t>1</m:t>
+        </m:r>
+        <m:r>
+          <m:rPr>
+            <m:sty m:val="p"/>
+          </m:rPr>
+          <m:t>−</m:t>
+        </m:r>
+        <m:r>
+          <m:t>D</m:t>
+        </m:r>
+        <m:sSup>
+          <m:e>
+            <m:r>
+              <m:rPr>
+                <m:sty m:val="p"/>
+              </m:rPr>
+              <m:t>)</m:t>
+            </m:r>
+          </m:e>
+          <m:sup>
+            <m:r>
+              <m:t>2</m:t>
+            </m:r>
+          </m:sup>
+        </m:sSup>
+        <m:r>
+          <m:rPr>
+            <m:sty m:val="p"/>
+          </m:rPr>
+          <m:t>≈</m:t>
+        </m:r>
+        <m:r>
+          <m:t>48</m:t>
+        </m:r>
+      </m:oMath>
+      <w:r>
+        <w:t xml:space="preserve"> V per unit duty; the dynamic ripple is smaller because the output capacitor averages the excursion over the limit-cycle period. This is precisely the regime addressed by finer DPWM controller implementations</w:t>
+      </w:r>
+      <w:r>
+        <w:t xml:space="preserve"> </w:t>
+      </w:r>
+      <w:r>
+        <w:t xml:space="preserve">(Patella et al. 2003; Syed et al. 2004)</w:t>
       </w:r>
       <w:r>
         <w:t xml:space="preserve"> </w:t>
@@ -4470,6 +4755,9 @@
       </w:r>
       <w:r>
         <w:t xml:space="preserve"> </w:t>
+      </w:r>
+      <w:r>
+        <w:t xml:space="preserve">(Norris et al. 2008)</w:t>
       </w:r>
       <w:r>
         <w:t xml:space="preserve">.</w:t>
@@ -5616,7 +5904,7 @@
         </m:r>
       </m:oMath>
       <w:r>
-        <w:t xml:space="preserve">5 V of steady-state error and over 160 000 DCM cycles per event (Fig. </w:t>
+        <w:t xml:space="preserve">5 V of steady-state error, accruing 266 015 DCM cycles after the input step and 163 360 after the load step within the 60 ms post-step window — far above the 127 075 cycles the same configuration accrues when undisturbed — because the loop never settles and keeps crossing the zero-current boundary for the entire window (Fig. </w:t>
       </w:r>
       <w:hyperlink w:anchor="fig:dist">
         <w:r>
@@ -5637,10 +5925,11 @@
         <w:tblLook w:firstRow="1" w:lastRow="0" w:firstColumn="0" w:lastColumn="0" w:noHBand="0" w:noVBand="0" w:val="0020"/>
       </w:tblPr>
       <w:tblGrid>
-        <w:gridCol w:w="1980"/>
-        <w:gridCol w:w="1980"/>
-        <w:gridCol w:w="1980"/>
-        <w:gridCol w:w="1980"/>
+        <w:gridCol w:w="1584"/>
+        <w:gridCol w:w="1584"/>
+        <w:gridCol w:w="1584"/>
+        <w:gridCol w:w="1584"/>
+        <w:gridCol w:w="1584"/>
       </w:tblGrid>
       <w:tr>
         <w:trPr>
@@ -5694,6 +5983,18 @@
             </w:r>
           </w:p>
         </w:tc>
+        <w:tc>
+          <w:tcPr/>
+          <w:p>
+            <w:pPr>
+              <w:pStyle w:val="Compact"/>
+              <w:jc w:val="left"/>
+            </w:pPr>
+            <w:r>
+              <w:t xml:space="preserve">DCM (60 ms)</w:t>
+            </w:r>
+          </w:p>
+        </w:tc>
       </w:tr>
       <w:tr>
         <w:tc>
@@ -5716,19 +6017,19 @@
               <w:jc w:val="left"/>
             </w:pPr>
             <w:r>
-              <w:t xml:space="preserve">Vin step</w:t>
-            </w:r>
-          </w:p>
-        </w:tc>
-        <w:tc>
-          <w:tcPr/>
-          <w:p>
-            <w:pPr>
-              <w:pStyle w:val="Compact"/>
-              <w:jc w:val="left"/>
-            </w:pPr>
-            <w:r>
-              <w:t xml:space="preserve">1.43 ms</w:t>
+              <w:t xml:space="preserve">V_in step</w:t>
+            </w:r>
+          </w:p>
+        </w:tc>
+        <w:tc>
+          <w:tcPr/>
+          <w:p>
+            <w:pPr>
+              <w:pStyle w:val="Compact"/>
+              <w:jc w:val="left"/>
+            </w:pPr>
+            <w:r>
+              <w:t xml:space="preserve">0.97 ms</w:t>
             </w:r>
           </w:p>
         </w:tc>
@@ -5741,6 +6042,18 @@
             </w:pPr>
             <w:r>
               <w:t xml:space="preserve">0.0 mV / 0.0014</w:t>
+            </w:r>
+          </w:p>
+        </w:tc>
+        <w:tc>
+          <w:tcPr/>
+          <w:p>
+            <w:pPr>
+              <w:pStyle w:val="Compact"/>
+              <w:jc w:val="left"/>
+            </w:pPr>
+            <w:r>
+              <w:t xml:space="preserve">0</w:t>
             </w:r>
           </w:p>
         </w:tc>
@@ -5778,19 +6091,31 @@
               <w:jc w:val="left"/>
             </w:pPr>
             <w:r>
-              <w:t xml:space="preserve">0.94 ms</w:t>
-            </w:r>
-          </w:p>
-        </w:tc>
-        <w:tc>
-          <w:tcPr/>
-          <w:p>
-            <w:pPr>
-              <w:pStyle w:val="Compact"/>
-              <w:jc w:val="left"/>
-            </w:pPr>
-            <w:r>
-              <w:t xml:space="preserve">0.3 mV / 0.0013</w:t>
+              <w:t xml:space="preserve">0.97 ms</w:t>
+            </w:r>
+          </w:p>
+        </w:tc>
+        <w:tc>
+          <w:tcPr/>
+          <w:p>
+            <w:pPr>
+              <w:pStyle w:val="Compact"/>
+              <w:jc w:val="left"/>
+            </w:pPr>
+            <w:r>
+              <w:t xml:space="preserve">0.0 mV / 0.0014</w:t>
+            </w:r>
+          </w:p>
+        </w:tc>
+        <w:tc>
+          <w:tcPr/>
+          <w:p>
+            <w:pPr>
+              <w:pStyle w:val="Compact"/>
+              <w:jc w:val="left"/>
+            </w:pPr>
+            <w:r>
+              <w:t xml:space="preserve">0</w:t>
             </w:r>
           </w:p>
         </w:tc>
@@ -5804,43 +6129,55 @@
               <w:jc w:val="left"/>
             </w:pPr>
             <w:r>
-              <w:t xml:space="preserve">Ideal dig.</w:t>
-            </w:r>
-          </w:p>
-        </w:tc>
-        <w:tc>
-          <w:tcPr/>
-          <w:p>
-            <w:pPr>
-              <w:pStyle w:val="Compact"/>
-              <w:jc w:val="left"/>
-            </w:pPr>
-            <w:r>
-              <w:t xml:space="preserve">Vin step</w:t>
-            </w:r>
-          </w:p>
-        </w:tc>
-        <w:tc>
-          <w:tcPr/>
-          <w:p>
-            <w:pPr>
-              <w:pStyle w:val="Compact"/>
-              <w:jc w:val="left"/>
-            </w:pPr>
-            <w:r>
-              <w:t xml:space="preserve">0.92 ms</w:t>
-            </w:r>
-          </w:p>
-        </w:tc>
-        <w:tc>
-          <w:tcPr/>
-          <w:p>
-            <w:pPr>
-              <w:pStyle w:val="Compact"/>
-              <w:jc w:val="left"/>
-            </w:pPr>
-            <w:r>
-              <w:t xml:space="preserve">14.9 mV / 0.0017</w:t>
+              <w:t xml:space="preserve">Ideal digital</w:t>
+            </w:r>
+          </w:p>
+        </w:tc>
+        <w:tc>
+          <w:tcPr/>
+          <w:p>
+            <w:pPr>
+              <w:pStyle w:val="Compact"/>
+              <w:jc w:val="left"/>
+            </w:pPr>
+            <w:r>
+              <w:t xml:space="preserve">V_in step</w:t>
+            </w:r>
+          </w:p>
+        </w:tc>
+        <w:tc>
+          <w:tcPr/>
+          <w:p>
+            <w:pPr>
+              <w:pStyle w:val="Compact"/>
+              <w:jc w:val="left"/>
+            </w:pPr>
+            <w:r>
+              <w:t xml:space="preserve">1.01 ms</w:t>
+            </w:r>
+          </w:p>
+        </w:tc>
+        <w:tc>
+          <w:tcPr/>
+          <w:p>
+            <w:pPr>
+              <w:pStyle w:val="Compact"/>
+              <w:jc w:val="left"/>
+            </w:pPr>
+            <w:r>
+              <w:t xml:space="preserve">0.0 mV / 0.0014</w:t>
+            </w:r>
+          </w:p>
+        </w:tc>
+        <w:tc>
+          <w:tcPr/>
+          <w:p>
+            <w:pPr>
+              <w:pStyle w:val="Compact"/>
+              <w:jc w:val="left"/>
+            </w:pPr>
+            <w:r>
+              <w:t xml:space="preserve">0</w:t>
             </w:r>
           </w:p>
         </w:tc>
@@ -5854,7 +6191,7 @@
               <w:jc w:val="left"/>
             </w:pPr>
             <w:r>
-              <w:t xml:space="preserve">Ideal dig.</w:t>
+              <w:t xml:space="preserve">Ideal digital</w:t>
             </w:r>
           </w:p>
         </w:tc>
@@ -5878,19 +6215,31 @@
               <w:jc w:val="left"/>
             </w:pPr>
             <w:r>
-              <w:t xml:space="preserve">0.84 ms</w:t>
-            </w:r>
-          </w:p>
-        </w:tc>
-        <w:tc>
-          <w:tcPr/>
-          <w:p>
-            <w:pPr>
-              <w:pStyle w:val="Compact"/>
-              <w:jc w:val="left"/>
-            </w:pPr>
-            <w:r>
-              <w:t xml:space="preserve">26.1 mV / 0.0019</w:t>
+              <w:t xml:space="preserve">1.00 ms</w:t>
+            </w:r>
+          </w:p>
+        </w:tc>
+        <w:tc>
+          <w:tcPr/>
+          <w:p>
+            <w:pPr>
+              <w:pStyle w:val="Compact"/>
+              <w:jc w:val="left"/>
+            </w:pPr>
+            <w:r>
+              <w:t xml:space="preserve">0.0 mV / 0.0014</w:t>
+            </w:r>
+          </w:p>
+        </w:tc>
+        <w:tc>
+          <w:tcPr/>
+          <w:p>
+            <w:pPr>
+              <w:pStyle w:val="Compact"/>
+              <w:jc w:val="left"/>
+            </w:pPr>
+            <w:r>
+              <w:t xml:space="preserve">0</w:t>
             </w:r>
           </w:p>
         </w:tc>
@@ -5904,19 +6253,19 @@
               <w:jc w:val="left"/>
             </w:pPr>
             <w:r>
-              <w:t xml:space="preserve">Worst</w:t>
-            </w:r>
-          </w:p>
-        </w:tc>
-        <w:tc>
-          <w:tcPr/>
-          <w:p>
-            <w:pPr>
-              <w:pStyle w:val="Compact"/>
-              <w:jc w:val="left"/>
-            </w:pPr>
-            <w:r>
-              <w:t xml:space="preserve">Vin step</w:t>
+              <w:t xml:space="preserve">Worst (16-bit, 5×)</w:t>
+            </w:r>
+          </w:p>
+        </w:tc>
+        <w:tc>
+          <w:tcPr/>
+          <w:p>
+            <w:pPr>
+              <w:pStyle w:val="Compact"/>
+              <w:jc w:val="left"/>
+            </w:pPr>
+            <w:r>
+              <w:t xml:space="preserve">V_in step</w:t>
             </w:r>
           </w:p>
         </w:tc>
@@ -5940,7 +6289,19 @@
               <w:jc w:val="left"/>
             </w:pPr>
             <w:r>
-              <w:t xml:space="preserve">8.9 V / 0.535</w:t>
+              <w:t xml:space="preserve">5.0 V / 1.132</w:t>
+            </w:r>
+          </w:p>
+        </w:tc>
+        <w:tc>
+          <w:tcPr/>
+          <w:p>
+            <w:pPr>
+              <w:pStyle w:val="Compact"/>
+              <w:jc w:val="left"/>
+            </w:pPr>
+            <w:r>
+              <w:t xml:space="preserve">266,015</w:t>
             </w:r>
           </w:p>
         </w:tc>
@@ -5954,7 +6315,7 @@
               <w:jc w:val="left"/>
             </w:pPr>
             <w:r>
-              <w:t xml:space="preserve">Worst</w:t>
+              <w:t xml:space="preserve">Worst (16-bit, 5×)</w:t>
             </w:r>
           </w:p>
         </w:tc>
@@ -5990,7 +6351,19 @@
               <w:jc w:val="left"/>
             </w:pPr>
             <w:r>
-              <w:t xml:space="preserve">5.9 V / 0.353</w:t>
+              <w:t xml:space="preserve">5.0 V / 1.132</w:t>
+            </w:r>
+          </w:p>
+        </w:tc>
+        <w:tc>
+          <w:tcPr/>
+          <w:p>
+            <w:pPr>
+              <w:pStyle w:val="Compact"/>
+              <w:jc w:val="left"/>
+            </w:pPr>
+            <w:r>
+              <w:t xml:space="preserve">163,360</w:t>
             </w:r>
           </w:p>
         </w:tc>
@@ -6813,6 +7186,9 @@
         <w:t xml:space="preserve"> </w:t>
       </w:r>
       <w:r>
+        <w:t xml:space="preserve">(Mohan and Barai 2012; Vinodhini et al. 2014)</w:t>
+      </w:r>
+      <w:r>
         <w:t xml:space="preserve"> </w:t>
       </w:r>
       <w:r>
@@ -6820,6 +7196,9 @@
       </w:r>
       <w:r>
         <w:t xml:space="preserve"> </w:t>
+      </w:r>
+      <w:r>
+        <w:t xml:space="preserve">(Suhitha et al. 2024)</w:t>
       </w:r>
       <w:r>
         <w:t xml:space="preserve">.</w:t>
@@ -6864,10 +7243,41 @@
         </w:r>
       </w:hyperlink>
       <w:r>
-        <w:t xml:space="preserve">. The ADC dominates: the calibrated millivolt read averages</w:t>
-      </w:r>
-      <w:r>
-        <w:t xml:space="preserve"> </w:t>
+        <w:t xml:space="preserve">. The ADC dominates: the raw 12-bit read, which is the path executed inside the timed control loop, averages</w:t>
+      </w:r>
+      <w:r>
+        <w:t xml:space="preserve"> </w:t>
+      </w:r>
+      <m:oMath>
+        <m:r>
+          <m:t>60.0</m:t>
+        </m:r>
+        <m:r>
+          <m:t> </m:t>
+        </m:r>
+        <m:r>
+          <m:t>μ</m:t>
+        </m:r>
+      </m:oMath>
+      <w:r>
+        <w:t xml:space="preserve">s and the fastest single raw read never completes sooner than</w:t>
+      </w:r>
+      <w:r>
+        <w:t xml:space="preserve"> </w:t>
+      </w:r>
+      <m:oMath>
+        <m:r>
+          <m:t>59.5</m:t>
+        </m:r>
+        <m:r>
+          <m:t> </m:t>
+        </m:r>
+        <m:r>
+          <m:t>μ</m:t>
+        </m:r>
+      </m:oMath>
+      <w:r>
+        <w:t xml:space="preserve">s; the slower calibrated millivolt read (</w:t>
       </w:r>
       <m:oMath>
         <m:r>
@@ -6881,41 +7291,7 @@
         </m:r>
       </m:oMath>
       <w:r>
-        <w:t xml:space="preserve">s, the raw 12-bit read</w:t>
-      </w:r>
-      <w:r>
-        <w:t xml:space="preserve"> </w:t>
-      </w:r>
-      <m:oMath>
-        <m:r>
-          <m:t>60.0</m:t>
-        </m:r>
-        <m:r>
-          <m:t> </m:t>
-        </m:r>
-        <m:r>
-          <m:t>μ</m:t>
-        </m:r>
-      </m:oMath>
-      <w:r>
-        <w:t xml:space="preserve">s, and the fastest single read never completes sooner than</w:t>
-      </w:r>
-      <w:r>
-        <w:t xml:space="preserve"> </w:t>
-      </w:r>
-      <m:oMath>
-        <m:r>
-          <m:t>59.5</m:t>
-        </m:r>
-        <m:r>
-          <m:t> </m:t>
-        </m:r>
-        <m:r>
-          <m:t>μ</m:t>
-        </m:r>
-      </m:oMath>
-      <w:r>
-        <w:t xml:space="preserve">s. The PID step itself is negligible: the int32 fixed-point pipeline averages</w:t>
+        <w:t xml:space="preserve">s) is measured for comparison only and never runs inside the loop. The PID step itself is negligible: the int32 fixed-point pipeline averages</w:t>
       </w:r>
       <w:r>
         <w:t xml:space="preserve"> </w:t>
@@ -7712,7 +8088,7 @@
         </m:r>
       </m:oMath>
       <w:r>
-        <w:t xml:space="preserve">18 mV in every cell, and the per-cell IAE variation (6.8-8.3) is within the run-to-run noise of the platform. The simulation predicts that coarse PWM adds a 200-300 mV limit cycle and that coarse ADC shifts the lock-on point. On the ESP32-S3 these effects do not appear, because the acquisition noise floor is far larger: the averaged read at this schedule carries</w:t>
+        <w:t xml:space="preserve">18 mV in every cell, and the per-cell IAE variation (6.8-8.3) is within the run-to-run noise of the platform. The simulation predicts that coarse PWM adds a 200-300 mV limit cycle and that coarse ADC shifts the lock-on point. On the ESP32-S3 these effects do not appear, because the acquisition noise floor is far larger: the raw 12-bit read at this schedule carries</w:t>
       </w:r>
       <w:r>
         <w:t xml:space="preserve"> </w:t>
@@ -7815,7 +8191,7 @@
         </m:r>
       </m:oMath>
       <w:r>
-        <w:t xml:space="preserve">1.5 V at N=64), and the closed-loop ripple remains at 1.6-1.9 V peak-to-peak regardless of resolution. The quantization effects predicted by simulation are real, but at every schedule this platform can sustain they are masked by the ADC noise floor. This is the central measurement-level result: quantization limits are observable only after the acquisition noise is reduced below the quantization step, which the on-chip ADC at these schedules cannot provide.</w:t>
+        <w:t xml:space="preserve">1.5 V at N=64), so even the loop’s light EMA-filtered measurement carries 1.6-1.9 V peak-to-peak ripple, flat across resolutions. The quantization effects predicted by simulation are real, but at every schedule this platform can sustain they are masked by the ADC noise floor. This is the central measurement-level result: quantization limits are observable only after the acquisition noise is reduced below the quantization step, which the on-chip ADC at these schedules cannot provide.</w:t>
       </w:r>
     </w:p>
     <w:bookmarkStart w:id="55" w:name="fig:effres"/>
@@ -8737,7 +9113,7 @@
       </w:r>
     </w:p>
     <w:bookmarkEnd w:id="73"/>
-    <w:bookmarkStart w:id="74" w:name="acknowledgment"/>
+    <w:bookmarkStart w:id="116" w:name="acknowledgment"/>
     <w:p>
       <w:pPr>
         <w:pStyle w:val="Heading1"/>
@@ -8751,10 +9127,1468 @@
         <w:pStyle w:val="FirstParagraph"/>
       </w:pPr>
       <w:r>
-        <w:t xml:space="preserve">The authors thank Tareq Anwar Shikdar for guidance; no external funding was received.</w:t>
+        <w:t xml:space="preserve">The authors thank Leading University, Sylhet for support and guidance; no external funding was received.</w:t>
+      </w:r>
+    </w:p>
+    <w:bookmarkStart w:id="115" w:name="refs"/>
+    <w:bookmarkStart w:id="74" w:name="ref-ahmad2010"/>
+    <w:p>
+      <w:pPr>
+        <w:pStyle w:val="Bibliography"/>
+      </w:pPr>
+      <w:r>
+        <w:t xml:space="preserve">Ahmad, H. H., and B. Bakkaloglu. 2010.</w:t>
+      </w:r>
+      <w:r>
+        <w:t xml:space="preserve"> </w:t>
+      </w:r>
+      <w:r>
+        <w:t xml:space="preserve">“A 300mA 14mV-Ripple Digitally Controlled Buck Converter Using Frequency Domain Delta-Sigma ADC and Hybrid PWM Generator.”</w:t>
+      </w:r>
+      <w:r>
+        <w:t xml:space="preserve"> </w:t>
+      </w:r>
+      <w:r>
+        <w:rPr>
+          <w:i/>
+          <w:iCs/>
+        </w:rPr>
+        <w:t xml:space="preserve">Proc. IEEE Int. Solid-State Circuits Conf. (ISSCC)</w:t>
+      </w:r>
+      <w:r>
+        <w:t xml:space="preserve">, 202–3.</w:t>
       </w:r>
     </w:p>
     <w:bookmarkEnd w:id="74"/>
+    <w:bookmarkStart w:id="75" w:name="ref-alobaidi2025"/>
+    <w:p>
+      <w:pPr>
+        <w:pStyle w:val="Bibliography"/>
+      </w:pPr>
+      <w:r>
+        <w:t xml:space="preserve">Al-Obaidi, N. A., and A. K. Nawar. 2025.</w:t>
+      </w:r>
+      <w:r>
+        <w:t xml:space="preserve"> </w:t>
+      </w:r>
+      <w:r>
+        <w:t xml:space="preserve">“End-to-End Quantization Co-Design for</w:t>
+      </w:r>
+      <w:r>
+        <w:t xml:space="preserve"> </w:t>
+      </w:r>
+      <w:r>
+        <w:t xml:space="preserve">MHz</w:t>
+      </w:r>
+      <w:r>
+        <w:t xml:space="preserve"> </w:t>
+      </w:r>
+      <w:r>
+        <w:t xml:space="preserve">GaN</w:t>
+      </w:r>
+      <w:r>
+        <w:t xml:space="preserve"> </w:t>
+      </w:r>
+      <w:r>
+        <w:t xml:space="preserve">Converters Using Dither and Sigma-Delta Modulation.”</w:t>
+      </w:r>
+      <w:r>
+        <w:t xml:space="preserve"> </w:t>
+      </w:r>
+      <w:r>
+        <w:rPr>
+          <w:i/>
+          <w:iCs/>
+        </w:rPr>
+        <w:t xml:space="preserve">Edison J. Electr. Electron. Eng.</w:t>
+      </w:r>
+      <w:r>
+        <w:t xml:space="preserve"> </w:t>
+      </w:r>
+      <w:r>
+        <w:t xml:space="preserve">3: 65–75.</w:t>
+      </w:r>
+    </w:p>
+    <w:bookmarkEnd w:id="75"/>
+    <w:bookmarkStart w:id="76" w:name="ref-bibian2002"/>
+    <w:p>
+      <w:pPr>
+        <w:pStyle w:val="Bibliography"/>
+      </w:pPr>
+      <w:r>
+        <w:t xml:space="preserve">Bibian, S., and H. Jin. 2002.</w:t>
+      </w:r>
+      <w:r>
+        <w:t xml:space="preserve"> </w:t>
+      </w:r>
+      <w:r>
+        <w:t xml:space="preserve">“High Performance Predictive Dead-Beat Digital Controller for</w:t>
+      </w:r>
+      <w:r>
+        <w:t xml:space="preserve"> </w:t>
+      </w:r>
+      <w:r>
+        <w:t xml:space="preserve">DC</w:t>
+      </w:r>
+      <w:r>
+        <w:t xml:space="preserve"> </w:t>
+      </w:r>
+      <w:r>
+        <w:t xml:space="preserve">Power Supplies.”</w:t>
+      </w:r>
+      <w:r>
+        <w:t xml:space="preserve"> </w:t>
+      </w:r>
+      <w:r>
+        <w:rPr>
+          <w:i/>
+          <w:iCs/>
+        </w:rPr>
+        <w:t xml:space="preserve">IEEE Trans. Power Electron.</w:t>
+      </w:r>
+      <w:r>
+        <w:t xml:space="preserve"> </w:t>
+      </w:r>
+      <w:r>
+        <w:t xml:space="preserve">17 (3): 420–27.</w:t>
+      </w:r>
+    </w:p>
+    <w:bookmarkEnd w:id="76"/>
+    <w:bookmarkStart w:id="77" w:name="ref-chakraborty2006"/>
+    <w:p>
+      <w:pPr>
+        <w:pStyle w:val="Bibliography"/>
+      </w:pPr>
+      <w:r>
+        <w:t xml:space="preserve">Chakraborty, A., A. Khaligh, A. Emadi, and A. Pfaelzer. 2006.</w:t>
+      </w:r>
+      <w:r>
+        <w:t xml:space="preserve"> </w:t>
+      </w:r>
+      <w:r>
+        <w:t xml:space="preserve">“Digital Combination of Buck and Boost Converters to Control a Positive Buck-Boost Converter.”</w:t>
+      </w:r>
+      <w:r>
+        <w:t xml:space="preserve"> </w:t>
+      </w:r>
+      <w:r>
+        <w:rPr>
+          <w:i/>
+          <w:iCs/>
+        </w:rPr>
+        <w:t xml:space="preserve">Proc. 37th IEEE Power Electron. Specialists Conf. (PESC)</w:t>
+      </w:r>
+      <w:r>
+        <w:t xml:space="preserve">, 1–6.</w:t>
+      </w:r>
+    </w:p>
+    <w:bookmarkEnd w:id="77"/>
+    <w:bookmarkStart w:id="78" w:name="ref-chen2003"/>
+    <w:p>
+      <w:pPr>
+        <w:pStyle w:val="Bibliography"/>
+      </w:pPr>
+      <w:r>
+        <w:t xml:space="preserve">Chen, J., A. Prodić, R. W. Erickson, and D. Maksimovic. 2003.</w:t>
+      </w:r>
+      <w:r>
+        <w:t xml:space="preserve"> </w:t>
+      </w:r>
+      <w:r>
+        <w:t xml:space="preserve">“Predictive Digital Current Programmed Control.”</w:t>
+      </w:r>
+      <w:r>
+        <w:t xml:space="preserve"> </w:t>
+      </w:r>
+      <w:r>
+        <w:rPr>
+          <w:i/>
+          <w:iCs/>
+        </w:rPr>
+        <w:t xml:space="preserve">IEEE Trans. Power Electron.</w:t>
+      </w:r>
+      <w:r>
+        <w:t xml:space="preserve"> </w:t>
+      </w:r>
+      <w:r>
+        <w:t xml:space="preserve">18 (1): 411–19.</w:t>
+      </w:r>
+    </w:p>
+    <w:bookmarkEnd w:id="78"/>
+    <w:bookmarkStart w:id="79" w:name="ref-chen2012el"/>
+    <w:p>
+      <w:pPr>
+        <w:pStyle w:val="Bibliography"/>
+      </w:pPr>
+      <w:r>
+        <w:t xml:space="preserve">Chen, Q., Z. H. Shen, N. Yan, X. Tan, and H. Min. 2012.</w:t>
+      </w:r>
+      <w:r>
+        <w:t xml:space="preserve"> </w:t>
+      </w:r>
+      <w:r>
+        <w:t xml:space="preserve">“Monolithic Digitally Controlled Buck Converter with TDC-Based ADC Sharing Delay Cells with DPWM.”</w:t>
+      </w:r>
+      <w:r>
+        <w:t xml:space="preserve"> </w:t>
+      </w:r>
+      <w:r>
+        <w:rPr>
+          <w:i/>
+          <w:iCs/>
+        </w:rPr>
+        <w:t xml:space="preserve">Electronics Letters</w:t>
+      </w:r>
+      <w:r>
+        <w:t xml:space="preserve"> </w:t>
+      </w:r>
+      <w:r>
+        <w:t xml:space="preserve">48 (20): 1303–4.</w:t>
+      </w:r>
+    </w:p>
+    <w:bookmarkEnd w:id="79"/>
+    <w:bookmarkStart w:id="80" w:name="ref-chen2010c"/>
+    <w:p>
+      <w:pPr>
+        <w:pStyle w:val="Bibliography"/>
+      </w:pPr>
+      <w:r>
+        <w:t xml:space="preserve">Chen, Z., W. Gao, and X. Ye. 2010.</w:t>
+      </w:r>
+      <w:r>
+        <w:t xml:space="preserve"> </w:t>
+      </w:r>
+      <w:r>
+        <w:t xml:space="preserve">“Frequency Domain Closed-Loop Analysis and Sliding Mode Control of a Nonminimum Phase Buck-Boost Converter.”</w:t>
+      </w:r>
+      <w:r>
+        <w:t xml:space="preserve"> </w:t>
+      </w:r>
+      <w:r>
+        <w:rPr>
+          <w:i/>
+          <w:iCs/>
+        </w:rPr>
+        <w:t xml:space="preserve">Control Intell. Syst.</w:t>
+      </w:r>
+      <w:r>
+        <w:t xml:space="preserve"> </w:t>
+      </w:r>
+      <w:r>
+        <w:t xml:space="preserve">38 (4).</w:t>
+      </w:r>
+    </w:p>
+    <w:bookmarkEnd w:id="80"/>
+    <w:bookmarkStart w:id="81" w:name="ref-corradini2015"/>
+    <w:p>
+      <w:pPr>
+        <w:pStyle w:val="Bibliography"/>
+      </w:pPr>
+      <w:r>
+        <w:t xml:space="preserve">Corradini, L., D. Maksimovic, P. Mattavelli, and R. Zane. 2015.</w:t>
+      </w:r>
+      <w:r>
+        <w:t xml:space="preserve"> </w:t>
+      </w:r>
+      <w:r>
+        <w:rPr>
+          <w:i/>
+          <w:iCs/>
+        </w:rPr>
+        <w:t xml:space="preserve">Digital Control of High-Frequency Switched-Mode Power Converters</w:t>
+      </w:r>
+      <w:r>
+        <w:t xml:space="preserve">. Wiley-IEEE Press.</w:t>
+      </w:r>
+    </w:p>
+    <w:bookmarkEnd w:id="81"/>
+    <w:bookmarkStart w:id="82" w:name="ref-crovetti2020"/>
+    <w:p>
+      <w:pPr>
+        <w:pStyle w:val="Bibliography"/>
+      </w:pPr>
+      <w:r>
+        <w:t xml:space="preserve">Crovetti, P. S., M. Usmonov, F. Musolino, and F. Gregoretti. 2020.</w:t>
+      </w:r>
+      <w:r>
+        <w:t xml:space="preserve"> </w:t>
+      </w:r>
+      <w:r>
+        <w:t xml:space="preserve">“Limit-Cycle-Free Digitally Controlled DC-DC Converters Based on Dyadic Digital PWM.”</w:t>
+      </w:r>
+      <w:r>
+        <w:t xml:space="preserve"> </w:t>
+      </w:r>
+      <w:r>
+        <w:rPr>
+          <w:i/>
+          <w:iCs/>
+        </w:rPr>
+        <w:t xml:space="preserve">IEEE Trans. Power Electron.</w:t>
+      </w:r>
+      <w:r>
+        <w:t xml:space="preserve"> </w:t>
+      </w:r>
+      <w:r>
+        <w:t xml:space="preserve">35 (10): 11155–66.</w:t>
+      </w:r>
+    </w:p>
+    <w:bookmarkEnd w:id="82"/>
+    <w:bookmarkStart w:id="83" w:name="ref-dordevic2021"/>
+    <w:p>
+      <w:pPr>
+        <w:pStyle w:val="Bibliography"/>
+      </w:pPr>
+      <w:r>
+        <w:t xml:space="preserve">Dordevic, B., and Z. V. Despotovic. 2021.</w:t>
+      </w:r>
+      <w:r>
+        <w:t xml:space="preserve"> </w:t>
+      </w:r>
+      <w:r>
+        <w:t xml:space="preserve">“Digital Control of Four Switch Synchronous Buck-Boost Power Converter Based on PIC18F4520 Microcontroller.”</w:t>
+      </w:r>
+      <w:r>
+        <w:t xml:space="preserve"> </w:t>
+      </w:r>
+      <w:r>
+        <w:rPr>
+          <w:i/>
+          <w:iCs/>
+        </w:rPr>
+        <w:t xml:space="preserve">Proc. 20th Int. Symp. INFOTEH-JAHORINA (INFOTEH)</w:t>
+      </w:r>
+      <w:r>
+        <w:t xml:space="preserve">, 1–6.</w:t>
+      </w:r>
+    </w:p>
+    <w:bookmarkEnd w:id="83"/>
+    <w:bookmarkStart w:id="84" w:name="ref-erickson2001"/>
+    <w:p>
+      <w:pPr>
+        <w:pStyle w:val="Bibliography"/>
+      </w:pPr>
+      <w:r>
+        <w:t xml:space="preserve">Erickson, R. W., and D. Maksimovic. 2001.</w:t>
+      </w:r>
+      <w:r>
+        <w:t xml:space="preserve"> </w:t>
+      </w:r>
+      <w:r>
+        <w:rPr>
+          <w:i/>
+          <w:iCs/>
+        </w:rPr>
+        <w:t xml:space="preserve">Fundamentals of Power Electronics</w:t>
+      </w:r>
+      <w:r>
+        <w:t xml:space="preserve">. 2nd ed. Kluwer Academic Publishers.</w:t>
+      </w:r>
+    </w:p>
+    <w:bookmarkEnd w:id="84"/>
+    <w:bookmarkStart w:id="85" w:name="ref-foong2011"/>
+    <w:p>
+      <w:pPr>
+        <w:pStyle w:val="Bibliography"/>
+      </w:pPr>
+      <w:r>
+        <w:t xml:space="preserve">Foong, H. C., M. T. Tan, and Y. Zheng. 2011.</w:t>
+      </w:r>
+      <w:r>
+        <w:t xml:space="preserve"> </w:t>
+      </w:r>
+      <w:r>
+        <w:t xml:space="preserve">“Predictive Proportional Integral Controller for Digital DC-DC Converters.”</w:t>
+      </w:r>
+      <w:r>
+        <w:t xml:space="preserve"> </w:t>
+      </w:r>
+      <w:r>
+        <w:rPr>
+          <w:i/>
+          <w:iCs/>
+        </w:rPr>
+        <w:t xml:space="preserve">Proc. 6th IEEE Conf. Industrial Electronics and Applications (ICIEA)</w:t>
+      </w:r>
+      <w:r>
+        <w:t xml:space="preserve">, 2380–83.</w:t>
+      </w:r>
+    </w:p>
+    <w:bookmarkEnd w:id="85"/>
+    <w:bookmarkStart w:id="86" w:name="ref-gong2010"/>
+    <w:p>
+      <w:pPr>
+        <w:pStyle w:val="Bibliography"/>
+      </w:pPr>
+      <w:r>
+        <w:t xml:space="preserve">Gong, R.-X., L.-L. Xie, K. Wang, and C.-D. Ning. 2010.</w:t>
+      </w:r>
+      <w:r>
+        <w:t xml:space="preserve"> </w:t>
+      </w:r>
+      <w:r>
+        <w:t xml:space="preserve">“A Novel Modeling Method of Nonideal Buck-Boost Converter in DCM.”</w:t>
+      </w:r>
+      <w:r>
+        <w:t xml:space="preserve"> </w:t>
+      </w:r>
+      <w:r>
+        <w:rPr>
+          <w:i/>
+          <w:iCs/>
+        </w:rPr>
+        <w:t xml:space="preserve">Proc. Third Int. Conf. Information and Computing (ICIC)</w:t>
+      </w:r>
+      <w:r>
+        <w:t xml:space="preserve">, 182–85.</w:t>
+      </w:r>
+    </w:p>
+    <w:bookmarkEnd w:id="86"/>
+    <w:bookmarkStart w:id="87" w:name="ref-gonzalez2020"/>
+    <w:p>
+      <w:pPr>
+        <w:pStyle w:val="Bibliography"/>
+      </w:pPr>
+      <w:r>
+        <w:t xml:space="preserve">González-Castaño, C., C. Restrepo, R. Giral, E. Vidal-Idiarte, and J. Calvente. 2020.</w:t>
+      </w:r>
+      <w:r>
+        <w:t xml:space="preserve"> </w:t>
+      </w:r>
+      <w:r>
+        <w:t xml:space="preserve">“ADC Quantization Effects in Two-Loop Digital Current Controlled</w:t>
+      </w:r>
+      <w:r>
+        <w:t xml:space="preserve"> </w:t>
+      </w:r>
+      <w:r>
+        <w:t xml:space="preserve">DC-DC</w:t>
+      </w:r>
+      <w:r>
+        <w:t xml:space="preserve"> </w:t>
+      </w:r>
+      <w:r>
+        <w:t xml:space="preserve">Power Converters: Analysis and Design Guidelines.”</w:t>
+      </w:r>
+      <w:r>
+        <w:t xml:space="preserve"> </w:t>
+      </w:r>
+      <w:r>
+        <w:rPr>
+          <w:i/>
+          <w:iCs/>
+        </w:rPr>
+        <w:t xml:space="preserve">Applied Sciences</w:t>
+      </w:r>
+      <w:r>
+        <w:t xml:space="preserve"> </w:t>
+      </w:r>
+      <w:r>
+        <w:t xml:space="preserve">10 (20): 7179.</w:t>
+      </w:r>
+    </w:p>
+    <w:bookmarkEnd w:id="87"/>
+    <w:bookmarkStart w:id="88" w:name="ref-he2007"/>
+    <w:p>
+      <w:pPr>
+        <w:pStyle w:val="Bibliography"/>
+      </w:pPr>
+      <w:r>
+        <w:t xml:space="preserve">He, M., J. Xu, Z. Zhou, N. Chen, and G. Zhou. 2007.</w:t>
+      </w:r>
+      <w:r>
+        <w:t xml:space="preserve"> </w:t>
+      </w:r>
+      <w:r>
+        <w:t xml:space="preserve">“Nonlinear Compensation in Digital Controller of Switching DC-DC Converters.”</w:t>
+      </w:r>
+      <w:r>
+        <w:t xml:space="preserve"> </w:t>
+      </w:r>
+      <w:r>
+        <w:rPr>
+          <w:i/>
+          <w:iCs/>
+        </w:rPr>
+        <w:t xml:space="preserve">Proc. Int. Conf. Communications, Circuits and Systems (ICCCAS)</w:t>
+      </w:r>
+      <w:r>
+        <w:t xml:space="preserve">, 1269–73.</w:t>
+      </w:r>
+    </w:p>
+    <w:bookmarkEnd w:id="88"/>
+    <w:bookmarkStart w:id="89" w:name="ref-heemels2012"/>
+    <w:p>
+      <w:pPr>
+        <w:pStyle w:val="Bibliography"/>
+      </w:pPr>
+      <w:r>
+        <w:t xml:space="preserve">Heemels, W. P. M. H., K. H. Johansson, and P. Tabuada. 2012.</w:t>
+      </w:r>
+      <w:r>
+        <w:t xml:space="preserve"> </w:t>
+      </w:r>
+      <w:r>
+        <w:t xml:space="preserve">“An Introduction to Event-Triggered and Self-Triggered Control.”</w:t>
+      </w:r>
+      <w:r>
+        <w:t xml:space="preserve"> </w:t>
+      </w:r>
+      <w:r>
+        <w:rPr>
+          <w:i/>
+          <w:iCs/>
+        </w:rPr>
+        <w:t xml:space="preserve">Proc. IEEE 51st Conf. Decision and Control (CDC)</w:t>
+      </w:r>
+      <w:r>
+        <w:t xml:space="preserve">, 3270–85.</w:t>
+      </w:r>
+    </w:p>
+    <w:bookmarkEnd w:id="89"/>
+    <w:bookmarkStart w:id="90" w:name="ref-hu2008"/>
+    <w:p>
+      <w:pPr>
+        <w:pStyle w:val="Bibliography"/>
+      </w:pPr>
+      <w:r>
+        <w:t xml:space="preserve">Hu, H., V. Yousefzadeh, and D. Maksimovic. 2008.</w:t>
+      </w:r>
+      <w:r>
+        <w:t xml:space="preserve"> </w:t>
+      </w:r>
+      <w:r>
+        <w:t xml:space="preserve">“Nonuniform</w:t>
+      </w:r>
+      <w:r>
+        <w:t xml:space="preserve"> </w:t>
+      </w:r>
+      <w:r>
+        <w:t xml:space="preserve">A/D</w:t>
+      </w:r>
+      <w:r>
+        <w:t xml:space="preserve"> </w:t>
+      </w:r>
+      <w:r>
+        <w:t xml:space="preserve">Quantization for Improved Dynamic Responses of Digitally Controlled</w:t>
+      </w:r>
+      <w:r>
+        <w:t xml:space="preserve"> </w:t>
+      </w:r>
+      <w:r>
+        <w:t xml:space="preserve">DC-DC</w:t>
+      </w:r>
+      <w:r>
+        <w:t xml:space="preserve"> </w:t>
+      </w:r>
+      <w:r>
+        <w:t xml:space="preserve">Converters.”</w:t>
+      </w:r>
+      <w:r>
+        <w:t xml:space="preserve"> </w:t>
+      </w:r>
+      <w:r>
+        <w:rPr>
+          <w:i/>
+          <w:iCs/>
+        </w:rPr>
+        <w:t xml:space="preserve">IEEE Trans. Power Electron.</w:t>
+      </w:r>
+      <w:r>
+        <w:t xml:space="preserve"> </w:t>
+      </w:r>
+      <w:r>
+        <w:t xml:space="preserve">23 (4): 1998–2005.</w:t>
+      </w:r>
+    </w:p>
+    <w:bookmarkEnd w:id="90"/>
+    <w:bookmarkStart w:id="91" w:name="ref-kim2024"/>
+    <w:p>
+      <w:pPr>
+        <w:pStyle w:val="Bibliography"/>
+      </w:pPr>
+      <w:r>
+        <w:t xml:space="preserve">Kim, H., Y. Choi, D. Kim, and J. Kim. 2024.</w:t>
+      </w:r>
+      <w:r>
+        <w:t xml:space="preserve"> </w:t>
+      </w:r>
+      <w:r>
+        <w:t xml:space="preserve">“A GaN-Based Digitally Controlled DC-DC Buck Converter with an ADC-Based Digital Controller and Soft-Start Function.”</w:t>
+      </w:r>
+      <w:r>
+        <w:t xml:space="preserve"> </w:t>
+      </w:r>
+      <w:r>
+        <w:rPr>
+          <w:i/>
+          <w:iCs/>
+        </w:rPr>
+        <w:t xml:space="preserve">Proc. IEEE Int. Conf. Consumer Electron.-Asia (ICCE-Asia)</w:t>
+      </w:r>
+      <w:r>
+        <w:t xml:space="preserve">, 1–2.</w:t>
+      </w:r>
+    </w:p>
+    <w:bookmarkEnd w:id="91"/>
+    <w:bookmarkStart w:id="92" w:name="ref-liu2009"/>
+    <w:p>
+      <w:pPr>
+        <w:pStyle w:val="Bibliography"/>
+      </w:pPr>
+      <w:r>
+        <w:t xml:space="preserve">Liu, Y.-F., E. Meyer, and X. Liu. 2009.</w:t>
+      </w:r>
+      <w:r>
+        <w:t xml:space="preserve"> </w:t>
+      </w:r>
+      <w:r>
+        <w:t xml:space="preserve">“Recent Developments in Digital Control Strategies for</w:t>
+      </w:r>
+      <w:r>
+        <w:t xml:space="preserve"> </w:t>
+      </w:r>
+      <w:r>
+        <w:t xml:space="preserve">DC/DC</w:t>
+      </w:r>
+      <w:r>
+        <w:t xml:space="preserve"> </w:t>
+      </w:r>
+      <w:r>
+        <w:t xml:space="preserve">Switching Power Converters.”</w:t>
+      </w:r>
+      <w:r>
+        <w:t xml:space="preserve"> </w:t>
+      </w:r>
+      <w:r>
+        <w:rPr>
+          <w:i/>
+          <w:iCs/>
+        </w:rPr>
+        <w:t xml:space="preserve">IEEE Trans. Power Electron.</w:t>
+      </w:r>
+      <w:r>
+        <w:t xml:space="preserve"> </w:t>
+      </w:r>
+      <w:r>
+        <w:t xml:space="preserve">24 (11): 2567–77.</w:t>
+      </w:r>
+    </w:p>
+    <w:bookmarkEnd w:id="92"/>
+    <w:bookmarkStart w:id="93" w:name="ref-lukic2007"/>
+    <w:p>
+      <w:pPr>
+        <w:pStyle w:val="Bibliography"/>
+      </w:pPr>
+      <w:r>
+        <w:t xml:space="preserve">Lukic, Z., N. Rahman, and A. Prodić. 2007.</w:t>
+      </w:r>
+      <w:r>
+        <w:t xml:space="preserve"> </w:t>
+      </w:r>
+      <w:r>
+        <w:t xml:space="preserve">“Multibit</w:t>
+      </w:r>
+      <w:r>
+        <w:t xml:space="preserve"> </w:t>
+      </w:r>
+      <w:r>
+        <w:t xml:space="preserve">Sigma-Delta</w:t>
+      </w:r>
+      <w:r>
+        <w:t xml:space="preserve"> </w:t>
+      </w:r>
+      <w:r>
+        <w:t xml:space="preserve">PWM</w:t>
+      </w:r>
+      <w:r>
+        <w:t xml:space="preserve"> </w:t>
+      </w:r>
+      <w:r>
+        <w:t xml:space="preserve">Digital Controller</w:t>
+      </w:r>
+      <w:r>
+        <w:t xml:space="preserve"> </w:t>
+      </w:r>
+      <w:r>
+        <w:t xml:space="preserve">IC</w:t>
+      </w:r>
+      <w:r>
+        <w:t xml:space="preserve"> </w:t>
+      </w:r>
+      <w:r>
+        <w:t xml:space="preserve">for</w:t>
+      </w:r>
+      <w:r>
+        <w:t xml:space="preserve"> </w:t>
+      </w:r>
+      <w:r>
+        <w:t xml:space="preserve">DC-DC</w:t>
+      </w:r>
+      <w:r>
+        <w:t xml:space="preserve"> </w:t>
+      </w:r>
+      <w:r>
+        <w:t xml:space="preserve">Converters Operating at Switching Frequencies Beyond 10</w:t>
+      </w:r>
+      <w:r>
+        <w:t xml:space="preserve"> </w:t>
+      </w:r>
+      <w:r>
+        <w:t xml:space="preserve">MHz</w:t>
+      </w:r>
+      <w:r>
+        <w:t xml:space="preserve">.”</w:t>
+      </w:r>
+      <w:r>
+        <w:t xml:space="preserve"> </w:t>
+      </w:r>
+      <w:r>
+        <w:rPr>
+          <w:i/>
+          <w:iCs/>
+        </w:rPr>
+        <w:t xml:space="preserve">IEEE Trans. Power Electron.</w:t>
+      </w:r>
+      <w:r>
+        <w:t xml:space="preserve"> </w:t>
+      </w:r>
+      <w:r>
+        <w:t xml:space="preserve">22 (5): 1693–707.</w:t>
+      </w:r>
+    </w:p>
+    <w:bookmarkEnd w:id="93"/>
+    <w:bookmarkStart w:id="94" w:name="ref-maksimovic2007"/>
+    <w:p>
+      <w:pPr>
+        <w:pStyle w:val="Bibliography"/>
+      </w:pPr>
+      <w:r>
+        <w:t xml:space="preserve">Maksimovic, D., and R. Zane. 2007.</w:t>
+      </w:r>
+      <w:r>
+        <w:t xml:space="preserve"> </w:t>
+      </w:r>
+      <w:r>
+        <w:t xml:space="preserve">“Small-Signal Discrete-Time Modeling of Digitally Controlled</w:t>
+      </w:r>
+      <w:r>
+        <w:t xml:space="preserve"> </w:t>
+      </w:r>
+      <w:r>
+        <w:t xml:space="preserve">PWM</w:t>
+      </w:r>
+      <w:r>
+        <w:t xml:space="preserve"> </w:t>
+      </w:r>
+      <w:r>
+        <w:t xml:space="preserve">Converters.”</w:t>
+      </w:r>
+      <w:r>
+        <w:t xml:space="preserve"> </w:t>
+      </w:r>
+      <w:r>
+        <w:rPr>
+          <w:i/>
+          <w:iCs/>
+        </w:rPr>
+        <w:t xml:space="preserve">IEEE Trans. Power Electron.</w:t>
+      </w:r>
+      <w:r>
+        <w:t xml:space="preserve"> </w:t>
+      </w:r>
+      <w:r>
+        <w:t xml:space="preserve">22 (6): 2552–56.</w:t>
+      </w:r>
+    </w:p>
+    <w:bookmarkEnd w:id="94"/>
+    <w:bookmarkStart w:id="95" w:name="ref-maksimovic2004"/>
+    <w:p>
+      <w:pPr>
+        <w:pStyle w:val="Bibliography"/>
+      </w:pPr>
+      <w:r>
+        <w:t xml:space="preserve">Maksimovic, D., R. Zane, and R. Erickson. 2004.</w:t>
+      </w:r>
+      <w:r>
+        <w:t xml:space="preserve"> </w:t>
+      </w:r>
+      <w:r>
+        <w:t xml:space="preserve">“Impact of Digital Control in Power Electronics.”</w:t>
+      </w:r>
+      <w:r>
+        <w:t xml:space="preserve"> </w:t>
+      </w:r>
+      <w:r>
+        <w:rPr>
+          <w:i/>
+          <w:iCs/>
+        </w:rPr>
+        <w:t xml:space="preserve">Proc. 16th Int. Symp. Power Semiconductor Devices and ICs (ISPSD)</w:t>
+      </w:r>
+      <w:r>
+        <w:t xml:space="preserve">, 13–22.</w:t>
+      </w:r>
+    </w:p>
+    <w:bookmarkEnd w:id="95"/>
+    <w:bookmarkStart w:id="96" w:name="ref-mohan2012"/>
+    <w:p>
+      <w:pPr>
+        <w:pStyle w:val="Bibliography"/>
+      </w:pPr>
+      <w:r>
+        <w:t xml:space="preserve">Mohan, N., and M. Barai. 2012.</w:t>
+      </w:r>
+      <w:r>
+        <w:t xml:space="preserve"> </w:t>
+      </w:r>
+      <w:r>
+        <w:t xml:space="preserve">“Digital Control of Zero Voltage Switching Buck Converter Using PIC Microcontroller.”</w:t>
+      </w:r>
+      <w:r>
+        <w:t xml:space="preserve"> </w:t>
+      </w:r>
+      <w:r>
+        <w:rPr>
+          <w:i/>
+          <w:iCs/>
+        </w:rPr>
+        <w:t xml:space="preserve">Proc. IEEE 5th India Int. Conf. Power Electron. (IICPE)</w:t>
+      </w:r>
+      <w:r>
+        <w:t xml:space="preserve">, 1–4.</w:t>
+      </w:r>
+    </w:p>
+    <w:bookmarkEnd w:id="96"/>
+    <w:bookmarkStart w:id="97" w:name="ref-norris2008"/>
+    <w:p>
+      <w:pPr>
+        <w:pStyle w:val="Bibliography"/>
+      </w:pPr>
+      <w:r>
+        <w:t xml:space="preserve">Norris, M., L. M. Platon, E. Alarcon, and D. Maksimovic. 2008.</w:t>
+      </w:r>
+      <w:r>
+        <w:t xml:space="preserve"> </w:t>
+      </w:r>
+      <w:r>
+        <w:t xml:space="preserve">“Quantization Noise Shaping in Digital</w:t>
+      </w:r>
+      <w:r>
+        <w:t xml:space="preserve"> </w:t>
+      </w:r>
+      <w:r>
+        <w:t xml:space="preserve">PWM</w:t>
+      </w:r>
+      <w:r>
+        <w:t xml:space="preserve"> </w:t>
+      </w:r>
+      <w:r>
+        <w:t xml:space="preserve">Converters.”</w:t>
+      </w:r>
+      <w:r>
+        <w:t xml:space="preserve"> </w:t>
+      </w:r>
+      <w:r>
+        <w:rPr>
+          <w:i/>
+          <w:iCs/>
+        </w:rPr>
+        <w:t xml:space="preserve">Proc. IEEE Power Electron. Specialists Conf. (PESC)</w:t>
+      </w:r>
+      <w:r>
+        <w:t xml:space="preserve">, 127–33.</w:t>
+      </w:r>
+    </w:p>
+    <w:bookmarkEnd w:id="97"/>
+    <w:bookmarkStart w:id="98" w:name="ref-patella2003"/>
+    <w:p>
+      <w:pPr>
+        <w:pStyle w:val="Bibliography"/>
+      </w:pPr>
+      <w:r>
+        <w:t xml:space="preserve">Patella, B. J., A. Prodić, A. Zirger, and D. Maksimovic. 2003.</w:t>
+      </w:r>
+      <w:r>
+        <w:t xml:space="preserve"> </w:t>
+      </w:r>
+      <w:r>
+        <w:t xml:space="preserve">“High-Frequency Digital</w:t>
+      </w:r>
+      <w:r>
+        <w:t xml:space="preserve"> </w:t>
+      </w:r>
+      <w:r>
+        <w:t xml:space="preserve">PWM</w:t>
+      </w:r>
+      <w:r>
+        <w:t xml:space="preserve"> </w:t>
+      </w:r>
+      <w:r>
+        <w:t xml:space="preserve">Controller</w:t>
+      </w:r>
+      <w:r>
+        <w:t xml:space="preserve"> </w:t>
+      </w:r>
+      <w:r>
+        <w:t xml:space="preserve">IC</w:t>
+      </w:r>
+      <w:r>
+        <w:t xml:space="preserve"> </w:t>
+      </w:r>
+      <w:r>
+        <w:t xml:space="preserve">for</w:t>
+      </w:r>
+      <w:r>
+        <w:t xml:space="preserve"> </w:t>
+      </w:r>
+      <w:r>
+        <w:t xml:space="preserve">DC-DC</w:t>
+      </w:r>
+      <w:r>
+        <w:t xml:space="preserve"> </w:t>
+      </w:r>
+      <w:r>
+        <w:t xml:space="preserve">Converters.”</w:t>
+      </w:r>
+      <w:r>
+        <w:t xml:space="preserve"> </w:t>
+      </w:r>
+      <w:r>
+        <w:rPr>
+          <w:i/>
+          <w:iCs/>
+        </w:rPr>
+        <w:t xml:space="preserve">IEEE Trans. Power Electron.</w:t>
+      </w:r>
+      <w:r>
+        <w:t xml:space="preserve"> </w:t>
+      </w:r>
+      <w:r>
+        <w:t xml:space="preserve">18 (1): 438–46.</w:t>
+      </w:r>
+    </w:p>
+    <w:bookmarkEnd w:id="98"/>
+    <w:bookmarkStart w:id="99" w:name="ref-peng2007"/>
+    <w:p>
+      <w:pPr>
+        <w:pStyle w:val="Bibliography"/>
+      </w:pPr>
+      <w:r>
+        <w:t xml:space="preserve">Peng, H., D. Prodić, A. Alarcon, and D. Maksimovic. 2007.</w:t>
+      </w:r>
+      <w:r>
+        <w:t xml:space="preserve"> </w:t>
+      </w:r>
+      <w:r>
+        <w:t xml:space="preserve">“Modeling of Quantization Effects in Digitally Controlled</w:t>
+      </w:r>
+      <w:r>
+        <w:t xml:space="preserve"> </w:t>
+      </w:r>
+      <w:r>
+        <w:t xml:space="preserve">DC-DC</w:t>
+      </w:r>
+      <w:r>
+        <w:t xml:space="preserve"> </w:t>
+      </w:r>
+      <w:r>
+        <w:t xml:space="preserve">Converters.”</w:t>
+      </w:r>
+      <w:r>
+        <w:t xml:space="preserve"> </w:t>
+      </w:r>
+      <w:r>
+        <w:rPr>
+          <w:i/>
+          <w:iCs/>
+        </w:rPr>
+        <w:t xml:space="preserve">IEEE Trans. Power Electron.</w:t>
+      </w:r>
+      <w:r>
+        <w:t xml:space="preserve"> </w:t>
+      </w:r>
+      <w:r>
+        <w:t xml:space="preserve">22 (1): 208–15.</w:t>
+      </w:r>
+    </w:p>
+    <w:bookmarkEnd w:id="99"/>
+    <w:bookmarkStart w:id="101" w:name="ref-peterchev2003"/>
+    <w:p>
+      <w:pPr>
+        <w:pStyle w:val="Bibliography"/>
+      </w:pPr>
+      <w:r>
+        <w:t xml:space="preserve">Peterchev, A. V., and S. R. Sanders. 2003.</w:t>
+      </w:r>
+      <w:r>
+        <w:t xml:space="preserve"> </w:t>
+      </w:r>
+      <w:r>
+        <w:t xml:space="preserve">“Quantization Resolution and Limit Cycling in Digitally Controlled</w:t>
+      </w:r>
+      <w:r>
+        <w:t xml:space="preserve"> </w:t>
+      </w:r>
+      <w:r>
+        <w:t xml:space="preserve">PWM</w:t>
+      </w:r>
+      <w:r>
+        <w:t xml:space="preserve"> </w:t>
+      </w:r>
+      <w:r>
+        <w:t xml:space="preserve">Converters.”</w:t>
+      </w:r>
+      <w:r>
+        <w:t xml:space="preserve"> </w:t>
+      </w:r>
+      <w:r>
+        <w:rPr>
+          <w:i/>
+          <w:iCs/>
+        </w:rPr>
+        <w:t xml:space="preserve">IEEE Trans. Power Electron.</w:t>
+      </w:r>
+      <w:r>
+        <w:t xml:space="preserve"> </w:t>
+      </w:r>
+      <w:r>
+        <w:t xml:space="preserve">18 (1): 301–8.</w:t>
+      </w:r>
+      <w:r>
+        <w:t xml:space="preserve"> </w:t>
+      </w:r>
+      <w:hyperlink r:id="rId100">
+        <w:r>
+          <w:rPr>
+            <w:rStyle w:val="Hyperlink"/>
+          </w:rPr>
+          <w:t xml:space="preserve">https://doi.org/10.1109/TPEL.2002.807092</w:t>
+        </w:r>
+      </w:hyperlink>
+      <w:r>
+        <w:t xml:space="preserve">.</w:t>
+      </w:r>
+    </w:p>
+    <w:bookmarkEnd w:id="101"/>
+    <w:bookmarkStart w:id="102" w:name="ref-saysanasongkham2013"/>
+    <w:p>
+      <w:pPr>
+        <w:pStyle w:val="Bibliography"/>
+      </w:pPr>
+      <w:r>
+        <w:t xml:space="preserve">Saysanasongkham, A., S. Fukumoto, M. Arai, S. Takeuchi, and K. Wada. 2013.</w:t>
+      </w:r>
+      <w:r>
+        <w:t xml:space="preserve"> </w:t>
+      </w:r>
+      <w:r>
+        <w:t xml:space="preserve">“An Adaptive Sampling Method for a Highly Reliable Digital Control Power Converter.”</w:t>
+      </w:r>
+      <w:r>
+        <w:t xml:space="preserve"> </w:t>
+      </w:r>
+      <w:r>
+        <w:rPr>
+          <w:i/>
+          <w:iCs/>
+        </w:rPr>
+        <w:t xml:space="preserve">Proc. IEEE Int. Future Energy Electronics Conf. (IFEEC)</w:t>
+      </w:r>
+      <w:r>
+        <w:t xml:space="preserve">, 716–21.</w:t>
+      </w:r>
+    </w:p>
+    <w:bookmarkEnd w:id="102"/>
+    <w:bookmarkStart w:id="103" w:name="ref-suhitha2024"/>
+    <w:p>
+      <w:pPr>
+        <w:pStyle w:val="Bibliography"/>
+      </w:pPr>
+      <w:r>
+        <w:t xml:space="preserve">Suhitha, K., J. Harshavardhan, A. Jaiswal, S. Kumar, and S. Varalakshmi. 2024.</w:t>
+      </w:r>
+      <w:r>
+        <w:t xml:space="preserve"> </w:t>
+      </w:r>
+      <w:r>
+        <w:t xml:space="preserve">“IoT Controlled DC-DC Converter for Remote Power Monitoring and Control.”</w:t>
+      </w:r>
+      <w:r>
+        <w:t xml:space="preserve"> </w:t>
+      </w:r>
+      <w:r>
+        <w:rPr>
+          <w:i/>
+          <w:iCs/>
+        </w:rPr>
+        <w:t xml:space="preserve">Proc. 10th IEEE Int. Conf. Electrical Energy Systems (ICEES)</w:t>
+      </w:r>
+      <w:r>
+        <w:t xml:space="preserve">, 1–6.</w:t>
+      </w:r>
+    </w:p>
+    <w:bookmarkEnd w:id="103"/>
+    <w:bookmarkStart w:id="104" w:name="ref-sun2010"/>
+    <w:p>
+      <w:pPr>
+        <w:pStyle w:val="Bibliography"/>
+      </w:pPr>
+      <w:r>
+        <w:t xml:space="preserve">Sun, A., M. T. Tan, and L. Siek. 2010.</w:t>
+      </w:r>
+      <w:r>
+        <w:t xml:space="preserve"> </w:t>
+      </w:r>
+      <w:r>
+        <w:t xml:space="preserve">“Segmented Hybrid DPWM and Tunable PID Controller for Digital DC-DC Converters.”</w:t>
+      </w:r>
+      <w:r>
+        <w:t xml:space="preserve"> </w:t>
+      </w:r>
+      <w:r>
+        <w:rPr>
+          <w:i/>
+          <w:iCs/>
+        </w:rPr>
+        <w:t xml:space="preserve">Proc. IEEE Int. Symp. Next-Generation Electron. (ISNE)</w:t>
+      </w:r>
+      <w:r>
+        <w:t xml:space="preserve">, 154–57.</w:t>
+      </w:r>
+    </w:p>
+    <w:bookmarkEnd w:id="104"/>
+    <w:bookmarkStart w:id="105" w:name="ref-syed2004"/>
+    <w:p>
+      <w:pPr>
+        <w:pStyle w:val="Bibliography"/>
+      </w:pPr>
+      <w:r>
+        <w:t xml:space="preserve">Syed, A., E. Ahmed, E. Alarcon, and D. Maksimovic. 2004.</w:t>
+      </w:r>
+      <w:r>
+        <w:t xml:space="preserve"> </w:t>
+      </w:r>
+      <w:r>
+        <w:t xml:space="preserve">“Digital Pulse Width Modulator Architectures.”</w:t>
+      </w:r>
+      <w:r>
+        <w:t xml:space="preserve"> </w:t>
+      </w:r>
+      <w:r>
+        <w:rPr>
+          <w:i/>
+          <w:iCs/>
+        </w:rPr>
+        <w:t xml:space="preserve">Proc. IEEE Power Electron. Specialists Conf. (PESC)</w:t>
+      </w:r>
+      <w:r>
+        <w:t xml:space="preserve">, 4689–95.</w:t>
+      </w:r>
+    </w:p>
+    <w:bookmarkEnd w:id="105"/>
+    <w:bookmarkStart w:id="106" w:name="ref-vijayalakshmi2014"/>
+    <w:p>
+      <w:pPr>
+        <w:pStyle w:val="Bibliography"/>
+      </w:pPr>
+      <w:r>
+        <w:t xml:space="preserve">Vijayalakshmi, S., and T. Sree Renga Raja. 2014.</w:t>
+      </w:r>
+      <w:r>
+        <w:t xml:space="preserve"> </w:t>
+      </w:r>
+      <w:r>
+        <w:t xml:space="preserve">“Time Domain Based Digital Controller for Buck-Boost Converter.”</w:t>
+      </w:r>
+      <w:r>
+        <w:t xml:space="preserve"> </w:t>
+      </w:r>
+      <w:r>
+        <w:rPr>
+          <w:i/>
+          <w:iCs/>
+        </w:rPr>
+        <w:t xml:space="preserve">J. Electr. Eng. Technol.</w:t>
+      </w:r>
+      <w:r>
+        <w:t xml:space="preserve"> </w:t>
+      </w:r>
+      <w:r>
+        <w:t xml:space="preserve">9 (5): 1551–61.</w:t>
+      </w:r>
+    </w:p>
+    <w:bookmarkEnd w:id="106"/>
+    <w:bookmarkStart w:id="107" w:name="ref-vinodhini2014"/>
+    <w:p>
+      <w:pPr>
+        <w:pStyle w:val="Bibliography"/>
+      </w:pPr>
+      <w:r>
+        <w:t xml:space="preserve">Vinodhini, R., G. Rajitha, B. Kumar, and A. Kumar. 2014.</w:t>
+      </w:r>
+      <w:r>
+        <w:t xml:space="preserve"> </w:t>
+      </w:r>
+      <w:r>
+        <w:t xml:space="preserve">“dSPACE Based 12/24V Closed Loop Boost Converter for Low Power Applications.”</w:t>
+      </w:r>
+      <w:r>
+        <w:t xml:space="preserve"> </w:t>
+      </w:r>
+      <w:r>
+        <w:rPr>
+          <w:i/>
+          <w:iCs/>
+        </w:rPr>
+        <w:t xml:space="preserve">Proc. Int. Conf. Computation of Power, Energy, Information and Communication (ICCPEIC)</w:t>
+      </w:r>
+      <w:r>
+        <w:t xml:space="preserve">, 213–17.</w:t>
+      </w:r>
+    </w:p>
+    <w:bookmarkEnd w:id="107"/>
+    <w:bookmarkStart w:id="108" w:name="ref-viswanatha2020"/>
+    <w:p>
+      <w:pPr>
+        <w:pStyle w:val="Bibliography"/>
+      </w:pPr>
+      <w:r>
+        <w:t xml:space="preserve">Viswanatha, V., R. V. S. Reddy, and Rajeswari. 2020.</w:t>
+      </w:r>
+      <w:r>
+        <w:t xml:space="preserve"> </w:t>
+      </w:r>
+      <w:r>
+        <w:t xml:space="preserve">“Characterization of Analog and Digital Control Loops for Bidirectional Buck-Boost Converter Using</w:t>
+      </w:r>
+      <w:r>
+        <w:t xml:space="preserve"> </w:t>
+      </w:r>
+      <w:r>
+        <w:t xml:space="preserve">PID/PIDN</w:t>
+      </w:r>
+      <w:r>
+        <w:t xml:space="preserve"> </w:t>
+      </w:r>
+      <w:r>
+        <w:t xml:space="preserve">Algorithms.”</w:t>
+      </w:r>
+      <w:r>
+        <w:t xml:space="preserve"> </w:t>
+      </w:r>
+      <w:r>
+        <w:rPr>
+          <w:i/>
+          <w:iCs/>
+        </w:rPr>
+        <w:t xml:space="preserve">J. Electr. Syst. Inf. Technol.</w:t>
+      </w:r>
+      <w:r>
+        <w:t xml:space="preserve"> </w:t>
+      </w:r>
+      <w:r>
+        <w:t xml:space="preserve">7 (1).</w:t>
+      </w:r>
+    </w:p>
+    <w:bookmarkEnd w:id="108"/>
+    <w:bookmarkStart w:id="109" w:name="ref-white1969"/>
+    <w:p>
+      <w:pPr>
+        <w:pStyle w:val="Bibliography"/>
+      </w:pPr>
+      <w:r>
+        <w:t xml:space="preserve">White, S. A. 1969.</w:t>
+      </w:r>
+      <w:r>
+        <w:t xml:space="preserve"> </w:t>
+      </w:r>
+      <w:r>
+        <w:t xml:space="preserve">“Quantizer-Induced Digital Controller Limit Cycles.”</w:t>
+      </w:r>
+      <w:r>
+        <w:t xml:space="preserve"> </w:t>
+      </w:r>
+      <w:r>
+        <w:rPr>
+          <w:i/>
+          <w:iCs/>
+        </w:rPr>
+        <w:t xml:space="preserve">IEEE Trans. Autom. Control</w:t>
+      </w:r>
+      <w:r>
+        <w:t xml:space="preserve"> </w:t>
+      </w:r>
+      <w:r>
+        <w:t xml:space="preserve">14 (4): 430–32.</w:t>
+      </w:r>
+    </w:p>
+    <w:bookmarkEnd w:id="109"/>
+    <w:bookmarkStart w:id="110" w:name="ref-yao2018"/>
+    <w:p>
+      <w:pPr>
+        <w:pStyle w:val="Bibliography"/>
+      </w:pPr>
+      <w:r>
+        <w:t xml:space="preserve">Yao, J., Y. Ishizuka, K. Shiya, and T. Soejima. 2018.</w:t>
+      </w:r>
+      <w:r>
+        <w:t xml:space="preserve"> </w:t>
+      </w:r>
+      <w:r>
+        <w:t xml:space="preserve">“48V/5V Direct Conversion 1MHz DC-DC Converter with 14ns Time-Delay Digital Control.”</w:t>
+      </w:r>
+      <w:r>
+        <w:t xml:space="preserve"> </w:t>
+      </w:r>
+      <w:r>
+        <w:rPr>
+          <w:i/>
+          <w:iCs/>
+        </w:rPr>
+        <w:t xml:space="preserve">Proc. IEEE Power and Energy Conf. At Illinois (PECI)</w:t>
+      </w:r>
+      <w:r>
+        <w:t xml:space="preserve">, 1–5.</w:t>
+      </w:r>
+    </w:p>
+    <w:bookmarkEnd w:id="110"/>
+    <w:bookmarkStart w:id="111" w:name="ref-yousefzadeh2007"/>
+    <w:p>
+      <w:pPr>
+        <w:pStyle w:val="Bibliography"/>
+      </w:pPr>
+      <w:r>
+        <w:t xml:space="preserve">Yousefzadeh, V., M. Shirazi, and D. Maksimovic. 2007.</w:t>
+      </w:r>
+      <w:r>
+        <w:t xml:space="preserve"> </w:t>
+      </w:r>
+      <w:r>
+        <w:t xml:space="preserve">“Minimum Phase Response in Digitally Controlled Boost and Flyback Converters.”</w:t>
+      </w:r>
+      <w:r>
+        <w:t xml:space="preserve"> </w:t>
+      </w:r>
+      <w:r>
+        <w:rPr>
+          <w:i/>
+          <w:iCs/>
+        </w:rPr>
+        <w:t xml:space="preserve">Proc. IEEE Appl. Power Electron. Conf. (APEC)</w:t>
+      </w:r>
+      <w:r>
+        <w:t xml:space="preserve">, 865–70.</w:t>
+      </w:r>
+    </w:p>
+    <w:bookmarkEnd w:id="111"/>
+    <w:bookmarkStart w:id="112" w:name="ref-yu2023"/>
+    <w:p>
+      <w:pPr>
+        <w:pStyle w:val="Bibliography"/>
+      </w:pPr>
+      <w:r>
+        <w:t xml:space="preserve">Yu, J., W. Zhang, W. Xiong, and Y. Wang. 2023.</w:t>
+      </w:r>
+      <w:r>
+        <w:t xml:space="preserve"> </w:t>
+      </w:r>
+      <w:r>
+        <w:t xml:space="preserve">“A Sliding Mode Controller with Signal Transmission Delay Compensation for the Parallel DC/DC Converter’s Network Control System.”</w:t>
+      </w:r>
+      <w:r>
+        <w:t xml:space="preserve"> </w:t>
+      </w:r>
+      <w:r>
+        <w:rPr>
+          <w:i/>
+          <w:iCs/>
+        </w:rPr>
+        <w:t xml:space="preserve">Electronics</w:t>
+      </w:r>
+      <w:r>
+        <w:t xml:space="preserve"> </w:t>
+      </w:r>
+      <w:r>
+        <w:t xml:space="preserve">13 (1): 121.</w:t>
+      </w:r>
+    </w:p>
+    <w:bookmarkEnd w:id="112"/>
+    <w:bookmarkStart w:id="113" w:name="ref-zhao2007"/>
+    <w:p>
+      <w:pPr>
+        <w:pStyle w:val="Bibliography"/>
+      </w:pPr>
+      <w:r>
+        <w:t xml:space="preserve">Zhao, Z., and A. Prodić. 2007.</w:t>
+      </w:r>
+      <w:r>
+        <w:t xml:space="preserve"> </w:t>
+      </w:r>
+      <w:r>
+        <w:t xml:space="preserve">“Limit-Cycle Oscillations Based Auto-Tuning System for Digitally Controlled</w:t>
+      </w:r>
+      <w:r>
+        <w:t xml:space="preserve"> </w:t>
+      </w:r>
+      <w:r>
+        <w:t xml:space="preserve">DC-DC</w:t>
+      </w:r>
+      <w:r>
+        <w:t xml:space="preserve"> </w:t>
+      </w:r>
+      <w:r>
+        <w:t xml:space="preserve">Power Supplies.”</w:t>
+      </w:r>
+      <w:r>
+        <w:t xml:space="preserve"> </w:t>
+      </w:r>
+      <w:r>
+        <w:rPr>
+          <w:i/>
+          <w:iCs/>
+        </w:rPr>
+        <w:t xml:space="preserve">IEEE Trans. Power Electron.</w:t>
+      </w:r>
+      <w:r>
+        <w:t xml:space="preserve"> </w:t>
+      </w:r>
+      <w:r>
+        <w:t xml:space="preserve">22 (6): 2211–22.</w:t>
+      </w:r>
+    </w:p>
+    <w:bookmarkEnd w:id="113"/>
+    <w:bookmarkStart w:id="114" w:name="ref-zhou2019"/>
+    <w:p>
+      <w:pPr>
+        <w:pStyle w:val="Bibliography"/>
+      </w:pPr>
+      <w:r>
+        <w:t xml:space="preserve">Zhou, L., and M. Preindl. 2019.</w:t>
+      </w:r>
+      <w:r>
+        <w:t xml:space="preserve"> </w:t>
+      </w:r>
+      <w:r>
+        <w:t xml:space="preserve">“Variable-Frequency Explicit Model Predictive Control of Wide Band Gap DC/DC Converter with Critical Soft Switching.”</w:t>
+      </w:r>
+      <w:r>
+        <w:t xml:space="preserve"> </w:t>
+      </w:r>
+      <w:r>
+        <w:rPr>
+          <w:i/>
+          <w:iCs/>
+        </w:rPr>
+        <w:t xml:space="preserve">Proc. IEEE Applied Power Electronics Conf. (APEC)</w:t>
+      </w:r>
+      <w:r>
+        <w:t xml:space="preserve">, 2995–99.</w:t>
+      </w:r>
+    </w:p>
+    <w:bookmarkEnd w:id="114"/>
+    <w:bookmarkEnd w:id="115"/>
+    <w:bookmarkEnd w:id="116"/>
     <w:sectPr>
       <w:footnotePr>
         <w:numRestart w:val="eachSect"/>

</xml_diff>

<commit_message>
Split Eq 3 onto two lines, add IEEE AI-use declaration, fix escaping of % in text and math
</commit_message>
<xml_diff>
--- a/paper.docx
+++ b/paper.docx
@@ -350,7 +350,7 @@
         </m:r>
       </m:oMath>
       <w:r>
-        <w:t xml:space="preserve">) that masks steady-state error at low ADC resolutions; (4) an ESP32-S3 closed-loop implementation whose control-loop latency is measured and decomposed into ADC acquisition, PID execution, and PWM update; (5) an effective-resolution experiment showing that the measured acquisition noise floor masks the quantization effects the simulation predicts; and (6) a lightweight quantization-aware adaptive PID that switches update effort by a measured period and ripple indicator and validates the predicted performance-versus-resource trade-off with an update-reduction ratio of roughly 84\%. The novelty lies not in variable-rate sampling or dithering individually, but in their integration into a resource-aware control framework that is characterized, implemented, and experimentally validated on one platform.</w:t>
+        <w:t xml:space="preserve">) that masks steady-state error at low ADC resolutions; (4) an ESP32-S3 closed-loop implementation whose control-loop latency is measured and decomposed into ADC acquisition, PID execution, and PWM update; (5) an effective-resolution experiment showing that the measured acquisition noise floor masks the quantization effects the simulation predicts; and (6) a lightweight quantization-aware adaptive PID that switches update effort by a measured period and ripple indicator and validates the predicted performance-versus-resource trade-off with an update-reduction ratio of roughly 84%. The novelty lies not in variable-rate sampling or dithering individually, but in their integration into a resource-aware control framework that is characterized, implemented, and experimentally validated on one platform.</w:t>
       </w:r>
     </w:p>
     <w:bookmarkEnd w:id="9"/>
@@ -1524,85 +1524,10 @@
           <m:jc m:val="center"/>
         </m:oMathParaPr>
         <m:oMath>
-          <m:r>
-            <m:t>d</m:t>
-          </m:r>
-          <m:r>
-            <m:rPr>
-              <m:sty m:val="p"/>
-            </m:rPr>
-            <m:t>[</m:t>
-          </m:r>
-          <m:r>
-            <m:t>k</m:t>
-          </m:r>
-          <m:r>
-            <m:rPr>
-              <m:sty m:val="p"/>
-            </m:rPr>
-            <m:t>]</m:t>
-          </m:r>
-          <m:r>
-            <m:rPr>
-              <m:sty m:val="p"/>
-            </m:rPr>
-            <m:t>=</m:t>
-          </m:r>
-          <m:r>
-            <m:t>d</m:t>
-          </m:r>
-          <m:r>
-            <m:rPr>
-              <m:sty m:val="p"/>
-            </m:rPr>
-            <m:t>[</m:t>
-          </m:r>
-          <m:r>
-            <m:t>k</m:t>
-          </m:r>
-          <m:r>
-            <m:rPr>
-              <m:sty m:val="p"/>
-            </m:rPr>
-            <m:t>−</m:t>
-          </m:r>
-          <m:r>
-            <m:t>1</m:t>
-          </m:r>
-          <m:r>
-            <m:rPr>
-              <m:sty m:val="p"/>
-            </m:rPr>
-            <m:t>]</m:t>
-          </m:r>
-          <m:r>
-            <m:rPr>
-              <m:sty m:val="p"/>
-            </m:rPr>
-            <m:t>+</m:t>
-          </m:r>
-          <m:sSub>
+          <m:eqArr>
             <m:e>
               <m:r>
-                <m:t>K</m:t>
-              </m:r>
-            </m:e>
-            <m:sub>
-              <m:r>
-                <m:t>p</m:t>
-              </m:r>
-            </m:sub>
-          </m:sSub>
-          <m:d>
-            <m:dPr>
-              <m:begChr m:val="("/>
-              <m:sepChr m:val=""/>
-              <m:endChr m:val=")"/>
-              <m:grow/>
-            </m:dPr>
-            <m:e>
-              <m:r>
-                <m:t>e</m:t>
+                <m:t>d</m:t>
               </m:r>
               <m:r>
                 <m:rPr>
@@ -1620,167 +1545,16 @@
                 <m:t>]</m:t>
               </m:r>
               <m:r>
-                <m:rPr>
-                  <m:sty m:val="p"/>
-                </m:rPr>
-                <m:t>−</m:t>
-              </m:r>
-              <m:r>
-                <m:t>e</m:t>
+                <m:t>&amp;</m:t>
               </m:r>
               <m:r>
                 <m:rPr>
                   <m:sty m:val="p"/>
                 </m:rPr>
-                <m:t>[</m:t>
+                <m:t>=</m:t>
               </m:r>
               <m:r>
-                <m:t>k</m:t>
-              </m:r>
-              <m:r>
-                <m:rPr>
-                  <m:sty m:val="p"/>
-                </m:rPr>
-                <m:t>−</m:t>
-              </m:r>
-              <m:r>
-                <m:t>1</m:t>
-              </m:r>
-              <m:r>
-                <m:rPr>
-                  <m:sty m:val="p"/>
-                </m:rPr>
-                <m:t>]</m:t>
-              </m:r>
-            </m:e>
-          </m:d>
-          <m:r>
-            <m:rPr>
-              <m:sty m:val="p"/>
-            </m:rPr>
-            <m:t>+</m:t>
-          </m:r>
-          <m:sSub>
-            <m:e>
-              <m:r>
-                <m:t>K</m:t>
-              </m:r>
-            </m:e>
-            <m:sub>
-              <m:r>
-                <m:t>i</m:t>
-              </m:r>
-            </m:sub>
-          </m:sSub>
-          <m:sSub>
-            <m:e>
-              <m:r>
-                <m:t>T</m:t>
-              </m:r>
-            </m:e>
-            <m:sub>
-              <m:r>
-                <m:t>s</m:t>
-              </m:r>
-            </m:sub>
-          </m:sSub>
-          <m:r>
-            <m:t> </m:t>
-          </m:r>
-          <m:r>
-            <m:t>e</m:t>
-          </m:r>
-          <m:r>
-            <m:rPr>
-              <m:sty m:val="p"/>
-            </m:rPr>
-            <m:t>[</m:t>
-          </m:r>
-          <m:r>
-            <m:t>k</m:t>
-          </m:r>
-          <m:r>
-            <m:rPr>
-              <m:sty m:val="p"/>
-            </m:rPr>
-            <m:t>]</m:t>
-          </m:r>
-          <m:r>
-            <m:rPr>
-              <m:sty m:val="p"/>
-            </m:rPr>
-            <m:t>+</m:t>
-          </m:r>
-          <m:f>
-            <m:fPr>
-              <m:type m:val="bar"/>
-            </m:fPr>
-            <m:num>
-              <m:sSub>
-                <m:e>
-                  <m:r>
-                    <m:t>K</m:t>
-                  </m:r>
-                </m:e>
-                <m:sub>
-                  <m:r>
-                    <m:t>d</m:t>
-                  </m:r>
-                </m:sub>
-              </m:sSub>
-            </m:num>
-            <m:den>
-              <m:sSub>
-                <m:e>
-                  <m:r>
-                    <m:t>T</m:t>
-                  </m:r>
-                </m:e>
-                <m:sub>
-                  <m:r>
-                    <m:t>s</m:t>
-                  </m:r>
-                </m:sub>
-              </m:sSub>
-            </m:den>
-          </m:f>
-          <m:d>
-            <m:dPr>
-              <m:begChr m:val="("/>
-              <m:sepChr m:val=""/>
-              <m:endChr m:val=")"/>
-              <m:grow/>
-            </m:dPr>
-            <m:e>
-              <m:r>
-                <m:t>e</m:t>
-              </m:r>
-              <m:r>
-                <m:rPr>
-                  <m:sty m:val="p"/>
-                </m:rPr>
-                <m:t>[</m:t>
-              </m:r>
-              <m:r>
-                <m:t>k</m:t>
-              </m:r>
-              <m:r>
-                <m:rPr>
-                  <m:sty m:val="p"/>
-                </m:rPr>
-                <m:t>]</m:t>
-              </m:r>
-              <m:r>
-                <m:rPr>
-                  <m:sty m:val="p"/>
-                </m:rPr>
-                <m:t>−</m:t>
-              </m:r>
-              <m:r>
-                <m:t>2</m:t>
-              </m:r>
-              <m:r>
-                <m:t>e</m:t>
+                <m:t>d</m:t>
               </m:r>
               <m:r>
                 <m:rPr>
@@ -1812,6 +1586,112 @@
                 </m:rPr>
                 <m:t>+</m:t>
               </m:r>
+              <m:sSub>
+                <m:e>
+                  <m:r>
+                    <m:t>K</m:t>
+                  </m:r>
+                </m:e>
+                <m:sub>
+                  <m:r>
+                    <m:t>p</m:t>
+                  </m:r>
+                </m:sub>
+              </m:sSub>
+              <m:d>
+                <m:dPr>
+                  <m:begChr m:val="("/>
+                  <m:sepChr m:val=""/>
+                  <m:endChr m:val=")"/>
+                  <m:grow/>
+                </m:dPr>
+                <m:e>
+                  <m:r>
+                    <m:t>e</m:t>
+                  </m:r>
+                  <m:r>
+                    <m:rPr>
+                      <m:sty m:val="p"/>
+                    </m:rPr>
+                    <m:t>[</m:t>
+                  </m:r>
+                  <m:r>
+                    <m:t>k</m:t>
+                  </m:r>
+                  <m:r>
+                    <m:rPr>
+                      <m:sty m:val="p"/>
+                    </m:rPr>
+                    <m:t>]</m:t>
+                  </m:r>
+                  <m:r>
+                    <m:rPr>
+                      <m:sty m:val="p"/>
+                    </m:rPr>
+                    <m:t>−</m:t>
+                  </m:r>
+                  <m:r>
+                    <m:t>e</m:t>
+                  </m:r>
+                  <m:r>
+                    <m:rPr>
+                      <m:sty m:val="p"/>
+                    </m:rPr>
+                    <m:t>[</m:t>
+                  </m:r>
+                  <m:r>
+                    <m:t>k</m:t>
+                  </m:r>
+                  <m:r>
+                    <m:rPr>
+                      <m:sty m:val="p"/>
+                    </m:rPr>
+                    <m:t>−</m:t>
+                  </m:r>
+                  <m:r>
+                    <m:t>1</m:t>
+                  </m:r>
+                  <m:r>
+                    <m:rPr>
+                      <m:sty m:val="p"/>
+                    </m:rPr>
+                    <m:t>]</m:t>
+                  </m:r>
+                </m:e>
+              </m:d>
+              <m:r>
+                <m:rPr>
+                  <m:sty m:val="p"/>
+                </m:rPr>
+                <m:t>+</m:t>
+              </m:r>
+              <m:sSub>
+                <m:e>
+                  <m:r>
+                    <m:t>K</m:t>
+                  </m:r>
+                </m:e>
+                <m:sub>
+                  <m:r>
+                    <m:t>i</m:t>
+                  </m:r>
+                </m:sub>
+              </m:sSub>
+              <m:sSub>
+                <m:e>
+                  <m:r>
+                    <m:t>T</m:t>
+                  </m:r>
+                </m:e>
+                <m:sub>
+                  <m:r>
+                    <m:t>s</m:t>
+                  </m:r>
+                </m:sub>
+              </m:sSub>
+              <m:r>
+                <m:t> </m:t>
+              </m:r>
               <m:r>
                 <m:t>e</m:t>
               </m:r>
@@ -1828,19 +1708,154 @@
                 <m:rPr>
                   <m:sty m:val="p"/>
                 </m:rPr>
-                <m:t>−</m:t>
+                <m:t>]</m:t>
+              </m:r>
+            </m:e>
+            <m:e>
+              <m:r>
+                <m:t>&amp;</m:t>
               </m:r>
               <m:r>
-                <m:t>2</m:t>
+                <m:t> </m:t>
               </m:r>
               <m:r>
                 <m:rPr>
                   <m:sty m:val="p"/>
                 </m:rPr>
-                <m:t>]</m:t>
+                <m:t>+</m:t>
               </m:r>
+              <m:f>
+                <m:fPr>
+                  <m:type m:val="bar"/>
+                </m:fPr>
+                <m:num>
+                  <m:sSub>
+                    <m:e>
+                      <m:r>
+                        <m:t>K</m:t>
+                      </m:r>
+                    </m:e>
+                    <m:sub>
+                      <m:r>
+                        <m:t>d</m:t>
+                      </m:r>
+                    </m:sub>
+                  </m:sSub>
+                </m:num>
+                <m:den>
+                  <m:sSub>
+                    <m:e>
+                      <m:r>
+                        <m:t>T</m:t>
+                      </m:r>
+                    </m:e>
+                    <m:sub>
+                      <m:r>
+                        <m:t>s</m:t>
+                      </m:r>
+                    </m:sub>
+                  </m:sSub>
+                </m:den>
+              </m:f>
+              <m:d>
+                <m:dPr>
+                  <m:begChr m:val="("/>
+                  <m:sepChr m:val=""/>
+                  <m:endChr m:val=")"/>
+                  <m:grow/>
+                </m:dPr>
+                <m:e>
+                  <m:r>
+                    <m:t>e</m:t>
+                  </m:r>
+                  <m:r>
+                    <m:rPr>
+                      <m:sty m:val="p"/>
+                    </m:rPr>
+                    <m:t>[</m:t>
+                  </m:r>
+                  <m:r>
+                    <m:t>k</m:t>
+                  </m:r>
+                  <m:r>
+                    <m:rPr>
+                      <m:sty m:val="p"/>
+                    </m:rPr>
+                    <m:t>]</m:t>
+                  </m:r>
+                  <m:r>
+                    <m:rPr>
+                      <m:sty m:val="p"/>
+                    </m:rPr>
+                    <m:t>−</m:t>
+                  </m:r>
+                  <m:r>
+                    <m:t>2</m:t>
+                  </m:r>
+                  <m:r>
+                    <m:t>e</m:t>
+                  </m:r>
+                  <m:r>
+                    <m:rPr>
+                      <m:sty m:val="p"/>
+                    </m:rPr>
+                    <m:t>[</m:t>
+                  </m:r>
+                  <m:r>
+                    <m:t>k</m:t>
+                  </m:r>
+                  <m:r>
+                    <m:rPr>
+                      <m:sty m:val="p"/>
+                    </m:rPr>
+                    <m:t>−</m:t>
+                  </m:r>
+                  <m:r>
+                    <m:t>1</m:t>
+                  </m:r>
+                  <m:r>
+                    <m:rPr>
+                      <m:sty m:val="p"/>
+                    </m:rPr>
+                    <m:t>]</m:t>
+                  </m:r>
+                  <m:r>
+                    <m:rPr>
+                      <m:sty m:val="p"/>
+                    </m:rPr>
+                    <m:t>+</m:t>
+                  </m:r>
+                  <m:r>
+                    <m:t>e</m:t>
+                  </m:r>
+                  <m:r>
+                    <m:rPr>
+                      <m:sty m:val="p"/>
+                    </m:rPr>
+                    <m:t>[</m:t>
+                  </m:r>
+                  <m:r>
+                    <m:t>k</m:t>
+                  </m:r>
+                  <m:r>
+                    <m:rPr>
+                      <m:sty m:val="p"/>
+                    </m:rPr>
+                    <m:t>−</m:t>
+                  </m:r>
+                  <m:r>
+                    <m:t>2</m:t>
+                  </m:r>
+                  <m:r>
+                    <m:rPr>
+                      <m:sty m:val="p"/>
+                    </m:rPr>
+                    <m:t>]</m:t>
+                  </m:r>
+                </m:e>
+              </m:d>
             </m:e>
-          </m:d>
+          </m:eqArr>
         </m:oMath>
       </m:oMathPara>
     </w:p>
@@ -3543,7 +3558,7 @@
         <w:pStyle w:val="BodyText"/>
       </w:pPr>
       <w:r>
-        <w:t xml:space="preserve">Metrics: 2\% settling time, overshoot, steady-state error, peak-to-peak ripple (limit cycle), IAE, ITAE, and DCM-cycle count. For disturbance runs all metrics are evaluated on the post-step 60 ms window and ripple on its final 50\%. The worst configuration is selected objectively after the sweep, as the run with the largest normalized degradation of steady-state error, IAE, and limit cycle relative to the ideal digital controller. No configuration is pre-declared worst.</w:t>
+        <w:t xml:space="preserve">Metrics: 2% settling time, overshoot, steady-state error, peak-to-peak ripple (limit cycle), IAE, ITAE, and DCM-cycle count. For disturbance runs all metrics are evaluated on the post-step 60 ms window and ripple on its final 50%. The worst configuration is selected objectively after the sweep, as the run with the largest normalized degradation of steady-state error, IAE, and limit cycle relative to the ideal digital controller. No configuration is pre-declared worst.</w:t>
       </w:r>
     </w:p>
     <w:bookmarkEnd w:id="20"/>
@@ -3581,7 +3596,7 @@
         </w:r>
       </w:hyperlink>
       <w:r>
-        <w:t xml:space="preserve">): the 16-bit/one-cycle system settles 36\% slower (2.66 vs 1.96 ms) and shows a 12.76 mV steady-state offset and 39.6 mV limit cycle against the continuous 0.44 mV / 26.7 mV. The 12.8 mV floor is the quantization-limited operating point for these gains; every further result is expressed relative to it.</w:t>
+        <w:t xml:space="preserve">): the 16-bit/one-cycle system settles 36% slower (2.66 vs 1.96 ms) and shows a 12.76 mV steady-state offset and 39.6 mV limit cycle against the continuous 0.44 mV / 26.7 mV. The 12.8 mV floor is the quantization-limited operating point for these gains; every further result is expressed relative to it.</w:t>
       </w:r>
     </w:p>
     <w:tbl>
@@ -4289,7 +4304,7 @@
         <w:t xml:space="preserve"> </w:t>
       </w:r>
       <w:r>
-        <w:t xml:space="preserve">is exactly representable, the 8-bit and 6-bit ADCs lock onto the exact code and reduce the measured steady-state error to 0.44 mV while masking a worse transient (overshoot rises from 0.06\% at 12-bit to 0.85\% at 6-bit; settling from 2.70 to 3.49 ms). This is a half-scale coincidence, not an ADC benefit.</w:t>
+        <w:t xml:space="preserve">is exactly representable, the 8-bit and 6-bit ADCs lock onto the exact code and reduce the measured steady-state error to 0.44 mV while masking a worse transient (overshoot rises from 0.06% at 12-bit to 0.85% at 6-bit; settling from 2.70 to 3.49 ms). This is a half-scale coincidence, not an ADC benefit.</w:t>
       </w:r>
     </w:p>
     <w:bookmarkStart w:id="29" w:name="fig:adc"/>
@@ -6422,7 +6437,7 @@
         <w:pStyle w:val="ImageCaption"/>
       </w:pPr>
       <w:r>
-        <w:t xml:space="preserve">Disturbance response: 2\%-settling trajectories for input step</w:t>
+        <w:t xml:space="preserve">Disturbance response: 2%-settling trajectories for input step</w:t>
       </w:r>
       <w:r>
         <w:t xml:space="preserve"> </w:t>
@@ -7325,7 +7340,7 @@
         </m:r>
       </m:oMath>
       <w:r>
-        <w:t xml:space="preserve">s, so the controller occupies at most 10.4\% (float) or 1.3\% (int32) of the loop budget. The LEDC PWM write costs</w:t>
+        <w:t xml:space="preserve">s, so the controller occupies at most 10.4% (float) or 1.3% (int32) of the loop budget. The LEDC PWM write costs</w:t>
       </w:r>
       <w:r>
         <w:t xml:space="preserve"> </w:t>
@@ -8810,7 +8825,7 @@
         </m:r>
       </m:oMath>
       <w:r>
-        <w:t xml:space="preserve"> V at 2.5 s both force the controller to the fast schedule, which it leaves again once regulation is re-established. Over the 6 s run the controller spends 3.8\% of the time fast, 87.2\% slow, and 9.0\% dithering, giving an update reduction ratio</w:t>
+        <w:t xml:space="preserve"> V at 2.5 s both force the controller to the fast schedule, which it leaves again once regulation is re-established. Over the 6 s run the controller spends 3.8% of the time fast, 87.2% slow, and 9.0% dithering, giving an update reduction ratio</w:t>
       </w:r>
       <w:r>
         <w:t xml:space="preserve"> </w:t>
@@ -8907,7 +8922,7 @@
         </m:r>
       </m:oMath>
       <w:r>
-        <w:t xml:space="preserve">40 mV band as the fixed-rate loop. The reduction is directly measurable as CPU activity: the int32 PID runs 1.3\% of the loop budget at fast rate and proportionally less in slow mode. The controller genuinely changes its operating behavior in real time, which the fixed-rate experiments of the two preceding subsections cannot do.</w:t>
+        <w:t xml:space="preserve">40 mV band as the fixed-rate loop. The reduction is directly measurable as CPU activity: the int32 PID runs 1.3% of the loop budget at fast rate and proportionally less in slow mode. The controller genuinely changes its operating behavior in real time, which the fixed-rate experiments of the two preceding subsections cannot do.</w:t>
       </w:r>
     </w:p>
     <w:bookmarkStart w:id="69" w:name="fig:adaptive"/>
@@ -9028,7 +9043,7 @@
         </m:r>
       </m:oMath>
       <w:r>
-        <w:t xml:space="preserve">s acquisition time forces every achievable schedule into the sampling regime the simulation deems unstable for a 100 kHz converter, and the acquisition noise floor swamps the quantization effects the simulation predicts. The compute is almost free (1.3\% CPU); the cost of digital control lives in acquisition and update, not arithmetic. That asymmetry is why the quantization-aware adaptive controller is not an enhancement but a necessity: by spending sampling effort only when the error or the activity indicator demands it, it recovers regulation quality at 16\% of the update frequency, and its measured latency, occupancy, and update-reduction figures are the quantities an otherwise purely simulative study could only assume. The negative results are as informative as the positive ones: the hardware cannot reach the 3.5-4</w:t>
+        <w:t xml:space="preserve">s acquisition time forces every achievable schedule into the sampling regime the simulation deems unstable for a 100 kHz converter, and the acquisition noise floor swamps the quantization effects the simulation predicts. The compute is almost free (1.3% CPU); the cost of digital control lives in acquisition and update, not arithmetic. That asymmetry is why the quantization-aware adaptive controller is not an enhancement but a necessity: by spending sampling effort only when the error or the activity indicator demands it, it recovers regulation quality at 16% of the update frequency, and its measured latency, occupancy, and update-reduction figures are the quantities an otherwise purely simulative study could only assume. The negative results are as informative as the positive ones: the hardware cannot reach the 3.5-4</w:t>
       </w:r>
       <m:oMath>
         <m:r>
@@ -9109,11 +9124,11 @@
         </m:r>
       </m:oMath>
       <w:r>
-        <w:t xml:space="preserve">s control-loop latency dominated by ADC acquisition, 1.3\% CPU utilization, and an acquisition noise floor that masks the quantization effects the simulation predicts. Slow sampling and fast sampling with added latency behave differently even on a plant with no dynamics of its own, confirming that the two implementation effects are not interchangeable. A lightweight quantization-aware adaptive PID switches between achievable schedules using a measured error/activity indicator with hysteresis, holds steady-state error below 40 mV, and cuts controller-update frequency by 84\%. The contributions are the integration, characterization, and experimental resource-aware validation of these effects on one platform, rather than any single technique in isolation. The on-chip ADC’s acquisition time is the binding constraint of this platform; future work with a faster external ADC or a real power stage would place the controller inside the simulated critical region and test directly whether the adaptive framework remains necessary at higher rates.</w:t>
+        <w:t xml:space="preserve">s control-loop latency dominated by ADC acquisition, 1.3% CPU utilization, and an acquisition noise floor that masks the quantization effects the simulation predicts. Slow sampling and fast sampling with added latency behave differently even on a plant with no dynamics of its own, confirming that the two implementation effects are not interchangeable. A lightweight quantization-aware adaptive PID switches between achievable schedules using a measured error/activity indicator with hysteresis, holds steady-state error below 40 mV, and cuts controller-update frequency by 84%. The contributions are the integration, characterization, and experimental resource-aware validation of these effects on one platform, rather than any single technique in isolation. The on-chip ADC’s acquisition time is the binding constraint of this platform; future work with a faster external ADC or a real power stage would place the controller inside the simulated critical region and test directly whether the adaptive framework remains necessary at higher rates.</w:t>
       </w:r>
     </w:p>
     <w:bookmarkEnd w:id="73"/>
-    <w:bookmarkStart w:id="116" w:name="acknowledgment"/>
+    <w:bookmarkStart w:id="74" w:name="acknowledgment"/>
     <w:p>
       <w:pPr>
         <w:pStyle w:val="Heading1"/>
@@ -9130,8 +9145,26 @@
         <w:t xml:space="preserve">The authors thank Leading University, Sylhet for support and guidance; no external funding was received.</w:t>
       </w:r>
     </w:p>
-    <w:bookmarkStart w:id="115" w:name="refs"/>
-    <w:bookmarkStart w:id="74" w:name="ref-ahmad2010"/>
+    <w:bookmarkEnd w:id="74"/>
+    <w:bookmarkStart w:id="117" w:name="X071796dd6bc546c91e96cca1cf5ff96599de61f"/>
+    <w:p>
+      <w:pPr>
+        <w:pStyle w:val="Heading1"/>
+      </w:pPr>
+      <w:r>
+        <w:t xml:space="preserve">Declaration of Generative AI and AI-Assisted Technologies in the Writing Process</w:t>
+      </w:r>
+    </w:p>
+    <w:p>
+      <w:pPr>
+        <w:pStyle w:val="FirstParagraph"/>
+      </w:pPr>
+      <w:r>
+        <w:t xml:space="preserve">During the preparation of this work the authors used conversational AI assistants to assist with language editing of the manuscript and with developing, debugging, and reviewing the simulation and firmware code. After using these tools, the authors reviewed and verified all analytical results, simulations, and measurements as needed and take full responsibility for the content of the publication.</w:t>
+      </w:r>
+    </w:p>
+    <w:bookmarkStart w:id="116" w:name="refs"/>
+    <w:bookmarkStart w:id="75" w:name="ref-ahmad2010"/>
     <w:p>
       <w:pPr>
         <w:pStyle w:val="Bibliography"/>
@@ -9159,8 +9192,8 @@
         <w:t xml:space="preserve">, 202–3.</w:t>
       </w:r>
     </w:p>
-    <w:bookmarkEnd w:id="74"/>
-    <w:bookmarkStart w:id="75" w:name="ref-alobaidi2025"/>
+    <w:bookmarkEnd w:id="75"/>
+    <w:bookmarkStart w:id="76" w:name="ref-alobaidi2025"/>
     <w:p>
       <w:pPr>
         <w:pStyle w:val="Bibliography"/>
@@ -9209,8 +9242,8 @@
         <w:t xml:space="preserve">3: 65–75.</w:t>
       </w:r>
     </w:p>
-    <w:bookmarkEnd w:id="75"/>
-    <w:bookmarkStart w:id="76" w:name="ref-bibian2002"/>
+    <w:bookmarkEnd w:id="76"/>
+    <w:bookmarkStart w:id="77" w:name="ref-bibian2002"/>
     <w:p>
       <w:pPr>
         <w:pStyle w:val="Bibliography"/>
@@ -9253,8 +9286,8 @@
         <w:t xml:space="preserve">17 (3): 420–27.</w:t>
       </w:r>
     </w:p>
-    <w:bookmarkEnd w:id="76"/>
-    <w:bookmarkStart w:id="77" w:name="ref-chakraborty2006"/>
+    <w:bookmarkEnd w:id="77"/>
+    <w:bookmarkStart w:id="78" w:name="ref-chakraborty2006"/>
     <w:p>
       <w:pPr>
         <w:pStyle w:val="Bibliography"/>
@@ -9282,8 +9315,8 @@
         <w:t xml:space="preserve">, 1–6.</w:t>
       </w:r>
     </w:p>
-    <w:bookmarkEnd w:id="77"/>
-    <w:bookmarkStart w:id="78" w:name="ref-chen2003"/>
+    <w:bookmarkEnd w:id="78"/>
+    <w:bookmarkStart w:id="79" w:name="ref-chen2003"/>
     <w:p>
       <w:pPr>
         <w:pStyle w:val="Bibliography"/>
@@ -9314,8 +9347,8 @@
         <w:t xml:space="preserve">18 (1): 411–19.</w:t>
       </w:r>
     </w:p>
-    <w:bookmarkEnd w:id="78"/>
-    <w:bookmarkStart w:id="79" w:name="ref-chen2012el"/>
+    <w:bookmarkEnd w:id="79"/>
+    <w:bookmarkStart w:id="80" w:name="ref-chen2012el"/>
     <w:p>
       <w:pPr>
         <w:pStyle w:val="Bibliography"/>
@@ -9346,8 +9379,8 @@
         <w:t xml:space="preserve">48 (20): 1303–4.</w:t>
       </w:r>
     </w:p>
-    <w:bookmarkEnd w:id="79"/>
-    <w:bookmarkStart w:id="80" w:name="ref-chen2010c"/>
+    <w:bookmarkEnd w:id="80"/>
+    <w:bookmarkStart w:id="81" w:name="ref-chen2010c"/>
     <w:p>
       <w:pPr>
         <w:pStyle w:val="Bibliography"/>
@@ -9378,8 +9411,8 @@
         <w:t xml:space="preserve">38 (4).</w:t>
       </w:r>
     </w:p>
-    <w:bookmarkEnd w:id="80"/>
-    <w:bookmarkStart w:id="81" w:name="ref-corradini2015"/>
+    <w:bookmarkEnd w:id="81"/>
+    <w:bookmarkStart w:id="82" w:name="ref-corradini2015"/>
     <w:p>
       <w:pPr>
         <w:pStyle w:val="Bibliography"/>
@@ -9401,8 +9434,8 @@
         <w:t xml:space="preserve">. Wiley-IEEE Press.</w:t>
       </w:r>
     </w:p>
-    <w:bookmarkEnd w:id="81"/>
-    <w:bookmarkStart w:id="82" w:name="ref-crovetti2020"/>
+    <w:bookmarkEnd w:id="82"/>
+    <w:bookmarkStart w:id="83" w:name="ref-crovetti2020"/>
     <w:p>
       <w:pPr>
         <w:pStyle w:val="Bibliography"/>
@@ -9433,8 +9466,8 @@
         <w:t xml:space="preserve">35 (10): 11155–66.</w:t>
       </w:r>
     </w:p>
-    <w:bookmarkEnd w:id="82"/>
-    <w:bookmarkStart w:id="83" w:name="ref-dordevic2021"/>
+    <w:bookmarkEnd w:id="83"/>
+    <w:bookmarkStart w:id="84" w:name="ref-dordevic2021"/>
     <w:p>
       <w:pPr>
         <w:pStyle w:val="Bibliography"/>
@@ -9462,8 +9495,8 @@
         <w:t xml:space="preserve">, 1–6.</w:t>
       </w:r>
     </w:p>
-    <w:bookmarkEnd w:id="83"/>
-    <w:bookmarkStart w:id="84" w:name="ref-erickson2001"/>
+    <w:bookmarkEnd w:id="84"/>
+    <w:bookmarkStart w:id="85" w:name="ref-erickson2001"/>
     <w:p>
       <w:pPr>
         <w:pStyle w:val="Bibliography"/>
@@ -9485,8 +9518,8 @@
         <w:t xml:space="preserve">. 2nd ed. Kluwer Academic Publishers.</w:t>
       </w:r>
     </w:p>
-    <w:bookmarkEnd w:id="84"/>
-    <w:bookmarkStart w:id="85" w:name="ref-foong2011"/>
+    <w:bookmarkEnd w:id="85"/>
+    <w:bookmarkStart w:id="86" w:name="ref-foong2011"/>
     <w:p>
       <w:pPr>
         <w:pStyle w:val="Bibliography"/>
@@ -9514,8 +9547,8 @@
         <w:t xml:space="preserve">, 2380–83.</w:t>
       </w:r>
     </w:p>
-    <w:bookmarkEnd w:id="85"/>
-    <w:bookmarkStart w:id="86" w:name="ref-gong2010"/>
+    <w:bookmarkEnd w:id="86"/>
+    <w:bookmarkStart w:id="87" w:name="ref-gong2010"/>
     <w:p>
       <w:pPr>
         <w:pStyle w:val="Bibliography"/>
@@ -9543,8 +9576,8 @@
         <w:t xml:space="preserve">, 182–85.</w:t>
       </w:r>
     </w:p>
-    <w:bookmarkEnd w:id="86"/>
-    <w:bookmarkStart w:id="87" w:name="ref-gonzalez2020"/>
+    <w:bookmarkEnd w:id="87"/>
+    <w:bookmarkStart w:id="88" w:name="ref-gonzalez2020"/>
     <w:p>
       <w:pPr>
         <w:pStyle w:val="Bibliography"/>
@@ -9587,8 +9620,8 @@
         <w:t xml:space="preserve">10 (20): 7179.</w:t>
       </w:r>
     </w:p>
-    <w:bookmarkEnd w:id="87"/>
-    <w:bookmarkStart w:id="88" w:name="ref-he2007"/>
+    <w:bookmarkEnd w:id="88"/>
+    <w:bookmarkStart w:id="89" w:name="ref-he2007"/>
     <w:p>
       <w:pPr>
         <w:pStyle w:val="Bibliography"/>
@@ -9616,8 +9649,8 @@
         <w:t xml:space="preserve">, 1269–73.</w:t>
       </w:r>
     </w:p>
-    <w:bookmarkEnd w:id="88"/>
-    <w:bookmarkStart w:id="89" w:name="ref-heemels2012"/>
+    <w:bookmarkEnd w:id="89"/>
+    <w:bookmarkStart w:id="90" w:name="ref-heemels2012"/>
     <w:p>
       <w:pPr>
         <w:pStyle w:val="Bibliography"/>
@@ -9645,8 +9678,8 @@
         <w:t xml:space="preserve">, 3270–85.</w:t>
       </w:r>
     </w:p>
-    <w:bookmarkEnd w:id="89"/>
-    <w:bookmarkStart w:id="90" w:name="ref-hu2008"/>
+    <w:bookmarkEnd w:id="90"/>
+    <w:bookmarkStart w:id="91" w:name="ref-hu2008"/>
     <w:p>
       <w:pPr>
         <w:pStyle w:val="Bibliography"/>
@@ -9701,8 +9734,8 @@
         <w:t xml:space="preserve">23 (4): 1998–2005.</w:t>
       </w:r>
     </w:p>
-    <w:bookmarkEnd w:id="90"/>
-    <w:bookmarkStart w:id="91" w:name="ref-kim2024"/>
+    <w:bookmarkEnd w:id="91"/>
+    <w:bookmarkStart w:id="92" w:name="ref-kim2024"/>
     <w:p>
       <w:pPr>
         <w:pStyle w:val="Bibliography"/>
@@ -9730,8 +9763,8 @@
         <w:t xml:space="preserve">, 1–2.</w:t>
       </w:r>
     </w:p>
-    <w:bookmarkEnd w:id="91"/>
-    <w:bookmarkStart w:id="92" w:name="ref-liu2009"/>
+    <w:bookmarkEnd w:id="92"/>
+    <w:bookmarkStart w:id="93" w:name="ref-liu2009"/>
     <w:p>
       <w:pPr>
         <w:pStyle w:val="Bibliography"/>
@@ -9774,8 +9807,8 @@
         <w:t xml:space="preserve">24 (11): 2567–77.</w:t>
       </w:r>
     </w:p>
-    <w:bookmarkEnd w:id="92"/>
-    <w:bookmarkStart w:id="93" w:name="ref-lukic2007"/>
+    <w:bookmarkEnd w:id="93"/>
+    <w:bookmarkStart w:id="94" w:name="ref-lukic2007"/>
     <w:p>
       <w:pPr>
         <w:pStyle w:val="Bibliography"/>
@@ -9857,8 +9890,8 @@
         <w:t xml:space="preserve">22 (5): 1693–707.</w:t>
       </w:r>
     </w:p>
-    <w:bookmarkEnd w:id="93"/>
-    <w:bookmarkStart w:id="94" w:name="ref-maksimovic2007"/>
+    <w:bookmarkEnd w:id="94"/>
+    <w:bookmarkStart w:id="95" w:name="ref-maksimovic2007"/>
     <w:p>
       <w:pPr>
         <w:pStyle w:val="Bibliography"/>
@@ -9901,8 +9934,8 @@
         <w:t xml:space="preserve">22 (6): 2552–56.</w:t>
       </w:r>
     </w:p>
-    <w:bookmarkEnd w:id="94"/>
-    <w:bookmarkStart w:id="95" w:name="ref-maksimovic2004"/>
+    <w:bookmarkEnd w:id="95"/>
+    <w:bookmarkStart w:id="96" w:name="ref-maksimovic2004"/>
     <w:p>
       <w:pPr>
         <w:pStyle w:val="Bibliography"/>
@@ -9930,8 +9963,8 @@
         <w:t xml:space="preserve">, 13–22.</w:t>
       </w:r>
     </w:p>
-    <w:bookmarkEnd w:id="95"/>
-    <w:bookmarkStart w:id="96" w:name="ref-mohan2012"/>
+    <w:bookmarkEnd w:id="96"/>
+    <w:bookmarkStart w:id="97" w:name="ref-mohan2012"/>
     <w:p>
       <w:pPr>
         <w:pStyle w:val="Bibliography"/>
@@ -9959,8 +9992,8 @@
         <w:t xml:space="preserve">, 1–4.</w:t>
       </w:r>
     </w:p>
-    <w:bookmarkEnd w:id="96"/>
-    <w:bookmarkStart w:id="97" w:name="ref-norris2008"/>
+    <w:bookmarkEnd w:id="97"/>
+    <w:bookmarkStart w:id="98" w:name="ref-norris2008"/>
     <w:p>
       <w:pPr>
         <w:pStyle w:val="Bibliography"/>
@@ -10000,8 +10033,8 @@
         <w:t xml:space="preserve">, 127–33.</w:t>
       </w:r>
     </w:p>
-    <w:bookmarkEnd w:id="97"/>
-    <w:bookmarkStart w:id="98" w:name="ref-patella2003"/>
+    <w:bookmarkEnd w:id="98"/>
+    <w:bookmarkStart w:id="99" w:name="ref-patella2003"/>
     <w:p>
       <w:pPr>
         <w:pStyle w:val="Bibliography"/>
@@ -10068,8 +10101,8 @@
         <w:t xml:space="preserve">18 (1): 438–46.</w:t>
       </w:r>
     </w:p>
-    <w:bookmarkEnd w:id="98"/>
-    <w:bookmarkStart w:id="99" w:name="ref-peng2007"/>
+    <w:bookmarkEnd w:id="99"/>
+    <w:bookmarkStart w:id="100" w:name="ref-peng2007"/>
     <w:p>
       <w:pPr>
         <w:pStyle w:val="Bibliography"/>
@@ -10112,8 +10145,8 @@
         <w:t xml:space="preserve">22 (1): 208–15.</w:t>
       </w:r>
     </w:p>
-    <w:bookmarkEnd w:id="99"/>
-    <w:bookmarkStart w:id="101" w:name="ref-peterchev2003"/>
+    <w:bookmarkEnd w:id="100"/>
+    <w:bookmarkStart w:id="102" w:name="ref-peterchev2003"/>
     <w:p>
       <w:pPr>
         <w:pStyle w:val="Bibliography"/>
@@ -10158,7 +10191,7 @@
       <w:r>
         <w:t xml:space="preserve"> </w:t>
       </w:r>
-      <w:hyperlink r:id="rId100">
+      <w:hyperlink r:id="rId101">
         <w:r>
           <w:rPr>
             <w:rStyle w:val="Hyperlink"/>
@@ -10170,8 +10203,8 @@
         <w:t xml:space="preserve">.</w:t>
       </w:r>
     </w:p>
-    <w:bookmarkEnd w:id="101"/>
-    <w:bookmarkStart w:id="102" w:name="ref-saysanasongkham2013"/>
+    <w:bookmarkEnd w:id="102"/>
+    <w:bookmarkStart w:id="103" w:name="ref-saysanasongkham2013"/>
     <w:p>
       <w:pPr>
         <w:pStyle w:val="Bibliography"/>
@@ -10199,8 +10232,8 @@
         <w:t xml:space="preserve">, 716–21.</w:t>
       </w:r>
     </w:p>
-    <w:bookmarkEnd w:id="102"/>
-    <w:bookmarkStart w:id="103" w:name="ref-suhitha2024"/>
+    <w:bookmarkEnd w:id="103"/>
+    <w:bookmarkStart w:id="104" w:name="ref-suhitha2024"/>
     <w:p>
       <w:pPr>
         <w:pStyle w:val="Bibliography"/>
@@ -10228,8 +10261,8 @@
         <w:t xml:space="preserve">, 1–6.</w:t>
       </w:r>
     </w:p>
-    <w:bookmarkEnd w:id="103"/>
-    <w:bookmarkStart w:id="104" w:name="ref-sun2010"/>
+    <w:bookmarkEnd w:id="104"/>
+    <w:bookmarkStart w:id="105" w:name="ref-sun2010"/>
     <w:p>
       <w:pPr>
         <w:pStyle w:val="Bibliography"/>
@@ -10257,8 +10290,8 @@
         <w:t xml:space="preserve">, 154–57.</w:t>
       </w:r>
     </w:p>
-    <w:bookmarkEnd w:id="104"/>
-    <w:bookmarkStart w:id="105" w:name="ref-syed2004"/>
+    <w:bookmarkEnd w:id="105"/>
+    <w:bookmarkStart w:id="106" w:name="ref-syed2004"/>
     <w:p>
       <w:pPr>
         <w:pStyle w:val="Bibliography"/>
@@ -10286,8 +10319,8 @@
         <w:t xml:space="preserve">, 4689–95.</w:t>
       </w:r>
     </w:p>
-    <w:bookmarkEnd w:id="105"/>
-    <w:bookmarkStart w:id="106" w:name="ref-vijayalakshmi2014"/>
+    <w:bookmarkEnd w:id="106"/>
+    <w:bookmarkStart w:id="107" w:name="ref-vijayalakshmi2014"/>
     <w:p>
       <w:pPr>
         <w:pStyle w:val="Bibliography"/>
@@ -10318,8 +10351,8 @@
         <w:t xml:space="preserve">9 (5): 1551–61.</w:t>
       </w:r>
     </w:p>
-    <w:bookmarkEnd w:id="106"/>
-    <w:bookmarkStart w:id="107" w:name="ref-vinodhini2014"/>
+    <w:bookmarkEnd w:id="107"/>
+    <w:bookmarkStart w:id="108" w:name="ref-vinodhini2014"/>
     <w:p>
       <w:pPr>
         <w:pStyle w:val="Bibliography"/>
@@ -10347,8 +10380,8 @@
         <w:t xml:space="preserve">, 213–17.</w:t>
       </w:r>
     </w:p>
-    <w:bookmarkEnd w:id="107"/>
-    <w:bookmarkStart w:id="108" w:name="ref-viswanatha2020"/>
+    <w:bookmarkEnd w:id="108"/>
+    <w:bookmarkStart w:id="109" w:name="ref-viswanatha2020"/>
     <w:p>
       <w:pPr>
         <w:pStyle w:val="Bibliography"/>
@@ -10391,8 +10424,8 @@
         <w:t xml:space="preserve">7 (1).</w:t>
       </w:r>
     </w:p>
-    <w:bookmarkEnd w:id="108"/>
-    <w:bookmarkStart w:id="109" w:name="ref-white1969"/>
+    <w:bookmarkEnd w:id="109"/>
+    <w:bookmarkStart w:id="110" w:name="ref-white1969"/>
     <w:p>
       <w:pPr>
         <w:pStyle w:val="Bibliography"/>
@@ -10423,8 +10456,8 @@
         <w:t xml:space="preserve">14 (4): 430–32.</w:t>
       </w:r>
     </w:p>
-    <w:bookmarkEnd w:id="109"/>
-    <w:bookmarkStart w:id="110" w:name="ref-yao2018"/>
+    <w:bookmarkEnd w:id="110"/>
+    <w:bookmarkStart w:id="111" w:name="ref-yao2018"/>
     <w:p>
       <w:pPr>
         <w:pStyle w:val="Bibliography"/>
@@ -10452,8 +10485,8 @@
         <w:t xml:space="preserve">, 1–5.</w:t>
       </w:r>
     </w:p>
-    <w:bookmarkEnd w:id="110"/>
-    <w:bookmarkStart w:id="111" w:name="ref-yousefzadeh2007"/>
+    <w:bookmarkEnd w:id="111"/>
+    <w:bookmarkStart w:id="112" w:name="ref-yousefzadeh2007"/>
     <w:p>
       <w:pPr>
         <w:pStyle w:val="Bibliography"/>
@@ -10481,8 +10514,8 @@
         <w:t xml:space="preserve">, 865–70.</w:t>
       </w:r>
     </w:p>
-    <w:bookmarkEnd w:id="111"/>
-    <w:bookmarkStart w:id="112" w:name="ref-yu2023"/>
+    <w:bookmarkEnd w:id="112"/>
+    <w:bookmarkStart w:id="113" w:name="ref-yu2023"/>
     <w:p>
       <w:pPr>
         <w:pStyle w:val="Bibliography"/>
@@ -10513,8 +10546,8 @@
         <w:t xml:space="preserve">13 (1): 121.</w:t>
       </w:r>
     </w:p>
-    <w:bookmarkEnd w:id="112"/>
-    <w:bookmarkStart w:id="113" w:name="ref-zhao2007"/>
+    <w:bookmarkEnd w:id="113"/>
+    <w:bookmarkStart w:id="114" w:name="ref-zhao2007"/>
     <w:p>
       <w:pPr>
         <w:pStyle w:val="Bibliography"/>
@@ -10557,8 +10590,8 @@
         <w:t xml:space="preserve">22 (6): 2211–22.</w:t>
       </w:r>
     </w:p>
-    <w:bookmarkEnd w:id="113"/>
-    <w:bookmarkStart w:id="114" w:name="ref-zhou2019"/>
+    <w:bookmarkEnd w:id="114"/>
+    <w:bookmarkStart w:id="115" w:name="ref-zhou2019"/>
     <w:p>
       <w:pPr>
         <w:pStyle w:val="Bibliography"/>
@@ -10586,9 +10619,9 @@
         <w:t xml:space="preserve">, 2995–99.</w:t>
       </w:r>
     </w:p>
-    <w:bookmarkEnd w:id="114"/>
     <w:bookmarkEnd w:id="115"/>
     <w:bookmarkEnd w:id="116"/>
+    <w:bookmarkEnd w:id="117"/>
     <w:sectPr>
       <w:footnotePr>
         <w:numRestart w:val="eachSect"/>

</xml_diff>